<commit_message>
fix(docx) Handle inline formulas in list items
Fixes issue where inline formulas in list items were ignored during conversion.
Added helper methods to eliminate code duplication.
Updated test data with list items containing inline equations.

Signed-off-by: Cesar Berrospi Ramis <ceb@zurich.ibm.com>
</commit_message>
<xml_diff>
--- a/tests/data/docx/equations.docx
+++ b/tests/data/docx/equations.docx
@@ -6,34 +6,23 @@
       <w:pPr>
         <w:rPr>
           <w:rFonts w:eastAsiaTheme="minorEastAsia"/>
-          <w:lang w:val="en-US"/>
         </w:rPr>
       </w:pPr>
       <w:r>
-        <w:rPr>
-          <w:lang w:val="en-US"/>
-        </w:rPr>
         <w:t xml:space="preserve">This is a word </w:t>
       </w:r>
       <w:proofErr w:type="gramStart"/>
       <w:r>
-        <w:rPr>
-          <w:lang w:val="en-US"/>
-        </w:rPr>
         <w:t>document</w:t>
       </w:r>
       <w:proofErr w:type="gramEnd"/>
       <w:r>
-        <w:rPr>
-          <w:lang w:val="en-US"/>
-        </w:rPr>
         <w:t xml:space="preserve"> and this is an inline equation: </w:t>
       </w:r>
       <m:oMath>
         <m:r>
           <w:rPr>
             <w:rFonts w:ascii="Cambria Math" w:hAnsi="Cambria Math"/>
-            <w:lang w:val="en-US"/>
           </w:rPr>
           <m:t>A=π</m:t>
         </m:r>
@@ -42,7 +31,6 @@
             <m:ctrlPr>
               <w:rPr>
                 <w:rFonts w:ascii="Cambria Math" w:hAnsi="Cambria Math"/>
-                <w:lang w:val="en-US"/>
               </w:rPr>
             </m:ctrlPr>
           </m:sSupPr>
@@ -50,7 +38,6 @@
             <m:r>
               <w:rPr>
                 <w:rFonts w:ascii="Cambria Math" w:hAnsi="Cambria Math"/>
-                <w:lang w:val="en-US"/>
               </w:rPr>
               <m:t>r</m:t>
             </m:r>
@@ -59,7 +46,6 @@
             <m:r>
               <w:rPr>
                 <w:rFonts w:ascii="Cambria Math" w:hAnsi="Cambria Math"/>
-                <w:lang w:val="en-US"/>
               </w:rPr>
               <m:t>2</m:t>
             </m:r>
@@ -68,7 +54,6 @@
         <m:r>
           <w:rPr>
             <w:rFonts w:ascii="Cambria Math" w:hAnsi="Cambria Math"/>
-            <w:lang w:val="en-US"/>
           </w:rPr>
           <m:t xml:space="preserve"> </m:t>
         </m:r>
@@ -76,24 +61,287 @@
       <w:r>
         <w:rPr>
           <w:rFonts w:eastAsiaTheme="minorEastAsia"/>
-          <w:lang w:val="en-US"/>
-        </w:rPr>
-        <w:t>. If instead, I want an equation by line, I can do this:</w:t>
+        </w:rPr>
+        <w:t>.</w:t>
       </w:r>
     </w:p>
     <w:p>
       <w:pPr>
-        <w:rPr>
-          <w:rFonts w:eastAsiaTheme="minorEastAsia"/>
-          <w:lang w:val="en-US"/>
-        </w:rPr>
-      </w:pPr>
-    </w:p>
-    <w:p>
-      <w:pPr>
-        <w:rPr>
-          <w:rFonts w:eastAsiaTheme="minorEastAsia"/>
-          <w:lang w:val="en-US"/>
+        <w:pStyle w:val="ListParagraph"/>
+        <w:numPr>
+          <w:ilvl w:val="0"/>
+          <w:numId w:val="1"/>
+        </w:numPr>
+        <w:rPr>
+          <w:rFonts w:eastAsiaTheme="minorEastAsia"/>
+        </w:rPr>
+      </w:pPr>
+      <w:r>
+        <w:rPr>
+          <w:rFonts w:eastAsiaTheme="minorEastAsia"/>
+        </w:rPr>
+        <w:t xml:space="preserve">First item with inline equation: </w:t>
+      </w:r>
+      <m:oMath>
+        <m:r>
+          <w:rPr>
+            <w:rFonts w:ascii="Cambria Math" w:hAnsi="Cambria Math"/>
+          </w:rPr>
+          <m:t>A=π</m:t>
+        </m:r>
+        <m:sSup>
+          <m:sSupPr>
+            <m:ctrlPr>
+              <w:rPr>
+                <w:rFonts w:ascii="Cambria Math" w:hAnsi="Cambria Math"/>
+              </w:rPr>
+            </m:ctrlPr>
+          </m:sSupPr>
+          <m:e>
+            <m:r>
+              <w:rPr>
+                <w:rFonts w:ascii="Cambria Math" w:hAnsi="Cambria Math"/>
+              </w:rPr>
+              <m:t>r</m:t>
+            </m:r>
+          </m:e>
+          <m:sup>
+            <m:r>
+              <w:rPr>
+                <w:rFonts w:ascii="Cambria Math" w:hAnsi="Cambria Math"/>
+              </w:rPr>
+              <m:t>2</m:t>
+            </m:r>
+          </m:sup>
+        </m:sSup>
+      </m:oMath>
+      <w:r>
+        <w:rPr>
+          <w:rFonts w:eastAsiaTheme="minorEastAsia"/>
+        </w:rPr>
+        <w:t xml:space="preserve"> is the area formula.</w:t>
+      </w:r>
+    </w:p>
+    <w:p>
+      <w:pPr>
+        <w:pStyle w:val="ListParagraph"/>
+        <w:numPr>
+          <w:ilvl w:val="0"/>
+          <w:numId w:val="1"/>
+        </w:numPr>
+        <w:rPr>
+          <w:rFonts w:eastAsiaTheme="minorEastAsia"/>
+        </w:rPr>
+      </w:pPr>
+      <w:r>
+        <w:rPr>
+          <w:rFonts w:eastAsiaTheme="minorEastAsia"/>
+        </w:rPr>
+        <w:t xml:space="preserve">Second item with equations: </w:t>
+      </w:r>
+      <m:oMath>
+        <m:r>
+          <w:rPr>
+            <w:rFonts w:ascii="Cambria Math" w:eastAsiaTheme="minorEastAsia" w:hAnsi="Cambria Math"/>
+          </w:rPr>
+          <m:t>E</m:t>
+        </m:r>
+        <m:r>
+          <w:rPr>
+            <w:rFonts w:ascii="Cambria Math" w:eastAsiaTheme="minorEastAsia" w:hAnsi="Cambria Math"/>
+          </w:rPr>
+          <m:t>=</m:t>
+        </m:r>
+        <m:r>
+          <w:rPr>
+            <w:rFonts w:ascii="Cambria Math" w:eastAsiaTheme="minorEastAsia" w:hAnsi="Cambria Math"/>
+          </w:rPr>
+          <m:t>m</m:t>
+        </m:r>
+        <m:sSup>
+          <m:sSupPr>
+            <m:ctrlPr>
+              <w:rPr>
+                <w:rFonts w:ascii="Cambria Math" w:eastAsiaTheme="minorEastAsia" w:hAnsi="Cambria Math"/>
+              </w:rPr>
+            </m:ctrlPr>
+          </m:sSupPr>
+          <m:e>
+            <m:r>
+              <w:rPr>
+                <w:rFonts w:ascii="Cambria Math" w:eastAsiaTheme="minorEastAsia" w:hAnsi="Cambria Math"/>
+              </w:rPr>
+              <m:t>c</m:t>
+            </m:r>
+          </m:e>
+          <m:sup>
+            <m:r>
+              <w:rPr>
+                <w:rFonts w:ascii="Cambria Math" w:eastAsiaTheme="minorEastAsia" w:hAnsi="Cambria Math"/>
+              </w:rPr>
+              <m:t>2</m:t>
+            </m:r>
+          </m:sup>
+        </m:sSup>
+      </m:oMath>
+      <w:r>
+        <w:rPr>
+          <w:rFonts w:eastAsiaTheme="minorEastAsia"/>
+        </w:rPr>
+        <w:t xml:space="preserve"> and </w:t>
+      </w:r>
+      <m:oMath>
+        <m:r>
+          <w:rPr>
+            <w:rFonts w:ascii="Cambria Math" w:eastAsiaTheme="minorEastAsia" w:hAnsi="Cambria Math"/>
+          </w:rPr>
+          <m:t>F=ma</m:t>
+        </m:r>
+      </m:oMath>
+      <w:r>
+        <w:rPr>
+          <w:rFonts w:eastAsiaTheme="minorEastAsia"/>
+        </w:rPr>
+        <w:t xml:space="preserve"> are physics formulas.</w:t>
+      </w:r>
+    </w:p>
+    <w:p>
+      <w:pPr>
+        <w:pStyle w:val="ListParagraph"/>
+        <w:numPr>
+          <w:ilvl w:val="0"/>
+          <w:numId w:val="1"/>
+        </w:numPr>
+        <w:rPr>
+          <w:rFonts w:eastAsiaTheme="minorEastAsia"/>
+        </w:rPr>
+      </w:pPr>
+      <w:r>
+        <w:rPr>
+          <w:rFonts w:eastAsiaTheme="minorEastAsia"/>
+        </w:rPr>
+        <w:t xml:space="preserve">The formula </w:t>
+      </w:r>
+      <m:oMath>
+        <m:sSup>
+          <m:sSupPr>
+            <m:ctrlPr>
+              <w:rPr>
+                <w:rFonts w:ascii="Cambria Math" w:eastAsiaTheme="minorEastAsia" w:hAnsi="Cambria Math"/>
+              </w:rPr>
+            </m:ctrlPr>
+          </m:sSupPr>
+          <m:e>
+            <m:r>
+              <w:rPr>
+                <w:rFonts w:ascii="Cambria Math" w:eastAsiaTheme="minorEastAsia" w:hAnsi="Cambria Math"/>
+              </w:rPr>
+              <m:t>a</m:t>
+            </m:r>
+          </m:e>
+          <m:sup>
+            <m:r>
+              <w:rPr>
+                <w:rFonts w:ascii="Cambria Math" w:eastAsiaTheme="minorEastAsia" w:hAnsi="Cambria Math"/>
+              </w:rPr>
+              <m:t>2</m:t>
+            </m:r>
+          </m:sup>
+        </m:sSup>
+        <m:r>
+          <w:rPr>
+            <w:rFonts w:ascii="Cambria Math" w:eastAsiaTheme="minorEastAsia" w:hAnsi="Cambria Math"/>
+          </w:rPr>
+          <m:t>+</m:t>
+        </m:r>
+        <m:sSup>
+          <m:sSupPr>
+            <m:ctrlPr>
+              <w:rPr>
+                <w:rFonts w:ascii="Cambria Math" w:eastAsiaTheme="minorEastAsia" w:hAnsi="Cambria Math"/>
+              </w:rPr>
+            </m:ctrlPr>
+          </m:sSupPr>
+          <m:e>
+            <m:r>
+              <w:rPr>
+                <w:rFonts w:ascii="Cambria Math" w:eastAsiaTheme="minorEastAsia" w:hAnsi="Cambria Math"/>
+              </w:rPr>
+              <m:t>b</m:t>
+            </m:r>
+          </m:e>
+          <m:sup>
+            <m:r>
+              <w:rPr>
+                <w:rFonts w:ascii="Cambria Math" w:eastAsiaTheme="minorEastAsia" w:hAnsi="Cambria Math"/>
+              </w:rPr>
+              <m:t>2</m:t>
+            </m:r>
+          </m:sup>
+        </m:sSup>
+        <m:r>
+          <w:rPr>
+            <w:rFonts w:ascii="Cambria Math" w:eastAsiaTheme="minorEastAsia" w:hAnsi="Cambria Math"/>
+          </w:rPr>
+          <m:t>=</m:t>
+        </m:r>
+        <m:sSup>
+          <m:sSupPr>
+            <m:ctrlPr>
+              <w:rPr>
+                <w:rFonts w:ascii="Cambria Math" w:eastAsiaTheme="minorEastAsia" w:hAnsi="Cambria Math"/>
+              </w:rPr>
+            </m:ctrlPr>
+          </m:sSupPr>
+          <m:e>
+            <m:r>
+              <w:rPr>
+                <w:rFonts w:ascii="Cambria Math" w:eastAsiaTheme="minorEastAsia" w:hAnsi="Cambria Math"/>
+              </w:rPr>
+              <m:t>c</m:t>
+            </m:r>
+          </m:e>
+          <m:sup>
+            <m:r>
+              <w:rPr>
+                <w:rFonts w:ascii="Cambria Math" w:eastAsiaTheme="minorEastAsia" w:hAnsi="Cambria Math"/>
+              </w:rPr>
+              <m:t>2</m:t>
+            </m:r>
+          </m:sup>
+        </m:sSup>
+      </m:oMath>
+      <w:r>
+        <w:rPr>
+          <w:rFonts w:eastAsiaTheme="minorEastAsia"/>
+        </w:rPr>
+        <w:t xml:space="preserve"> is the Pythagorean theorem.</w:t>
+      </w:r>
+    </w:p>
+    <w:p>
+      <w:pPr>
+        <w:rPr>
+          <w:rFonts w:eastAsiaTheme="minorEastAsia"/>
+        </w:rPr>
+      </w:pPr>
+      <w:r>
+        <w:rPr>
+          <w:rFonts w:eastAsiaTheme="minorEastAsia"/>
+        </w:rPr>
+        <w:t>If instead, I want an equation by line, I can do this:</w:t>
+      </w:r>
+    </w:p>
+    <w:p>
+      <w:pPr>
+        <w:rPr>
+          <w:rFonts w:eastAsiaTheme="minorEastAsia"/>
+        </w:rPr>
+      </w:pPr>
+    </w:p>
+    <w:p>
+      <w:pPr>
+        <w:rPr>
+          <w:rFonts w:eastAsiaTheme="minorEastAsia"/>
         </w:rPr>
       </w:pPr>
       <m:oMathPara>
@@ -105,7 +353,6 @@
                 <w:rPr>
                   <w:rFonts w:ascii="Cambria Math" w:eastAsiaTheme="minorEastAsia" w:hAnsi="Cambria Math"/>
                   <w:i/>
-                  <w:lang w:val="en-US"/>
                 </w:rPr>
               </m:ctrlPr>
             </m:eqArrPr>
@@ -115,7 +362,6 @@
                   <m:ctrlPr>
                     <w:rPr>
                       <w:rFonts w:ascii="Cambria Math" w:eastAsiaTheme="minorEastAsia" w:hAnsi="Cambria Math"/>
-                      <w:lang w:val="en-US"/>
                     </w:rPr>
                   </m:ctrlPr>
                 </m:sSupPr>
@@ -123,7 +369,6 @@
                   <m:r>
                     <w:rPr>
                       <w:rFonts w:ascii="Cambria Math" w:eastAsiaTheme="minorEastAsia" w:hAnsi="Cambria Math"/>
-                      <w:lang w:val="en-US"/>
                     </w:rPr>
                     <m:t>a</m:t>
                   </m:r>
@@ -131,7 +376,6 @@
                     <w:rPr>
                       <w:rFonts w:ascii="Cambria Math" w:eastAsiaTheme="minorEastAsia" w:hAnsi="Cambria Math"/>
                       <w:i/>
-                      <w:lang w:val="en-US"/>
                     </w:rPr>
                   </m:ctrlPr>
                 </m:e>
@@ -139,7 +383,6 @@
                   <m:r>
                     <w:rPr>
                       <w:rFonts w:ascii="Cambria Math" w:eastAsiaTheme="minorEastAsia" w:hAnsi="Cambria Math"/>
-                      <w:lang w:val="en-US"/>
                     </w:rPr>
                     <m:t>2</m:t>
                   </m:r>
@@ -148,7 +391,6 @@
               <m:r>
                 <w:rPr>
                   <w:rFonts w:ascii="Cambria Math" w:eastAsiaTheme="minorEastAsia" w:hAnsi="Cambria Math"/>
-                  <w:lang w:val="en-US"/>
                 </w:rPr>
                 <m:t>+</m:t>
               </m:r>
@@ -157,7 +399,6 @@
                   <m:ctrlPr>
                     <w:rPr>
                       <w:rFonts w:ascii="Cambria Math" w:eastAsiaTheme="minorEastAsia" w:hAnsi="Cambria Math"/>
-                      <w:lang w:val="en-US"/>
                     </w:rPr>
                   </m:ctrlPr>
                 </m:sSupPr>
@@ -165,7 +406,6 @@
                   <m:r>
                     <w:rPr>
                       <w:rFonts w:ascii="Cambria Math" w:eastAsiaTheme="minorEastAsia" w:hAnsi="Cambria Math"/>
-                      <w:lang w:val="en-US"/>
                     </w:rPr>
                     <m:t>b</m:t>
                   </m:r>
@@ -173,7 +413,6 @@
                     <w:rPr>
                       <w:rFonts w:ascii="Cambria Math" w:eastAsiaTheme="minorEastAsia" w:hAnsi="Cambria Math"/>
                       <w:i/>
-                      <w:lang w:val="en-US"/>
                     </w:rPr>
                   </m:ctrlPr>
                 </m:e>
@@ -181,7 +420,6 @@
                   <m:r>
                     <w:rPr>
                       <w:rFonts w:ascii="Cambria Math" w:eastAsiaTheme="minorEastAsia" w:hAnsi="Cambria Math"/>
-                      <w:lang w:val="en-US"/>
                     </w:rPr>
                     <m:t>2</m:t>
                   </m:r>
@@ -190,7 +428,6 @@
               <m:r>
                 <w:rPr>
                   <w:rFonts w:ascii="Cambria Math" w:eastAsiaTheme="minorEastAsia" w:hAnsi="Cambria Math"/>
-                  <w:lang w:val="en-US"/>
                 </w:rPr>
                 <m:t>=</m:t>
               </m:r>
@@ -199,7 +436,6 @@
                   <m:ctrlPr>
                     <w:rPr>
                       <w:rFonts w:ascii="Cambria Math" w:eastAsiaTheme="minorEastAsia" w:hAnsi="Cambria Math"/>
-                      <w:lang w:val="en-US"/>
                     </w:rPr>
                   </m:ctrlPr>
                 </m:sSupPr>
@@ -207,7 +443,6 @@
                   <m:r>
                     <w:rPr>
                       <w:rFonts w:ascii="Cambria Math" w:eastAsiaTheme="minorEastAsia" w:hAnsi="Cambria Math"/>
-                      <w:lang w:val="en-US"/>
                     </w:rPr>
                     <m:t>c</m:t>
                   </m:r>
@@ -215,7 +450,6 @@
                     <w:rPr>
                       <w:rFonts w:ascii="Cambria Math" w:eastAsiaTheme="minorEastAsia" w:hAnsi="Cambria Math"/>
                       <w:i/>
-                      <w:lang w:val="en-US"/>
                     </w:rPr>
                   </m:ctrlPr>
                 </m:e>
@@ -223,7 +457,6 @@
                   <m:r>
                     <w:rPr>
                       <w:rFonts w:ascii="Cambria Math" w:eastAsiaTheme="minorEastAsia" w:hAnsi="Cambria Math"/>
-                      <w:lang w:val="en-US"/>
                     </w:rPr>
                     <m:t>2</m:t>
                   </m:r>
@@ -232,7 +465,6 @@
               <m:r>
                 <w:rPr>
                   <w:rFonts w:ascii="Cambria Math" w:eastAsiaTheme="minorEastAsia" w:hAnsi="Cambria Math"/>
-                  <w:lang w:val="en-US"/>
                 </w:rPr>
                 <m:t xml:space="preserve"> × 23</m:t>
               </m:r>
@@ -245,13 +477,11 @@
       <w:pPr>
         <w:rPr>
           <w:rFonts w:eastAsiaTheme="minorEastAsia"/>
-          <w:lang w:val="en-US"/>
         </w:rPr>
       </w:pPr>
       <w:r>
         <w:rPr>
           <w:rFonts w:eastAsiaTheme="minorEastAsia"/>
-          <w:lang w:val="en-US"/>
         </w:rPr>
         <w:t>And that is an equation by itself. Cheers!</w:t>
       </w:r>
@@ -260,21 +490,18 @@
       <w:pPr>
         <w:rPr>
           <w:rFonts w:eastAsiaTheme="minorEastAsia"/>
-          <w:lang w:val="en-US"/>
-        </w:rPr>
-      </w:pPr>
-    </w:p>
-    <w:p>
-      <w:pPr>
-        <w:rPr>
-          <w:rFonts w:eastAsiaTheme="minorEastAsia"/>
-          <w:lang w:val="en-US"/>
+        </w:rPr>
+      </w:pPr>
+    </w:p>
+    <w:p>
+      <w:pPr>
+        <w:rPr>
+          <w:rFonts w:eastAsiaTheme="minorEastAsia"/>
         </w:rPr>
       </w:pPr>
       <w:r>
         <w:rPr>
           <w:rFonts w:eastAsiaTheme="minorEastAsia"/>
-          <w:lang w:val="en-US"/>
         </w:rPr>
         <w:t>This is another equation:</w:t>
       </w:r>
@@ -283,7 +510,6 @@
       <w:pPr>
         <w:rPr>
           <w:rFonts w:eastAsiaTheme="minorEastAsia"/>
-          <w:lang w:val="en-US"/>
         </w:rPr>
       </w:pPr>
       <m:oMathPara>
@@ -295,7 +521,6 @@
                 <w:rPr>
                   <w:rFonts w:ascii="Cambria Math" w:eastAsiaTheme="minorEastAsia" w:hAnsi="Cambria Math"/>
                   <w:i/>
-                  <w:lang w:val="en-US"/>
                 </w:rPr>
               </m:ctrlPr>
             </m:eqArrPr>
@@ -303,7 +528,6 @@
               <m:r>
                 <w:rPr>
                   <w:rFonts w:ascii="Cambria Math" w:eastAsiaTheme="minorEastAsia" w:hAnsi="Cambria Math"/>
-                  <w:lang w:val="en-US"/>
                 </w:rPr>
                 <m:t>f</m:t>
               </m:r>
@@ -312,7 +536,6 @@
                   <m:ctrlPr>
                     <w:rPr>
                       <w:rFonts w:ascii="Cambria Math" w:eastAsiaTheme="minorEastAsia" w:hAnsi="Cambria Math"/>
-                      <w:lang w:val="en-US"/>
                     </w:rPr>
                   </m:ctrlPr>
                 </m:dPr>
@@ -320,7 +543,6 @@
                   <m:r>
                     <w:rPr>
                       <w:rFonts w:ascii="Cambria Math" w:eastAsiaTheme="minorEastAsia" w:hAnsi="Cambria Math"/>
-                      <w:lang w:val="en-US"/>
                     </w:rPr>
                     <m:t>x</m:t>
                   </m:r>
@@ -329,7 +551,6 @@
               <m:r>
                 <w:rPr>
                   <w:rFonts w:ascii="Cambria Math" w:eastAsiaTheme="minorEastAsia" w:hAnsi="Cambria Math"/>
-                  <w:lang w:val="en-US"/>
                 </w:rPr>
                 <m:t>=</m:t>
               </m:r>
@@ -338,7 +559,6 @@
                   <m:ctrlPr>
                     <w:rPr>
                       <w:rFonts w:ascii="Cambria Math" w:eastAsiaTheme="minorEastAsia" w:hAnsi="Cambria Math"/>
-                      <w:lang w:val="en-US"/>
                     </w:rPr>
                   </m:ctrlPr>
                 </m:sSubPr>
@@ -346,7 +566,6 @@
                   <m:r>
                     <w:rPr>
                       <w:rFonts w:ascii="Cambria Math" w:eastAsiaTheme="minorEastAsia" w:hAnsi="Cambria Math"/>
-                      <w:lang w:val="en-US"/>
                     </w:rPr>
                     <m:t>a</m:t>
                   </m:r>
@@ -355,7 +574,6 @@
                   <m:r>
                     <w:rPr>
                       <w:rFonts w:ascii="Cambria Math" w:eastAsiaTheme="minorEastAsia" w:hAnsi="Cambria Math"/>
-                      <w:lang w:val="en-US"/>
                     </w:rPr>
                     <m:t>0</m:t>
                   </m:r>
@@ -364,7 +582,6 @@
               <m:r>
                 <w:rPr>
                   <w:rFonts w:ascii="Cambria Math" w:eastAsiaTheme="minorEastAsia" w:hAnsi="Cambria Math"/>
-                  <w:lang w:val="en-US"/>
                 </w:rPr>
                 <m:t>+</m:t>
               </m:r>
@@ -375,7 +592,6 @@
                   <m:ctrlPr>
                     <w:rPr>
                       <w:rFonts w:ascii="Cambria Math" w:eastAsiaTheme="minorEastAsia" w:hAnsi="Cambria Math"/>
-                      <w:lang w:val="en-US"/>
                     </w:rPr>
                   </m:ctrlPr>
                 </m:naryPr>
@@ -383,7 +599,6 @@
                   <m:r>
                     <w:rPr>
                       <w:rFonts w:ascii="Cambria Math" w:eastAsiaTheme="minorEastAsia" w:hAnsi="Cambria Math"/>
-                      <w:lang w:val="en-US"/>
                     </w:rPr>
                     <m:t>n=1</m:t>
                   </m:r>
@@ -392,7 +607,6 @@
                   <m:r>
                     <w:rPr>
                       <w:rFonts w:ascii="Cambria Math" w:eastAsiaTheme="minorEastAsia" w:hAnsi="Cambria Math"/>
-                      <w:lang w:val="en-US"/>
                     </w:rPr>
                     <m:t>∞</m:t>
                   </m:r>
@@ -403,7 +617,6 @@
                       <m:ctrlPr>
                         <w:rPr>
                           <w:rFonts w:ascii="Cambria Math" w:eastAsiaTheme="minorEastAsia" w:hAnsi="Cambria Math"/>
-                          <w:lang w:val="en-US"/>
                         </w:rPr>
                       </m:ctrlPr>
                     </m:dPr>
@@ -413,7 +626,6 @@
                           <m:ctrlPr>
                             <w:rPr>
                               <w:rFonts w:ascii="Cambria Math" w:eastAsiaTheme="minorEastAsia" w:hAnsi="Cambria Math"/>
-                              <w:lang w:val="en-US"/>
                             </w:rPr>
                           </m:ctrlPr>
                         </m:sSubPr>
@@ -421,7 +633,6 @@
                           <m:r>
                             <w:rPr>
                               <w:rFonts w:ascii="Cambria Math" w:eastAsia="Cambria Math" w:hAnsi="Cambria Math" w:cs="Cambria Math"/>
-                              <w:lang w:val="en-US"/>
                             </w:rPr>
                             <m:t>a</m:t>
                           </m:r>
@@ -430,7 +641,6 @@
                           <m:r>
                             <w:rPr>
                               <w:rFonts w:ascii="Cambria Math" w:eastAsia="Cambria Math" w:hAnsi="Cambria Math" w:cs="Cambria Math"/>
-                              <w:lang w:val="en-US"/>
                             </w:rPr>
                             <m:t>n</m:t>
                           </m:r>
@@ -441,7 +651,6 @@
                           <m:ctrlPr>
                             <w:rPr>
                               <w:rFonts w:ascii="Cambria Math" w:eastAsiaTheme="minorEastAsia" w:hAnsi="Cambria Math"/>
-                              <w:lang w:val="en-US"/>
                             </w:rPr>
                           </m:ctrlPr>
                         </m:funcPr>
@@ -452,7 +661,6 @@
                             </m:rPr>
                             <w:rPr>
                               <w:rFonts w:ascii="Cambria Math" w:eastAsia="Cambria Math" w:hAnsi="Cambria Math" w:cs="Cambria Math"/>
-                              <w:lang w:val="en-US"/>
                             </w:rPr>
                             <m:t>cos</m:t>
                           </m:r>
@@ -463,7 +671,6 @@
                               <m:ctrlPr>
                                 <w:rPr>
                                   <w:rFonts w:ascii="Cambria Math" w:eastAsiaTheme="minorEastAsia" w:hAnsi="Cambria Math"/>
-                                  <w:lang w:val="en-US"/>
                                 </w:rPr>
                               </m:ctrlPr>
                             </m:fPr>
@@ -471,7 +678,6 @@
                               <m:r>
                                 <w:rPr>
                                   <w:rFonts w:ascii="Cambria Math" w:eastAsia="Cambria Math" w:hAnsi="Cambria Math" w:cs="Cambria Math"/>
-                                  <w:lang w:val="en-US"/>
                                 </w:rPr>
                                 <m:t>nπx</m:t>
                               </m:r>
@@ -480,7 +686,6 @@
                               <m:r>
                                 <w:rPr>
                                   <w:rFonts w:ascii="Cambria Math" w:eastAsia="Cambria Math" w:hAnsi="Cambria Math" w:cs="Cambria Math"/>
-                                  <w:lang w:val="en-US"/>
                                 </w:rPr>
                                 <m:t>L</m:t>
                               </m:r>
@@ -491,7 +696,6 @@
                       <m:r>
                         <w:rPr>
                           <w:rFonts w:ascii="Cambria Math" w:eastAsia="Cambria Math" w:hAnsi="Cambria Math" w:cs="Cambria Math"/>
-                          <w:lang w:val="en-US"/>
                         </w:rPr>
                         <m:t>+</m:t>
                       </m:r>
@@ -500,7 +704,6 @@
                           <m:ctrlPr>
                             <w:rPr>
                               <w:rFonts w:ascii="Cambria Math" w:eastAsiaTheme="minorEastAsia" w:hAnsi="Cambria Math"/>
-                              <w:lang w:val="en-US"/>
                             </w:rPr>
                           </m:ctrlPr>
                         </m:sSubPr>
@@ -508,7 +711,6 @@
                           <m:r>
                             <w:rPr>
                               <w:rFonts w:ascii="Cambria Math" w:eastAsia="Cambria Math" w:hAnsi="Cambria Math" w:cs="Cambria Math"/>
-                              <w:lang w:val="en-US"/>
                             </w:rPr>
                             <m:t>b</m:t>
                           </m:r>
@@ -517,7 +719,6 @@
                           <m:r>
                             <w:rPr>
                               <w:rFonts w:ascii="Cambria Math" w:eastAsia="Cambria Math" w:hAnsi="Cambria Math" w:cs="Cambria Math"/>
-                              <w:lang w:val="en-US"/>
                             </w:rPr>
                             <m:t>n</m:t>
                           </m:r>
@@ -528,7 +729,6 @@
                           <m:ctrlPr>
                             <w:rPr>
                               <w:rFonts w:ascii="Cambria Math" w:eastAsiaTheme="minorEastAsia" w:hAnsi="Cambria Math"/>
-                              <w:lang w:val="en-US"/>
                             </w:rPr>
                           </m:ctrlPr>
                         </m:funcPr>
@@ -539,7 +739,6 @@
                             </m:rPr>
                             <w:rPr>
                               <w:rFonts w:ascii="Cambria Math" w:eastAsia="Cambria Math" w:hAnsi="Cambria Math" w:cs="Cambria Math"/>
-                              <w:lang w:val="en-US"/>
                             </w:rPr>
                             <m:t>sin</m:t>
                           </m:r>
@@ -550,7 +749,6 @@
                               <m:ctrlPr>
                                 <w:rPr>
                                   <w:rFonts w:ascii="Cambria Math" w:eastAsiaTheme="minorEastAsia" w:hAnsi="Cambria Math"/>
-                                  <w:lang w:val="en-US"/>
                                 </w:rPr>
                               </m:ctrlPr>
                             </m:fPr>
@@ -558,7 +756,6 @@
                               <m:r>
                                 <w:rPr>
                                   <w:rFonts w:ascii="Cambria Math" w:eastAsia="Cambria Math" w:hAnsi="Cambria Math" w:cs="Cambria Math"/>
-                                  <w:lang w:val="en-US"/>
                                 </w:rPr>
                                 <m:t>nπx</m:t>
                               </m:r>
@@ -567,7 +764,6 @@
                               <m:r>
                                 <w:rPr>
                                   <w:rFonts w:ascii="Cambria Math" w:eastAsia="Cambria Math" w:hAnsi="Cambria Math" w:cs="Cambria Math"/>
-                                  <w:lang w:val="en-US"/>
                                 </w:rPr>
                                 <m:t>L</m:t>
                               </m:r>
@@ -588,21 +784,18 @@
       <w:pPr>
         <w:rPr>
           <w:rFonts w:eastAsiaTheme="minorEastAsia"/>
-          <w:lang w:val="en-US"/>
-        </w:rPr>
-      </w:pPr>
-    </w:p>
-    <w:p>
-      <w:pPr>
-        <w:rPr>
-          <w:rFonts w:eastAsiaTheme="minorEastAsia"/>
-          <w:lang w:val="en-US"/>
+        </w:rPr>
+      </w:pPr>
+    </w:p>
+    <w:p>
+      <w:pPr>
+        <w:rPr>
+          <w:rFonts w:eastAsiaTheme="minorEastAsia"/>
         </w:rPr>
       </w:pPr>
       <w:r>
         <w:rPr>
           <w:rFonts w:eastAsiaTheme="minorEastAsia"/>
-          <w:lang w:val="en-US"/>
         </w:rPr>
         <w:t xml:space="preserve">This is text. This is text. This is text. This is text. This is text. This is text. This is text. This is text. This is text. This is text. This is text. This is text. This is text. This is text. This is text. This is text. This is text. This is text. This is text. This is text. This is text. This is text. This is text. This is text. This is text. This is text. This is text. This is text. This is text. This is text. This is text. </w:t>
       </w:r>
@@ -611,50 +804,37 @@
       <w:pPr>
         <w:rPr>
           <w:rFonts w:eastAsiaTheme="minorEastAsia"/>
-          <w:lang w:val="en-US"/>
-        </w:rPr>
-      </w:pPr>
-    </w:p>
-    <w:p>
-      <w:pPr>
-        <w:rPr>
-          <w:rFonts w:eastAsiaTheme="minorEastAsia"/>
-          <w:lang w:val="en-US"/>
-        </w:rPr>
-      </w:pPr>
-    </w:p>
-    <w:p>
-      <w:pPr>
-        <w:rPr>
-          <w:rFonts w:eastAsiaTheme="minorEastAsia"/>
-          <w:lang w:val="en-US"/>
+        </w:rPr>
+      </w:pPr>
+    </w:p>
+    <w:p>
+      <w:pPr>
+        <w:rPr>
+          <w:rFonts w:eastAsiaTheme="minorEastAsia"/>
+        </w:rPr>
+      </w:pPr>
+    </w:p>
+    <w:p>
+      <w:pPr>
+        <w:rPr>
+          <w:rFonts w:eastAsiaTheme="minorEastAsia"/>
         </w:rPr>
       </w:pPr>
       <w:r>
-        <w:rPr>
-          <w:lang w:val="en-US"/>
-        </w:rPr>
         <w:t xml:space="preserve">This is a word </w:t>
       </w:r>
       <w:proofErr w:type="gramStart"/>
       <w:r>
-        <w:rPr>
-          <w:lang w:val="en-US"/>
-        </w:rPr>
         <w:t>document</w:t>
       </w:r>
       <w:proofErr w:type="gramEnd"/>
       <w:r>
-        <w:rPr>
-          <w:lang w:val="en-US"/>
-        </w:rPr>
         <w:t xml:space="preserve"> and this is an inline equation: </w:t>
       </w:r>
       <m:oMath>
         <m:r>
           <w:rPr>
             <w:rFonts w:ascii="Cambria Math" w:hAnsi="Cambria Math"/>
-            <w:lang w:val="en-US"/>
           </w:rPr>
           <m:t>A=π</m:t>
         </m:r>
@@ -663,7 +843,6 @@
             <m:ctrlPr>
               <w:rPr>
                 <w:rFonts w:ascii="Cambria Math" w:hAnsi="Cambria Math"/>
-                <w:lang w:val="en-US"/>
               </w:rPr>
             </m:ctrlPr>
           </m:sSupPr>
@@ -671,7 +850,6 @@
             <m:r>
               <w:rPr>
                 <w:rFonts w:ascii="Cambria Math" w:hAnsi="Cambria Math"/>
-                <w:lang w:val="en-US"/>
               </w:rPr>
               <m:t>r</m:t>
             </m:r>
@@ -680,7 +858,6 @@
             <m:r>
               <w:rPr>
                 <w:rFonts w:ascii="Cambria Math" w:hAnsi="Cambria Math"/>
-                <w:lang w:val="en-US"/>
               </w:rPr>
               <m:t>2</m:t>
             </m:r>
@@ -689,7 +866,6 @@
         <m:r>
           <w:rPr>
             <w:rFonts w:ascii="Cambria Math" w:hAnsi="Cambria Math"/>
-            <w:lang w:val="en-US"/>
           </w:rPr>
           <m:t xml:space="preserve"> </m:t>
         </m:r>
@@ -697,7 +873,6 @@
       <w:r>
         <w:rPr>
           <w:rFonts w:eastAsiaTheme="minorEastAsia"/>
-          <w:lang w:val="en-US"/>
         </w:rPr>
         <w:t>. If instead, I want an equation by line, I can do this:</w:t>
       </w:r>
@@ -706,15 +881,13 @@
       <w:pPr>
         <w:rPr>
           <w:rFonts w:eastAsiaTheme="minorEastAsia"/>
-          <w:lang w:val="en-US"/>
-        </w:rPr>
-      </w:pPr>
-    </w:p>
-    <w:p>
-      <w:pPr>
-        <w:rPr>
-          <w:rFonts w:eastAsiaTheme="minorEastAsia"/>
-          <w:lang w:val="en-US"/>
+        </w:rPr>
+      </w:pPr>
+    </w:p>
+    <w:p>
+      <w:pPr>
+        <w:rPr>
+          <w:rFonts w:eastAsiaTheme="minorEastAsia"/>
         </w:rPr>
       </w:pPr>
       <m:oMathPara>
@@ -724,7 +897,6 @@
               <m:ctrlPr>
                 <w:rPr>
                   <w:rFonts w:ascii="Cambria Math" w:eastAsiaTheme="minorEastAsia" w:hAnsi="Cambria Math"/>
-                  <w:lang w:val="en-US"/>
                 </w:rPr>
               </m:ctrlPr>
             </m:sSupPr>
@@ -734,7 +906,6 @@
                   <m:ctrlPr>
                     <w:rPr>
                       <w:rFonts w:ascii="Cambria Math" w:eastAsiaTheme="minorEastAsia" w:hAnsi="Cambria Math"/>
-                      <w:lang w:val="en-US"/>
                     </w:rPr>
                   </m:ctrlPr>
                 </m:dPr>
@@ -742,7 +913,6 @@
                   <m:r>
                     <w:rPr>
                       <w:rFonts w:ascii="Cambria Math" w:eastAsiaTheme="minorEastAsia" w:hAnsi="Cambria Math"/>
-                      <w:lang w:val="en-US"/>
                     </w:rPr>
                     <m:t>x+a</m:t>
                   </m:r>
@@ -753,7 +923,6 @@
               <m:r>
                 <w:rPr>
                   <w:rFonts w:ascii="Cambria Math" w:eastAsiaTheme="minorEastAsia" w:hAnsi="Cambria Math"/>
-                  <w:lang w:val="en-US"/>
                 </w:rPr>
                 <m:t>n</m:t>
               </m:r>
@@ -762,7 +931,6 @@
           <m:r>
             <w:rPr>
               <w:rFonts w:ascii="Cambria Math" w:eastAsia="Cambria Math" w:hAnsi="Cambria Math" w:cs="Cambria Math"/>
-              <w:lang w:val="en-US"/>
             </w:rPr>
             <m:t>=</m:t>
           </m:r>
@@ -773,7 +941,6 @@
               <m:ctrlPr>
                 <w:rPr>
                   <w:rFonts w:ascii="Cambria Math" w:eastAsiaTheme="minorEastAsia" w:hAnsi="Cambria Math"/>
-                  <w:lang w:val="en-US"/>
                 </w:rPr>
               </m:ctrlPr>
             </m:naryPr>
@@ -781,7 +948,6 @@
               <m:r>
                 <w:rPr>
                   <w:rFonts w:ascii="Cambria Math" w:eastAsia="Cambria Math" w:hAnsi="Cambria Math" w:cs="Cambria Math"/>
-                  <w:lang w:val="en-US"/>
                 </w:rPr>
                 <m:t>k=0</m:t>
               </m:r>
@@ -790,7 +956,6 @@
               <m:r>
                 <w:rPr>
                   <w:rFonts w:ascii="Cambria Math" w:eastAsia="Cambria Math" w:hAnsi="Cambria Math" w:cs="Cambria Math"/>
-                  <w:lang w:val="en-US"/>
                 </w:rPr>
                 <m:t>n</m:t>
               </m:r>
@@ -801,7 +966,6 @@
                   <m:ctrlPr>
                     <w:rPr>
                       <w:rFonts w:ascii="Cambria Math" w:eastAsiaTheme="minorEastAsia" w:hAnsi="Cambria Math"/>
-                      <w:lang w:val="en-US"/>
                     </w:rPr>
                   </m:ctrlPr>
                 </m:dPr>
@@ -812,7 +976,6 @@
                       <m:ctrlPr>
                         <w:rPr>
                           <w:rFonts w:ascii="Cambria Math" w:eastAsiaTheme="minorEastAsia" w:hAnsi="Cambria Math"/>
-                          <w:lang w:val="en-US"/>
                         </w:rPr>
                       </m:ctrlPr>
                     </m:fPr>
@@ -820,7 +983,6 @@
                       <m:r>
                         <w:rPr>
                           <w:rFonts w:ascii="Cambria Math" w:eastAsia="Cambria Math" w:hAnsi="Cambria Math" w:cs="Cambria Math"/>
-                          <w:lang w:val="en-US"/>
                         </w:rPr>
                         <m:t>n</m:t>
                       </m:r>
@@ -829,7 +991,6 @@
                       <m:r>
                         <w:rPr>
                           <w:rFonts w:ascii="Cambria Math" w:eastAsia="Cambria Math" w:hAnsi="Cambria Math" w:cs="Cambria Math"/>
-                          <w:lang w:val="en-US"/>
                         </w:rPr>
                         <m:t>k</m:t>
                       </m:r>
@@ -842,7 +1003,6 @@
                   <m:ctrlPr>
                     <w:rPr>
                       <w:rFonts w:ascii="Cambria Math" w:eastAsiaTheme="minorEastAsia" w:hAnsi="Cambria Math"/>
-                      <w:lang w:val="en-US"/>
                     </w:rPr>
                   </m:ctrlPr>
                 </m:sSupPr>
@@ -850,7 +1010,6 @@
                   <m:r>
                     <w:rPr>
                       <w:rFonts w:ascii="Cambria Math" w:eastAsia="Cambria Math" w:hAnsi="Cambria Math" w:cs="Cambria Math"/>
-                      <w:lang w:val="en-US"/>
                     </w:rPr>
                     <m:t>x</m:t>
                   </m:r>
@@ -859,7 +1018,6 @@
                   <m:r>
                     <w:rPr>
                       <w:rFonts w:ascii="Cambria Math" w:eastAsia="Cambria Math" w:hAnsi="Cambria Math" w:cs="Cambria Math"/>
-                      <w:lang w:val="en-US"/>
                     </w:rPr>
                     <m:t>k</m:t>
                   </m:r>
@@ -870,7 +1028,6 @@
                   <m:ctrlPr>
                     <w:rPr>
                       <w:rFonts w:ascii="Cambria Math" w:eastAsiaTheme="minorEastAsia" w:hAnsi="Cambria Math"/>
-                      <w:lang w:val="en-US"/>
                     </w:rPr>
                   </m:ctrlPr>
                 </m:sSupPr>
@@ -878,7 +1035,6 @@
                   <m:r>
                     <w:rPr>
                       <w:rFonts w:ascii="Cambria Math" w:eastAsia="Cambria Math" w:hAnsi="Cambria Math" w:cs="Cambria Math"/>
-                      <w:lang w:val="en-US"/>
                     </w:rPr>
                     <m:t>a</m:t>
                   </m:r>
@@ -887,7 +1043,6 @@
                   <m:r>
                     <w:rPr>
                       <w:rFonts w:ascii="Cambria Math" w:eastAsia="Cambria Math" w:hAnsi="Cambria Math" w:cs="Cambria Math"/>
-                      <w:lang w:val="en-US"/>
                     </w:rPr>
                     <m:t>n-k</m:t>
                   </m:r>
@@ -902,21 +1057,18 @@
       <w:pPr>
         <w:rPr>
           <w:rFonts w:eastAsiaTheme="minorEastAsia"/>
-          <w:lang w:val="en-US"/>
-        </w:rPr>
-      </w:pPr>
-    </w:p>
-    <w:p>
-      <w:pPr>
-        <w:rPr>
-          <w:rFonts w:eastAsiaTheme="minorEastAsia"/>
-          <w:lang w:val="en-US"/>
+        </w:rPr>
+      </w:pPr>
+    </w:p>
+    <w:p>
+      <w:pPr>
+        <w:rPr>
+          <w:rFonts w:eastAsiaTheme="minorEastAsia"/>
         </w:rPr>
       </w:pPr>
       <w:r>
         <w:rPr>
           <w:rFonts w:eastAsiaTheme="minorEastAsia"/>
-          <w:lang w:val="en-US"/>
         </w:rPr>
         <w:t>And that is an equation by itself. Cheers!</w:t>
       </w:r>
@@ -925,21 +1077,18 @@
       <w:pPr>
         <w:rPr>
           <w:rFonts w:eastAsiaTheme="minorEastAsia"/>
-          <w:lang w:val="en-US"/>
-        </w:rPr>
-      </w:pPr>
-    </w:p>
-    <w:p>
-      <w:pPr>
-        <w:rPr>
-          <w:rFonts w:eastAsiaTheme="minorEastAsia"/>
-          <w:lang w:val="en-US"/>
+        </w:rPr>
+      </w:pPr>
+    </w:p>
+    <w:p>
+      <w:pPr>
+        <w:rPr>
+          <w:rFonts w:eastAsiaTheme="minorEastAsia"/>
         </w:rPr>
       </w:pPr>
       <w:r>
         <w:rPr>
           <w:rFonts w:eastAsiaTheme="minorEastAsia"/>
-          <w:lang w:val="en-US"/>
         </w:rPr>
         <w:t>This is another equation:</w:t>
       </w:r>
@@ -948,15 +1097,13 @@
       <w:pPr>
         <w:rPr>
           <w:rFonts w:eastAsiaTheme="minorEastAsia"/>
-          <w:lang w:val="en-US"/>
-        </w:rPr>
-      </w:pPr>
-    </w:p>
-    <w:p>
-      <w:pPr>
-        <w:rPr>
-          <w:rFonts w:eastAsiaTheme="minorEastAsia"/>
-          <w:lang w:val="en-US"/>
+        </w:rPr>
+      </w:pPr>
+    </w:p>
+    <w:p>
+      <w:pPr>
+        <w:rPr>
+          <w:rFonts w:eastAsiaTheme="minorEastAsia"/>
         </w:rPr>
       </w:pPr>
       <m:oMathPara>
@@ -966,7 +1113,6 @@
               <m:ctrlPr>
                 <w:rPr>
                   <w:rFonts w:ascii="Cambria Math" w:eastAsiaTheme="minorEastAsia" w:hAnsi="Cambria Math"/>
-                  <w:lang w:val="en-US"/>
                 </w:rPr>
               </m:ctrlPr>
             </m:sSupPr>
@@ -976,7 +1122,6 @@
                   <m:ctrlPr>
                     <w:rPr>
                       <w:rFonts w:ascii="Cambria Math" w:eastAsiaTheme="minorEastAsia" w:hAnsi="Cambria Math"/>
-                      <w:lang w:val="en-US"/>
                     </w:rPr>
                   </m:ctrlPr>
                 </m:dPr>
@@ -984,7 +1129,6 @@
                   <m:r>
                     <w:rPr>
                       <w:rFonts w:ascii="Cambria Math" w:eastAsiaTheme="minorEastAsia" w:hAnsi="Cambria Math"/>
-                      <w:lang w:val="en-US"/>
                     </w:rPr>
                     <m:t>1+x</m:t>
                   </m:r>
@@ -995,7 +1139,6 @@
               <m:r>
                 <w:rPr>
                   <w:rFonts w:ascii="Cambria Math" w:eastAsiaTheme="minorEastAsia" w:hAnsi="Cambria Math"/>
-                  <w:lang w:val="en-US"/>
                 </w:rPr>
                 <m:t>n</m:t>
               </m:r>
@@ -1004,7 +1147,6 @@
           <m:r>
             <w:rPr>
               <w:rFonts w:ascii="Cambria Math" w:eastAsiaTheme="minorEastAsia" w:hAnsi="Cambria Math"/>
-              <w:lang w:val="en-US"/>
             </w:rPr>
             <m:t>=1+</m:t>
           </m:r>
@@ -1013,7 +1155,6 @@
               <m:ctrlPr>
                 <w:rPr>
                   <w:rFonts w:ascii="Cambria Math" w:eastAsiaTheme="minorEastAsia" w:hAnsi="Cambria Math"/>
-                  <w:lang w:val="en-US"/>
                 </w:rPr>
               </m:ctrlPr>
             </m:fPr>
@@ -1021,7 +1162,6 @@
               <m:r>
                 <w:rPr>
                   <w:rFonts w:ascii="Cambria Math" w:eastAsiaTheme="minorEastAsia" w:hAnsi="Cambria Math"/>
-                  <w:lang w:val="en-US"/>
                 </w:rPr>
                 <m:t>nx</m:t>
               </m:r>
@@ -1030,7 +1170,6 @@
               <m:r>
                 <w:rPr>
                   <w:rFonts w:ascii="Cambria Math" w:eastAsiaTheme="minorEastAsia" w:hAnsi="Cambria Math"/>
-                  <w:lang w:val="en-US"/>
                 </w:rPr>
                 <m:t>1!</m:t>
               </m:r>
@@ -1039,7 +1178,6 @@
           <m:r>
             <w:rPr>
               <w:rFonts w:ascii="Cambria Math" w:eastAsiaTheme="minorEastAsia" w:hAnsi="Cambria Math"/>
-              <w:lang w:val="en-US"/>
             </w:rPr>
             <m:t>+</m:t>
           </m:r>
@@ -1048,7 +1186,6 @@
               <m:ctrlPr>
                 <w:rPr>
                   <w:rFonts w:ascii="Cambria Math" w:eastAsiaTheme="minorEastAsia" w:hAnsi="Cambria Math"/>
-                  <w:lang w:val="en-US"/>
                 </w:rPr>
               </m:ctrlPr>
             </m:fPr>
@@ -1056,7 +1193,6 @@
               <m:r>
                 <w:rPr>
                   <w:rFonts w:ascii="Cambria Math" w:eastAsiaTheme="minorEastAsia" w:hAnsi="Cambria Math"/>
-                  <w:lang w:val="en-US"/>
                 </w:rPr>
                 <m:t>n</m:t>
               </m:r>
@@ -1065,7 +1201,6 @@
                   <m:ctrlPr>
                     <w:rPr>
                       <w:rFonts w:ascii="Cambria Math" w:eastAsiaTheme="minorEastAsia" w:hAnsi="Cambria Math"/>
-                      <w:lang w:val="en-US"/>
                     </w:rPr>
                   </m:ctrlPr>
                 </m:dPr>
@@ -1073,7 +1208,6 @@
                   <m:r>
                     <w:rPr>
                       <w:rFonts w:ascii="Cambria Math" w:eastAsiaTheme="minorEastAsia" w:hAnsi="Cambria Math"/>
-                      <w:lang w:val="en-US"/>
                     </w:rPr>
                     <m:t>n-1</m:t>
                   </m:r>
@@ -1084,7 +1218,6 @@
                   <m:ctrlPr>
                     <w:rPr>
                       <w:rFonts w:ascii="Cambria Math" w:eastAsiaTheme="minorEastAsia" w:hAnsi="Cambria Math"/>
-                      <w:lang w:val="en-US"/>
                     </w:rPr>
                   </m:ctrlPr>
                 </m:sSupPr>
@@ -1092,7 +1225,6 @@
                   <m:r>
                     <w:rPr>
                       <w:rFonts w:ascii="Cambria Math" w:eastAsiaTheme="minorEastAsia" w:hAnsi="Cambria Math"/>
-                      <w:lang w:val="en-US"/>
                     </w:rPr>
                     <m:t>x</m:t>
                   </m:r>
@@ -1101,7 +1233,6 @@
                   <m:r>
                     <w:rPr>
                       <w:rFonts w:ascii="Cambria Math" w:eastAsiaTheme="minorEastAsia" w:hAnsi="Cambria Math"/>
-                      <w:lang w:val="en-US"/>
                     </w:rPr>
                     <m:t>2</m:t>
                   </m:r>
@@ -1112,7 +1243,6 @@
               <m:r>
                 <w:rPr>
                   <w:rFonts w:ascii="Cambria Math" w:eastAsiaTheme="minorEastAsia" w:hAnsi="Cambria Math"/>
-                  <w:lang w:val="en-US"/>
                 </w:rPr>
                 <m:t>2!</m:t>
               </m:r>
@@ -1121,7 +1251,6 @@
           <m:r>
             <w:rPr>
               <w:rFonts w:ascii="Cambria Math" w:eastAsiaTheme="minorEastAsia" w:hAnsi="Cambria Math"/>
-              <w:lang w:val="en-US"/>
             </w:rPr>
             <m:t>+…</m:t>
           </m:r>
@@ -1132,21 +1261,18 @@
       <w:pPr>
         <w:rPr>
           <w:rFonts w:eastAsiaTheme="minorEastAsia"/>
-          <w:lang w:val="en-US"/>
-        </w:rPr>
-      </w:pPr>
-    </w:p>
-    <w:p>
-      <w:pPr>
-        <w:rPr>
-          <w:rFonts w:eastAsiaTheme="minorEastAsia"/>
-          <w:lang w:val="en-US"/>
+        </w:rPr>
+      </w:pPr>
+    </w:p>
+    <w:p>
+      <w:pPr>
+        <w:rPr>
+          <w:rFonts w:eastAsiaTheme="minorEastAsia"/>
         </w:rPr>
       </w:pPr>
       <w:r>
         <w:rPr>
           <w:rFonts w:eastAsiaTheme="minorEastAsia"/>
-          <w:lang w:val="en-US"/>
         </w:rPr>
         <w:t xml:space="preserve">This is text. This is text. This is text. This is text. This is text. This is text. This is text. This is text. This is text. This is text. This is text. This is text. This is text. This is text. This is text. This is text. This is text. This is text. This is text. This is text. This is text. This is text. This is text. This is text. This is text. This is text. This is text. This is text. This is text. This is text. This is text. </w:t>
       </w:r>
@@ -1155,50 +1281,37 @@
       <w:pPr>
         <w:rPr>
           <w:rFonts w:eastAsiaTheme="minorEastAsia"/>
-          <w:lang w:val="en-US"/>
-        </w:rPr>
-      </w:pPr>
-    </w:p>
-    <w:p>
-      <w:pPr>
-        <w:rPr>
-          <w:rFonts w:eastAsiaTheme="minorEastAsia"/>
-          <w:lang w:val="en-US"/>
-        </w:rPr>
-      </w:pPr>
-    </w:p>
-    <w:p>
-      <w:pPr>
-        <w:rPr>
-          <w:rFonts w:eastAsiaTheme="minorEastAsia"/>
-          <w:lang w:val="en-US"/>
+        </w:rPr>
+      </w:pPr>
+    </w:p>
+    <w:p>
+      <w:pPr>
+        <w:rPr>
+          <w:rFonts w:eastAsiaTheme="minorEastAsia"/>
+        </w:rPr>
+      </w:pPr>
+    </w:p>
+    <w:p>
+      <w:pPr>
+        <w:rPr>
+          <w:rFonts w:eastAsiaTheme="minorEastAsia"/>
         </w:rPr>
       </w:pPr>
       <w:r>
-        <w:rPr>
-          <w:lang w:val="en-US"/>
-        </w:rPr>
         <w:t xml:space="preserve">This is a word </w:t>
       </w:r>
       <w:proofErr w:type="gramStart"/>
       <w:r>
-        <w:rPr>
-          <w:lang w:val="en-US"/>
-        </w:rPr>
         <w:t>document</w:t>
       </w:r>
       <w:proofErr w:type="gramEnd"/>
       <w:r>
-        <w:rPr>
-          <w:lang w:val="en-US"/>
-        </w:rPr>
         <w:t xml:space="preserve"> and this is an inline equation: </w:t>
       </w:r>
       <m:oMath>
         <m:r>
           <w:rPr>
             <w:rFonts w:ascii="Cambria Math" w:hAnsi="Cambria Math"/>
-            <w:lang w:val="en-US"/>
           </w:rPr>
           <m:t>A=π</m:t>
         </m:r>
@@ -1207,7 +1320,6 @@
             <m:ctrlPr>
               <w:rPr>
                 <w:rFonts w:ascii="Cambria Math" w:hAnsi="Cambria Math"/>
-                <w:lang w:val="en-US"/>
               </w:rPr>
             </m:ctrlPr>
           </m:sSupPr>
@@ -1215,7 +1327,6 @@
             <m:r>
               <w:rPr>
                 <w:rFonts w:ascii="Cambria Math" w:hAnsi="Cambria Math"/>
-                <w:lang w:val="en-US"/>
               </w:rPr>
               <m:t>r</m:t>
             </m:r>
@@ -1224,7 +1335,6 @@
             <m:r>
               <w:rPr>
                 <w:rFonts w:ascii="Cambria Math" w:hAnsi="Cambria Math"/>
-                <w:lang w:val="en-US"/>
               </w:rPr>
               <m:t>2</m:t>
             </m:r>
@@ -1233,7 +1343,6 @@
         <m:r>
           <w:rPr>
             <w:rFonts w:ascii="Cambria Math" w:hAnsi="Cambria Math"/>
-            <w:lang w:val="en-US"/>
           </w:rPr>
           <m:t xml:space="preserve"> </m:t>
         </m:r>
@@ -1241,7 +1350,6 @@
       <w:r>
         <w:rPr>
           <w:rFonts w:eastAsiaTheme="minorEastAsia"/>
-          <w:lang w:val="en-US"/>
         </w:rPr>
         <w:t>. If instead, I want an equation by line, I can do this:</w:t>
       </w:r>
@@ -1250,15 +1358,13 @@
       <w:pPr>
         <w:rPr>
           <w:rFonts w:eastAsiaTheme="minorEastAsia"/>
-          <w:lang w:val="en-US"/>
-        </w:rPr>
-      </w:pPr>
-    </w:p>
-    <w:p>
-      <w:pPr>
-        <w:rPr>
-          <w:rFonts w:eastAsiaTheme="minorEastAsia"/>
-          <w:lang w:val="en-US"/>
+        </w:rPr>
+      </w:pPr>
+    </w:p>
+    <w:p>
+      <w:pPr>
+        <w:rPr>
+          <w:rFonts w:eastAsiaTheme="minorEastAsia"/>
         </w:rPr>
       </w:pPr>
       <m:oMathPara>
@@ -1268,7 +1374,6 @@
               <m:ctrlPr>
                 <w:rPr>
                   <w:rFonts w:ascii="Cambria Math" w:eastAsiaTheme="minorEastAsia" w:hAnsi="Cambria Math"/>
-                  <w:lang w:val="en-US"/>
                 </w:rPr>
               </m:ctrlPr>
             </m:sSupPr>
@@ -1276,7 +1381,6 @@
               <m:r>
                 <w:rPr>
                   <w:rFonts w:ascii="Cambria Math" w:eastAsiaTheme="minorEastAsia" w:hAnsi="Cambria Math"/>
-                  <w:lang w:val="en-US"/>
                 </w:rPr>
                 <m:t>e</m:t>
               </m:r>
@@ -1285,7 +1389,6 @@
               <m:r>
                 <w:rPr>
                   <w:rFonts w:ascii="Cambria Math" w:eastAsiaTheme="minorEastAsia" w:hAnsi="Cambria Math"/>
-                  <w:lang w:val="en-US"/>
                 </w:rPr>
                 <m:t>x</m:t>
               </m:r>
@@ -1294,7 +1397,6 @@
           <m:r>
             <w:rPr>
               <w:rFonts w:ascii="Cambria Math" w:eastAsiaTheme="minorEastAsia" w:hAnsi="Cambria Math"/>
-              <w:lang w:val="en-US"/>
             </w:rPr>
             <m:t>=1+</m:t>
           </m:r>
@@ -1303,7 +1405,6 @@
               <m:ctrlPr>
                 <w:rPr>
                   <w:rFonts w:ascii="Cambria Math" w:eastAsiaTheme="minorEastAsia" w:hAnsi="Cambria Math"/>
-                  <w:lang w:val="en-US"/>
                 </w:rPr>
               </m:ctrlPr>
             </m:fPr>
@@ -1311,7 +1412,6 @@
               <m:r>
                 <w:rPr>
                   <w:rFonts w:ascii="Cambria Math" w:eastAsiaTheme="minorEastAsia" w:hAnsi="Cambria Math"/>
-                  <w:lang w:val="en-US"/>
                 </w:rPr>
                 <m:t>x</m:t>
               </m:r>
@@ -1320,7 +1420,6 @@
               <m:r>
                 <w:rPr>
                   <w:rFonts w:ascii="Cambria Math" w:eastAsiaTheme="minorEastAsia" w:hAnsi="Cambria Math"/>
-                  <w:lang w:val="en-US"/>
                 </w:rPr>
                 <m:t>1!</m:t>
               </m:r>
@@ -1329,7 +1428,6 @@
           <m:r>
             <w:rPr>
               <w:rFonts w:ascii="Cambria Math" w:eastAsiaTheme="minorEastAsia" w:hAnsi="Cambria Math"/>
-              <w:lang w:val="en-US"/>
             </w:rPr>
             <m:t>+</m:t>
           </m:r>
@@ -1338,7 +1436,6 @@
               <m:ctrlPr>
                 <w:rPr>
                   <w:rFonts w:ascii="Cambria Math" w:eastAsiaTheme="minorEastAsia" w:hAnsi="Cambria Math"/>
-                  <w:lang w:val="en-US"/>
                 </w:rPr>
               </m:ctrlPr>
             </m:fPr>
@@ -1348,7 +1445,6 @@
                   <m:ctrlPr>
                     <w:rPr>
                       <w:rFonts w:ascii="Cambria Math" w:eastAsiaTheme="minorEastAsia" w:hAnsi="Cambria Math"/>
-                      <w:lang w:val="en-US"/>
                     </w:rPr>
                   </m:ctrlPr>
                 </m:sSupPr>
@@ -1356,7 +1452,6 @@
                   <m:r>
                     <w:rPr>
                       <w:rFonts w:ascii="Cambria Math" w:eastAsiaTheme="minorEastAsia" w:hAnsi="Cambria Math"/>
-                      <w:lang w:val="en-US"/>
                     </w:rPr>
                     <m:t>x</m:t>
                   </m:r>
@@ -1365,7 +1460,6 @@
                   <m:r>
                     <w:rPr>
                       <w:rFonts w:ascii="Cambria Math" w:eastAsiaTheme="minorEastAsia" w:hAnsi="Cambria Math"/>
-                      <w:lang w:val="en-US"/>
                     </w:rPr>
                     <m:t>2</m:t>
                   </m:r>
@@ -1376,7 +1470,6 @@
               <m:r>
                 <w:rPr>
                   <w:rFonts w:ascii="Cambria Math" w:eastAsiaTheme="minorEastAsia" w:hAnsi="Cambria Math"/>
-                  <w:lang w:val="en-US"/>
                 </w:rPr>
                 <m:t>2!</m:t>
               </m:r>
@@ -1385,7 +1478,6 @@
           <m:r>
             <w:rPr>
               <w:rFonts w:ascii="Cambria Math" w:eastAsiaTheme="minorEastAsia" w:hAnsi="Cambria Math"/>
-              <w:lang w:val="en-US"/>
             </w:rPr>
             <m:t>+</m:t>
           </m:r>
@@ -1394,7 +1486,6 @@
               <m:ctrlPr>
                 <w:rPr>
                   <w:rFonts w:ascii="Cambria Math" w:eastAsiaTheme="minorEastAsia" w:hAnsi="Cambria Math"/>
-                  <w:lang w:val="en-US"/>
                 </w:rPr>
               </m:ctrlPr>
             </m:fPr>
@@ -1404,7 +1495,6 @@
                   <m:ctrlPr>
                     <w:rPr>
                       <w:rFonts w:ascii="Cambria Math" w:eastAsiaTheme="minorEastAsia" w:hAnsi="Cambria Math"/>
-                      <w:lang w:val="en-US"/>
                     </w:rPr>
                   </m:ctrlPr>
                 </m:sSupPr>
@@ -1412,7 +1502,6 @@
                   <m:r>
                     <w:rPr>
                       <w:rFonts w:ascii="Cambria Math" w:eastAsiaTheme="minorEastAsia" w:hAnsi="Cambria Math"/>
-                      <w:lang w:val="en-US"/>
                     </w:rPr>
                     <m:t>x</m:t>
                   </m:r>
@@ -1421,7 +1510,6 @@
                   <m:r>
                     <w:rPr>
                       <w:rFonts w:ascii="Cambria Math" w:eastAsiaTheme="minorEastAsia" w:hAnsi="Cambria Math"/>
-                      <w:lang w:val="en-US"/>
                     </w:rPr>
                     <m:t>3</m:t>
                   </m:r>
@@ -1432,7 +1520,6 @@
               <m:r>
                 <w:rPr>
                   <w:rFonts w:ascii="Cambria Math" w:eastAsiaTheme="minorEastAsia" w:hAnsi="Cambria Math"/>
-                  <w:lang w:val="en-US"/>
                 </w:rPr>
                 <m:t>3!</m:t>
               </m:r>
@@ -1441,7 +1528,6 @@
           <m:r>
             <w:rPr>
               <w:rFonts w:ascii="Cambria Math" w:eastAsiaTheme="minorEastAsia" w:hAnsi="Cambria Math"/>
-              <w:lang w:val="en-US"/>
             </w:rPr>
             <m:t>+…,</m:t>
           </m:r>
@@ -1451,14 +1537,12 @@
             </m:rPr>
             <w:rPr>
               <w:rFonts w:ascii="Cambria Math" w:eastAsiaTheme="minorEastAsia" w:hAnsi="Cambria Math"/>
-              <w:lang w:val="en-US"/>
             </w:rPr>
             <m:t xml:space="preserve">  </m:t>
           </m:r>
           <m:r>
             <w:rPr>
               <w:rFonts w:ascii="Cambria Math" w:eastAsiaTheme="minorEastAsia" w:hAnsi="Cambria Math"/>
-              <w:lang w:val="en-US"/>
             </w:rPr>
             <m:t>-∞&lt;x&lt;∞</m:t>
           </m:r>
@@ -1469,22 +1553,20 @@
       <w:pPr>
         <w:rPr>
           <w:rFonts w:eastAsiaTheme="minorEastAsia"/>
-          <w:lang w:val="en-US"/>
-        </w:rPr>
-      </w:pPr>
-    </w:p>
-    <w:p>
-      <w:pPr>
-        <w:rPr>
-          <w:rFonts w:eastAsiaTheme="minorEastAsia"/>
-          <w:lang w:val="en-US"/>
+        </w:rPr>
+      </w:pPr>
+    </w:p>
+    <w:p>
+      <w:pPr>
+        <w:rPr>
+          <w:rFonts w:eastAsiaTheme="minorEastAsia"/>
         </w:rPr>
       </w:pPr>
       <w:r>
         <w:rPr>
           <w:rFonts w:eastAsiaTheme="minorEastAsia"/>
-          <w:lang w:val="en-US"/>
-        </w:rPr>
+        </w:rPr>
+        <w:lastRenderedPageBreak/>
         <w:t xml:space="preserve">And that is an equation by itself. Cheers! </w:t>
       </w:r>
     </w:p>
@@ -1492,13 +1574,11 @@
       <w:pPr>
         <w:rPr>
           <w:rFonts w:eastAsiaTheme="minorEastAsia"/>
-          <w:lang w:val="en-US"/>
         </w:rPr>
       </w:pPr>
       <w:r>
         <w:rPr>
           <w:rFonts w:eastAsiaTheme="minorEastAsia"/>
-          <w:lang w:val="en-US"/>
         </w:rPr>
         <w:br w:type="page"/>
       </w:r>
@@ -1507,13 +1587,11 @@
       <w:pPr>
         <w:rPr>
           <w:rFonts w:eastAsiaTheme="minorEastAsia"/>
-          <w:lang w:val="en-US"/>
         </w:rPr>
       </w:pPr>
       <w:r>
         <w:rPr>
           <w:rFonts w:eastAsiaTheme="minorEastAsia"/>
-          <w:lang w:val="en-US"/>
         </w:rPr>
         <w:lastRenderedPageBreak/>
         <w:t xml:space="preserve">Large operators and integrals are represented with </w:t>
@@ -1521,7 +1599,6 @@
       <w:r>
         <w:rPr>
           <w:rFonts w:eastAsiaTheme="minorEastAsia"/>
-          <w:lang w:val="en-US"/>
         </w:rPr>
         <w:t>n-</w:t>
       </w:r>
@@ -1529,7 +1606,6 @@
       <w:r>
         <w:rPr>
           <w:rFonts w:eastAsiaTheme="minorEastAsia"/>
-          <w:lang w:val="en-US"/>
         </w:rPr>
         <w:t>ary</w:t>
       </w:r>
@@ -1537,28 +1613,24 @@
       <w:r>
         <w:rPr>
           <w:rFonts w:eastAsiaTheme="minorEastAsia"/>
-          <w:lang w:val="en-US"/>
         </w:rPr>
         <w:t xml:space="preserve"> object</w:t>
       </w:r>
       <w:r>
         <w:rPr>
           <w:rFonts w:eastAsiaTheme="minorEastAsia"/>
-          <w:lang w:val="en-US"/>
         </w:rPr>
         <w:t xml:space="preserve">s in </w:t>
       </w:r>
       <w:r>
         <w:rPr>
           <w:rFonts w:eastAsiaTheme="minorEastAsia"/>
-          <w:lang w:val="en-US"/>
         </w:rPr>
         <w:t>OMML XML</w:t>
       </w:r>
       <w:r>
         <w:rPr>
           <w:rFonts w:eastAsiaTheme="minorEastAsia"/>
-          <w:lang w:val="en-US"/>
         </w:rPr>
         <w:t>:</w:t>
       </w:r>
@@ -1567,7 +1639,6 @@
       <w:pPr>
         <w:rPr>
           <w:rFonts w:eastAsiaTheme="minorEastAsia"/>
-          <w:lang w:val="en-US"/>
         </w:rPr>
       </w:pPr>
     </w:p>
@@ -1732,7 +1803,6 @@
       <w:pPr>
         <w:rPr>
           <w:rFonts w:eastAsiaTheme="minorEastAsia"/>
-          <w:lang w:val="en-US"/>
         </w:rPr>
       </w:pPr>
       <m:oMathPara>
@@ -1799,7 +1869,6 @@
       <w:pPr>
         <w:rPr>
           <w:rFonts w:eastAsiaTheme="minorEastAsia"/>
-          <w:lang w:val="en-US"/>
         </w:rPr>
       </w:pPr>
       <m:oMathPara>
@@ -1814,7 +1883,6 @@
                 <w:rPr>
                   <w:rFonts w:ascii="Cambria Math" w:eastAsiaTheme="minorEastAsia" w:hAnsi="Cambria Math"/>
                   <w:i/>
-                  <w:lang w:val="en-US"/>
                 </w:rPr>
               </m:ctrlPr>
             </m:naryPr>
@@ -1824,7 +1892,6 @@
               <m:r>
                 <w:rPr>
                   <w:rFonts w:ascii="Cambria Math" w:eastAsiaTheme="minorEastAsia" w:hAnsi="Cambria Math"/>
-                  <w:lang w:val="en-US"/>
                 </w:rPr>
                 <m:t>x</m:t>
               </m:r>
@@ -2178,7 +2245,6 @@
       <w:pPr>
         <w:rPr>
           <w:rFonts w:eastAsiaTheme="minorEastAsia"/>
-          <w:lang w:val="en-US"/>
         </w:rPr>
       </w:pPr>
     </w:p>
@@ -2190,6 +2256,127 @@
     </w:sectPr>
   </w:body>
 </w:document>
+</file>
+
+<file path=word/numbering.xml><?xml version="1.0" encoding="utf-8"?>
+<w:numbering xmlns:wpc="http://schemas.microsoft.com/office/word/2010/wordprocessingCanvas" xmlns:cx="http://schemas.microsoft.com/office/drawing/2014/chartex" xmlns:cx1="http://schemas.microsoft.com/office/drawing/2015/9/8/chartex" xmlns:cx2="http://schemas.microsoft.com/office/drawing/2015/10/21/chartex" xmlns:cx3="http://schemas.microsoft.com/office/drawing/2016/5/9/chartex" xmlns:cx4="http://schemas.microsoft.com/office/drawing/2016/5/10/chartex" xmlns:cx5="http://schemas.microsoft.com/office/drawing/2016/5/11/chartex" xmlns:cx6="http://schemas.microsoft.com/office/drawing/2016/5/12/chartex" xmlns:cx7="http://schemas.microsoft.com/office/drawing/2016/5/13/chartex" xmlns:cx8="http://schemas.microsoft.com/office/drawing/2016/5/14/chartex" xmlns:mc="http://schemas.openxmlformats.org/markup-compatibility/2006" xmlns:aink="http://schemas.microsoft.com/office/drawing/2016/ink" xmlns:am3d="http://schemas.microsoft.com/office/drawing/2017/model3d" xmlns:o="urn:schemas-microsoft-com:office:office" xmlns:oel="http://schemas.microsoft.com/office/2019/extlst" xmlns:r="http://schemas.openxmlformats.org/officeDocument/2006/relationships" xmlns:m="http://schemas.openxmlformats.org/officeDocument/2006/math" xmlns:v="urn:schemas-microsoft-com:vml" xmlns:wp14="http://schemas.microsoft.com/office/word/2010/wordprocessingDrawing" xmlns:wp="http://schemas.openxmlformats.org/drawingml/2006/wordprocessingDrawing" xmlns:w10="urn:schemas-microsoft-com:office:word" xmlns:w="http://schemas.openxmlformats.org/wordprocessingml/2006/main" xmlns:w14="http://schemas.microsoft.com/office/word/2010/wordml" xmlns:w15="http://schemas.microsoft.com/office/word/2012/wordml" xmlns:w16cex="http://schemas.microsoft.com/office/word/2018/wordml/cex" xmlns:w16cid="http://schemas.microsoft.com/office/word/2016/wordml/cid" xmlns:w16="http://schemas.microsoft.com/office/word/2018/wordml" xmlns:w16du="http://schemas.microsoft.com/office/word/2023/wordml/word16du" xmlns:w16sdtdh="http://schemas.microsoft.com/office/word/2020/wordml/sdtdatahash" xmlns:w16sdtfl="http://schemas.microsoft.com/office/word/2024/wordml/sdtformatlock" xmlns:w16se="http://schemas.microsoft.com/office/word/2015/wordml/symex" xmlns:wpg="http://schemas.microsoft.com/office/word/2010/wordprocessingGroup" xmlns:wpi="http://schemas.microsoft.com/office/word/2010/wordprocessingInk" xmlns:wne="http://schemas.microsoft.com/office/word/2006/wordml" xmlns:wps="http://schemas.microsoft.com/office/word/2010/wordprocessingShape" mc:Ignorable="w14 w15 w16se w16cid w16 w16cex w16sdtdh w16sdtfl w16du wp14">
+  <w:abstractNum w:abstractNumId="0" w15:restartNumberingAfterBreak="0">
+    <w:nsid w:val="1D9F0E65"/>
+    <w:multiLevelType w:val="hybridMultilevel"/>
+    <w:tmpl w:val="BD981A46"/>
+    <w:lvl w:ilvl="0" w:tplc="04090001">
+      <w:start w:val="1"/>
+      <w:numFmt w:val="bullet"/>
+      <w:lvlText w:val=""/>
+      <w:lvlJc w:val="left"/>
+      <w:pPr>
+        <w:ind w:left="720" w:hanging="360"/>
+      </w:pPr>
+      <w:rPr>
+        <w:rFonts w:ascii="Symbol" w:hAnsi="Symbol" w:hint="default"/>
+      </w:rPr>
+    </w:lvl>
+    <w:lvl w:ilvl="1" w:tplc="04090003" w:tentative="1">
+      <w:start w:val="1"/>
+      <w:numFmt w:val="bullet"/>
+      <w:lvlText w:val="o"/>
+      <w:lvlJc w:val="left"/>
+      <w:pPr>
+        <w:ind w:left="1440" w:hanging="360"/>
+      </w:pPr>
+      <w:rPr>
+        <w:rFonts w:ascii="Courier New" w:hAnsi="Courier New" w:cs="Courier New" w:hint="default"/>
+      </w:rPr>
+    </w:lvl>
+    <w:lvl w:ilvl="2" w:tplc="04090005" w:tentative="1">
+      <w:start w:val="1"/>
+      <w:numFmt w:val="bullet"/>
+      <w:lvlText w:val=""/>
+      <w:lvlJc w:val="left"/>
+      <w:pPr>
+        <w:ind w:left="2160" w:hanging="360"/>
+      </w:pPr>
+      <w:rPr>
+        <w:rFonts w:ascii="Wingdings" w:hAnsi="Wingdings" w:hint="default"/>
+      </w:rPr>
+    </w:lvl>
+    <w:lvl w:ilvl="3" w:tplc="04090001" w:tentative="1">
+      <w:start w:val="1"/>
+      <w:numFmt w:val="bullet"/>
+      <w:lvlText w:val=""/>
+      <w:lvlJc w:val="left"/>
+      <w:pPr>
+        <w:ind w:left="2880" w:hanging="360"/>
+      </w:pPr>
+      <w:rPr>
+        <w:rFonts w:ascii="Symbol" w:hAnsi="Symbol" w:hint="default"/>
+      </w:rPr>
+    </w:lvl>
+    <w:lvl w:ilvl="4" w:tplc="04090003" w:tentative="1">
+      <w:start w:val="1"/>
+      <w:numFmt w:val="bullet"/>
+      <w:lvlText w:val="o"/>
+      <w:lvlJc w:val="left"/>
+      <w:pPr>
+        <w:ind w:left="3600" w:hanging="360"/>
+      </w:pPr>
+      <w:rPr>
+        <w:rFonts w:ascii="Courier New" w:hAnsi="Courier New" w:cs="Courier New" w:hint="default"/>
+      </w:rPr>
+    </w:lvl>
+    <w:lvl w:ilvl="5" w:tplc="04090005" w:tentative="1">
+      <w:start w:val="1"/>
+      <w:numFmt w:val="bullet"/>
+      <w:lvlText w:val=""/>
+      <w:lvlJc w:val="left"/>
+      <w:pPr>
+        <w:ind w:left="4320" w:hanging="360"/>
+      </w:pPr>
+      <w:rPr>
+        <w:rFonts w:ascii="Wingdings" w:hAnsi="Wingdings" w:hint="default"/>
+      </w:rPr>
+    </w:lvl>
+    <w:lvl w:ilvl="6" w:tplc="04090001" w:tentative="1">
+      <w:start w:val="1"/>
+      <w:numFmt w:val="bullet"/>
+      <w:lvlText w:val=""/>
+      <w:lvlJc w:val="left"/>
+      <w:pPr>
+        <w:ind w:left="5040" w:hanging="360"/>
+      </w:pPr>
+      <w:rPr>
+        <w:rFonts w:ascii="Symbol" w:hAnsi="Symbol" w:hint="default"/>
+      </w:rPr>
+    </w:lvl>
+    <w:lvl w:ilvl="7" w:tplc="04090003" w:tentative="1">
+      <w:start w:val="1"/>
+      <w:numFmt w:val="bullet"/>
+      <w:lvlText w:val="o"/>
+      <w:lvlJc w:val="left"/>
+      <w:pPr>
+        <w:ind w:left="5760" w:hanging="360"/>
+      </w:pPr>
+      <w:rPr>
+        <w:rFonts w:ascii="Courier New" w:hAnsi="Courier New" w:cs="Courier New" w:hint="default"/>
+      </w:rPr>
+    </w:lvl>
+    <w:lvl w:ilvl="8" w:tplc="04090005" w:tentative="1">
+      <w:start w:val="1"/>
+      <w:numFmt w:val="bullet"/>
+      <w:lvlText w:val=""/>
+      <w:lvlJc w:val="left"/>
+      <w:pPr>
+        <w:ind w:left="6480" w:hanging="360"/>
+      </w:pPr>
+      <w:rPr>
+        <w:rFonts w:ascii="Wingdings" w:hAnsi="Wingdings" w:hint="default"/>
+      </w:rPr>
+    </w:lvl>
+  </w:abstractNum>
+  <w:num w:numId="1" w16cid:durableId="1028991065">
+    <w:abstractNumId w:val="0"/>
+  </w:num>
+</w:numbering>
 </file>
 
 <file path=word/styles.xml><?xml version="1.0" encoding="utf-8"?>
@@ -2201,7 +2388,7 @@
         <w:kern w:val="2"/>
         <w:sz w:val="24"/>
         <w:szCs w:val="24"/>
-        <w:lang w:eastAsia="en-US" w:bidi="ar-SA"/>
+        <w:lang w:val="en-US" w:eastAsia="en-US" w:bidi="ar-SA"/>
         <w14:ligatures w14:val="standardContextual"/>
       </w:rPr>
     </w:rPrDefault>

</xml_diff>

<commit_message>
fix(docx): handle inline formulas in list items (#3304)
* fix(docx) Handle inline formulas in list items

Fixes issue where inline formulas in list items were ignored during conversion.
Added helper methods to eliminate code duplication.
Updated test data with list items containing inline equations.

Signed-off-by: Cesar Berrospi Ramis <ceb@zurich.ibm.com>

* fix(docx): collect element refs in _add_inline_equations_to_parent

Signed-off-by: Cesar Berrospi Ramis <ceb@zurich.ibm.com>

---------

Signed-off-by: Cesar Berrospi Ramis <ceb@zurich.ibm.com>
Signed-off-by: OrbisAI Security <mediratta01.pally@gmail.com>
</commit_message>
<xml_diff>
--- a/tests/data/docx/equations.docx
+++ b/tests/data/docx/equations.docx
@@ -6,34 +6,23 @@
       <w:pPr>
         <w:rPr>
           <w:rFonts w:eastAsiaTheme="minorEastAsia"/>
-          <w:lang w:val="en-US"/>
         </w:rPr>
       </w:pPr>
       <w:r>
-        <w:rPr>
-          <w:lang w:val="en-US"/>
-        </w:rPr>
         <w:t xml:space="preserve">This is a word </w:t>
       </w:r>
       <w:proofErr w:type="gramStart"/>
       <w:r>
-        <w:rPr>
-          <w:lang w:val="en-US"/>
-        </w:rPr>
         <w:t>document</w:t>
       </w:r>
       <w:proofErr w:type="gramEnd"/>
       <w:r>
-        <w:rPr>
-          <w:lang w:val="en-US"/>
-        </w:rPr>
         <w:t xml:space="preserve"> and this is an inline equation: </w:t>
       </w:r>
       <m:oMath>
         <m:r>
           <w:rPr>
             <w:rFonts w:ascii="Cambria Math" w:hAnsi="Cambria Math"/>
-            <w:lang w:val="en-US"/>
           </w:rPr>
           <m:t>A=π</m:t>
         </m:r>
@@ -42,7 +31,6 @@
             <m:ctrlPr>
               <w:rPr>
                 <w:rFonts w:ascii="Cambria Math" w:hAnsi="Cambria Math"/>
-                <w:lang w:val="en-US"/>
               </w:rPr>
             </m:ctrlPr>
           </m:sSupPr>
@@ -50,7 +38,6 @@
             <m:r>
               <w:rPr>
                 <w:rFonts w:ascii="Cambria Math" w:hAnsi="Cambria Math"/>
-                <w:lang w:val="en-US"/>
               </w:rPr>
               <m:t>r</m:t>
             </m:r>
@@ -59,7 +46,6 @@
             <m:r>
               <w:rPr>
                 <w:rFonts w:ascii="Cambria Math" w:hAnsi="Cambria Math"/>
-                <w:lang w:val="en-US"/>
               </w:rPr>
               <m:t>2</m:t>
             </m:r>
@@ -68,7 +54,6 @@
         <m:r>
           <w:rPr>
             <w:rFonts w:ascii="Cambria Math" w:hAnsi="Cambria Math"/>
-            <w:lang w:val="en-US"/>
           </w:rPr>
           <m:t xml:space="preserve"> </m:t>
         </m:r>
@@ -76,24 +61,287 @@
       <w:r>
         <w:rPr>
           <w:rFonts w:eastAsiaTheme="minorEastAsia"/>
-          <w:lang w:val="en-US"/>
-        </w:rPr>
-        <w:t>. If instead, I want an equation by line, I can do this:</w:t>
+        </w:rPr>
+        <w:t>.</w:t>
       </w:r>
     </w:p>
     <w:p>
       <w:pPr>
-        <w:rPr>
-          <w:rFonts w:eastAsiaTheme="minorEastAsia"/>
-          <w:lang w:val="en-US"/>
-        </w:rPr>
-      </w:pPr>
-    </w:p>
-    <w:p>
-      <w:pPr>
-        <w:rPr>
-          <w:rFonts w:eastAsiaTheme="minorEastAsia"/>
-          <w:lang w:val="en-US"/>
+        <w:pStyle w:val="ListParagraph"/>
+        <w:numPr>
+          <w:ilvl w:val="0"/>
+          <w:numId w:val="1"/>
+        </w:numPr>
+        <w:rPr>
+          <w:rFonts w:eastAsiaTheme="minorEastAsia"/>
+        </w:rPr>
+      </w:pPr>
+      <w:r>
+        <w:rPr>
+          <w:rFonts w:eastAsiaTheme="minorEastAsia"/>
+        </w:rPr>
+        <w:t xml:space="preserve">First item with inline equation: </w:t>
+      </w:r>
+      <m:oMath>
+        <m:r>
+          <w:rPr>
+            <w:rFonts w:ascii="Cambria Math" w:hAnsi="Cambria Math"/>
+          </w:rPr>
+          <m:t>A=π</m:t>
+        </m:r>
+        <m:sSup>
+          <m:sSupPr>
+            <m:ctrlPr>
+              <w:rPr>
+                <w:rFonts w:ascii="Cambria Math" w:hAnsi="Cambria Math"/>
+              </w:rPr>
+            </m:ctrlPr>
+          </m:sSupPr>
+          <m:e>
+            <m:r>
+              <w:rPr>
+                <w:rFonts w:ascii="Cambria Math" w:hAnsi="Cambria Math"/>
+              </w:rPr>
+              <m:t>r</m:t>
+            </m:r>
+          </m:e>
+          <m:sup>
+            <m:r>
+              <w:rPr>
+                <w:rFonts w:ascii="Cambria Math" w:hAnsi="Cambria Math"/>
+              </w:rPr>
+              <m:t>2</m:t>
+            </m:r>
+          </m:sup>
+        </m:sSup>
+      </m:oMath>
+      <w:r>
+        <w:rPr>
+          <w:rFonts w:eastAsiaTheme="minorEastAsia"/>
+        </w:rPr>
+        <w:t xml:space="preserve"> is the area formula.</w:t>
+      </w:r>
+    </w:p>
+    <w:p>
+      <w:pPr>
+        <w:pStyle w:val="ListParagraph"/>
+        <w:numPr>
+          <w:ilvl w:val="0"/>
+          <w:numId w:val="1"/>
+        </w:numPr>
+        <w:rPr>
+          <w:rFonts w:eastAsiaTheme="minorEastAsia"/>
+        </w:rPr>
+      </w:pPr>
+      <w:r>
+        <w:rPr>
+          <w:rFonts w:eastAsiaTheme="minorEastAsia"/>
+        </w:rPr>
+        <w:t xml:space="preserve">Second item with equations: </w:t>
+      </w:r>
+      <m:oMath>
+        <m:r>
+          <w:rPr>
+            <w:rFonts w:ascii="Cambria Math" w:eastAsiaTheme="minorEastAsia" w:hAnsi="Cambria Math"/>
+          </w:rPr>
+          <m:t>E</m:t>
+        </m:r>
+        <m:r>
+          <w:rPr>
+            <w:rFonts w:ascii="Cambria Math" w:eastAsiaTheme="minorEastAsia" w:hAnsi="Cambria Math"/>
+          </w:rPr>
+          <m:t>=</m:t>
+        </m:r>
+        <m:r>
+          <w:rPr>
+            <w:rFonts w:ascii="Cambria Math" w:eastAsiaTheme="minorEastAsia" w:hAnsi="Cambria Math"/>
+          </w:rPr>
+          <m:t>m</m:t>
+        </m:r>
+        <m:sSup>
+          <m:sSupPr>
+            <m:ctrlPr>
+              <w:rPr>
+                <w:rFonts w:ascii="Cambria Math" w:eastAsiaTheme="minorEastAsia" w:hAnsi="Cambria Math"/>
+              </w:rPr>
+            </m:ctrlPr>
+          </m:sSupPr>
+          <m:e>
+            <m:r>
+              <w:rPr>
+                <w:rFonts w:ascii="Cambria Math" w:eastAsiaTheme="minorEastAsia" w:hAnsi="Cambria Math"/>
+              </w:rPr>
+              <m:t>c</m:t>
+            </m:r>
+          </m:e>
+          <m:sup>
+            <m:r>
+              <w:rPr>
+                <w:rFonts w:ascii="Cambria Math" w:eastAsiaTheme="minorEastAsia" w:hAnsi="Cambria Math"/>
+              </w:rPr>
+              <m:t>2</m:t>
+            </m:r>
+          </m:sup>
+        </m:sSup>
+      </m:oMath>
+      <w:r>
+        <w:rPr>
+          <w:rFonts w:eastAsiaTheme="minorEastAsia"/>
+        </w:rPr>
+        <w:t xml:space="preserve"> and </w:t>
+      </w:r>
+      <m:oMath>
+        <m:r>
+          <w:rPr>
+            <w:rFonts w:ascii="Cambria Math" w:eastAsiaTheme="minorEastAsia" w:hAnsi="Cambria Math"/>
+          </w:rPr>
+          <m:t>F=ma</m:t>
+        </m:r>
+      </m:oMath>
+      <w:r>
+        <w:rPr>
+          <w:rFonts w:eastAsiaTheme="minorEastAsia"/>
+        </w:rPr>
+        <w:t xml:space="preserve"> are physics formulas.</w:t>
+      </w:r>
+    </w:p>
+    <w:p>
+      <w:pPr>
+        <w:pStyle w:val="ListParagraph"/>
+        <w:numPr>
+          <w:ilvl w:val="0"/>
+          <w:numId w:val="1"/>
+        </w:numPr>
+        <w:rPr>
+          <w:rFonts w:eastAsiaTheme="minorEastAsia"/>
+        </w:rPr>
+      </w:pPr>
+      <w:r>
+        <w:rPr>
+          <w:rFonts w:eastAsiaTheme="minorEastAsia"/>
+        </w:rPr>
+        <w:t xml:space="preserve">The formula </w:t>
+      </w:r>
+      <m:oMath>
+        <m:sSup>
+          <m:sSupPr>
+            <m:ctrlPr>
+              <w:rPr>
+                <w:rFonts w:ascii="Cambria Math" w:eastAsiaTheme="minorEastAsia" w:hAnsi="Cambria Math"/>
+              </w:rPr>
+            </m:ctrlPr>
+          </m:sSupPr>
+          <m:e>
+            <m:r>
+              <w:rPr>
+                <w:rFonts w:ascii="Cambria Math" w:eastAsiaTheme="minorEastAsia" w:hAnsi="Cambria Math"/>
+              </w:rPr>
+              <m:t>a</m:t>
+            </m:r>
+          </m:e>
+          <m:sup>
+            <m:r>
+              <w:rPr>
+                <w:rFonts w:ascii="Cambria Math" w:eastAsiaTheme="minorEastAsia" w:hAnsi="Cambria Math"/>
+              </w:rPr>
+              <m:t>2</m:t>
+            </m:r>
+          </m:sup>
+        </m:sSup>
+        <m:r>
+          <w:rPr>
+            <w:rFonts w:ascii="Cambria Math" w:eastAsiaTheme="minorEastAsia" w:hAnsi="Cambria Math"/>
+          </w:rPr>
+          <m:t>+</m:t>
+        </m:r>
+        <m:sSup>
+          <m:sSupPr>
+            <m:ctrlPr>
+              <w:rPr>
+                <w:rFonts w:ascii="Cambria Math" w:eastAsiaTheme="minorEastAsia" w:hAnsi="Cambria Math"/>
+              </w:rPr>
+            </m:ctrlPr>
+          </m:sSupPr>
+          <m:e>
+            <m:r>
+              <w:rPr>
+                <w:rFonts w:ascii="Cambria Math" w:eastAsiaTheme="minorEastAsia" w:hAnsi="Cambria Math"/>
+              </w:rPr>
+              <m:t>b</m:t>
+            </m:r>
+          </m:e>
+          <m:sup>
+            <m:r>
+              <w:rPr>
+                <w:rFonts w:ascii="Cambria Math" w:eastAsiaTheme="minorEastAsia" w:hAnsi="Cambria Math"/>
+              </w:rPr>
+              <m:t>2</m:t>
+            </m:r>
+          </m:sup>
+        </m:sSup>
+        <m:r>
+          <w:rPr>
+            <w:rFonts w:ascii="Cambria Math" w:eastAsiaTheme="minorEastAsia" w:hAnsi="Cambria Math"/>
+          </w:rPr>
+          <m:t>=</m:t>
+        </m:r>
+        <m:sSup>
+          <m:sSupPr>
+            <m:ctrlPr>
+              <w:rPr>
+                <w:rFonts w:ascii="Cambria Math" w:eastAsiaTheme="minorEastAsia" w:hAnsi="Cambria Math"/>
+              </w:rPr>
+            </m:ctrlPr>
+          </m:sSupPr>
+          <m:e>
+            <m:r>
+              <w:rPr>
+                <w:rFonts w:ascii="Cambria Math" w:eastAsiaTheme="minorEastAsia" w:hAnsi="Cambria Math"/>
+              </w:rPr>
+              <m:t>c</m:t>
+            </m:r>
+          </m:e>
+          <m:sup>
+            <m:r>
+              <w:rPr>
+                <w:rFonts w:ascii="Cambria Math" w:eastAsiaTheme="minorEastAsia" w:hAnsi="Cambria Math"/>
+              </w:rPr>
+              <m:t>2</m:t>
+            </m:r>
+          </m:sup>
+        </m:sSup>
+      </m:oMath>
+      <w:r>
+        <w:rPr>
+          <w:rFonts w:eastAsiaTheme="minorEastAsia"/>
+        </w:rPr>
+        <w:t xml:space="preserve"> is the Pythagorean theorem.</w:t>
+      </w:r>
+    </w:p>
+    <w:p>
+      <w:pPr>
+        <w:rPr>
+          <w:rFonts w:eastAsiaTheme="minorEastAsia"/>
+        </w:rPr>
+      </w:pPr>
+      <w:r>
+        <w:rPr>
+          <w:rFonts w:eastAsiaTheme="minorEastAsia"/>
+        </w:rPr>
+        <w:t>If instead, I want an equation by line, I can do this:</w:t>
+      </w:r>
+    </w:p>
+    <w:p>
+      <w:pPr>
+        <w:rPr>
+          <w:rFonts w:eastAsiaTheme="minorEastAsia"/>
+        </w:rPr>
+      </w:pPr>
+    </w:p>
+    <w:p>
+      <w:pPr>
+        <w:rPr>
+          <w:rFonts w:eastAsiaTheme="minorEastAsia"/>
         </w:rPr>
       </w:pPr>
       <m:oMathPara>
@@ -105,7 +353,6 @@
                 <w:rPr>
                   <w:rFonts w:ascii="Cambria Math" w:eastAsiaTheme="minorEastAsia" w:hAnsi="Cambria Math"/>
                   <w:i/>
-                  <w:lang w:val="en-US"/>
                 </w:rPr>
               </m:ctrlPr>
             </m:eqArrPr>
@@ -115,7 +362,6 @@
                   <m:ctrlPr>
                     <w:rPr>
                       <w:rFonts w:ascii="Cambria Math" w:eastAsiaTheme="minorEastAsia" w:hAnsi="Cambria Math"/>
-                      <w:lang w:val="en-US"/>
                     </w:rPr>
                   </m:ctrlPr>
                 </m:sSupPr>
@@ -123,7 +369,6 @@
                   <m:r>
                     <w:rPr>
                       <w:rFonts w:ascii="Cambria Math" w:eastAsiaTheme="minorEastAsia" w:hAnsi="Cambria Math"/>
-                      <w:lang w:val="en-US"/>
                     </w:rPr>
                     <m:t>a</m:t>
                   </m:r>
@@ -131,7 +376,6 @@
                     <w:rPr>
                       <w:rFonts w:ascii="Cambria Math" w:eastAsiaTheme="minorEastAsia" w:hAnsi="Cambria Math"/>
                       <w:i/>
-                      <w:lang w:val="en-US"/>
                     </w:rPr>
                   </m:ctrlPr>
                 </m:e>
@@ -139,7 +383,6 @@
                   <m:r>
                     <w:rPr>
                       <w:rFonts w:ascii="Cambria Math" w:eastAsiaTheme="minorEastAsia" w:hAnsi="Cambria Math"/>
-                      <w:lang w:val="en-US"/>
                     </w:rPr>
                     <m:t>2</m:t>
                   </m:r>
@@ -148,7 +391,6 @@
               <m:r>
                 <w:rPr>
                   <w:rFonts w:ascii="Cambria Math" w:eastAsiaTheme="minorEastAsia" w:hAnsi="Cambria Math"/>
-                  <w:lang w:val="en-US"/>
                 </w:rPr>
                 <m:t>+</m:t>
               </m:r>
@@ -157,7 +399,6 @@
                   <m:ctrlPr>
                     <w:rPr>
                       <w:rFonts w:ascii="Cambria Math" w:eastAsiaTheme="minorEastAsia" w:hAnsi="Cambria Math"/>
-                      <w:lang w:val="en-US"/>
                     </w:rPr>
                   </m:ctrlPr>
                 </m:sSupPr>
@@ -165,7 +406,6 @@
                   <m:r>
                     <w:rPr>
                       <w:rFonts w:ascii="Cambria Math" w:eastAsiaTheme="minorEastAsia" w:hAnsi="Cambria Math"/>
-                      <w:lang w:val="en-US"/>
                     </w:rPr>
                     <m:t>b</m:t>
                   </m:r>
@@ -173,7 +413,6 @@
                     <w:rPr>
                       <w:rFonts w:ascii="Cambria Math" w:eastAsiaTheme="minorEastAsia" w:hAnsi="Cambria Math"/>
                       <w:i/>
-                      <w:lang w:val="en-US"/>
                     </w:rPr>
                   </m:ctrlPr>
                 </m:e>
@@ -181,7 +420,6 @@
                   <m:r>
                     <w:rPr>
                       <w:rFonts w:ascii="Cambria Math" w:eastAsiaTheme="minorEastAsia" w:hAnsi="Cambria Math"/>
-                      <w:lang w:val="en-US"/>
                     </w:rPr>
                     <m:t>2</m:t>
                   </m:r>
@@ -190,7 +428,6 @@
               <m:r>
                 <w:rPr>
                   <w:rFonts w:ascii="Cambria Math" w:eastAsiaTheme="minorEastAsia" w:hAnsi="Cambria Math"/>
-                  <w:lang w:val="en-US"/>
                 </w:rPr>
                 <m:t>=</m:t>
               </m:r>
@@ -199,7 +436,6 @@
                   <m:ctrlPr>
                     <w:rPr>
                       <w:rFonts w:ascii="Cambria Math" w:eastAsiaTheme="minorEastAsia" w:hAnsi="Cambria Math"/>
-                      <w:lang w:val="en-US"/>
                     </w:rPr>
                   </m:ctrlPr>
                 </m:sSupPr>
@@ -207,7 +443,6 @@
                   <m:r>
                     <w:rPr>
                       <w:rFonts w:ascii="Cambria Math" w:eastAsiaTheme="minorEastAsia" w:hAnsi="Cambria Math"/>
-                      <w:lang w:val="en-US"/>
                     </w:rPr>
                     <m:t>c</m:t>
                   </m:r>
@@ -215,7 +450,6 @@
                     <w:rPr>
                       <w:rFonts w:ascii="Cambria Math" w:eastAsiaTheme="minorEastAsia" w:hAnsi="Cambria Math"/>
                       <w:i/>
-                      <w:lang w:val="en-US"/>
                     </w:rPr>
                   </m:ctrlPr>
                 </m:e>
@@ -223,7 +457,6 @@
                   <m:r>
                     <w:rPr>
                       <w:rFonts w:ascii="Cambria Math" w:eastAsiaTheme="minorEastAsia" w:hAnsi="Cambria Math"/>
-                      <w:lang w:val="en-US"/>
                     </w:rPr>
                     <m:t>2</m:t>
                   </m:r>
@@ -232,7 +465,6 @@
               <m:r>
                 <w:rPr>
                   <w:rFonts w:ascii="Cambria Math" w:eastAsiaTheme="minorEastAsia" w:hAnsi="Cambria Math"/>
-                  <w:lang w:val="en-US"/>
                 </w:rPr>
                 <m:t xml:space="preserve"> × 23</m:t>
               </m:r>
@@ -245,13 +477,11 @@
       <w:pPr>
         <w:rPr>
           <w:rFonts w:eastAsiaTheme="minorEastAsia"/>
-          <w:lang w:val="en-US"/>
         </w:rPr>
       </w:pPr>
       <w:r>
         <w:rPr>
           <w:rFonts w:eastAsiaTheme="minorEastAsia"/>
-          <w:lang w:val="en-US"/>
         </w:rPr>
         <w:t>And that is an equation by itself. Cheers!</w:t>
       </w:r>
@@ -260,21 +490,18 @@
       <w:pPr>
         <w:rPr>
           <w:rFonts w:eastAsiaTheme="minorEastAsia"/>
-          <w:lang w:val="en-US"/>
-        </w:rPr>
-      </w:pPr>
-    </w:p>
-    <w:p>
-      <w:pPr>
-        <w:rPr>
-          <w:rFonts w:eastAsiaTheme="minorEastAsia"/>
-          <w:lang w:val="en-US"/>
+        </w:rPr>
+      </w:pPr>
+    </w:p>
+    <w:p>
+      <w:pPr>
+        <w:rPr>
+          <w:rFonts w:eastAsiaTheme="minorEastAsia"/>
         </w:rPr>
       </w:pPr>
       <w:r>
         <w:rPr>
           <w:rFonts w:eastAsiaTheme="minorEastAsia"/>
-          <w:lang w:val="en-US"/>
         </w:rPr>
         <w:t>This is another equation:</w:t>
       </w:r>
@@ -283,7 +510,6 @@
       <w:pPr>
         <w:rPr>
           <w:rFonts w:eastAsiaTheme="minorEastAsia"/>
-          <w:lang w:val="en-US"/>
         </w:rPr>
       </w:pPr>
       <m:oMathPara>
@@ -295,7 +521,6 @@
                 <w:rPr>
                   <w:rFonts w:ascii="Cambria Math" w:eastAsiaTheme="minorEastAsia" w:hAnsi="Cambria Math"/>
                   <w:i/>
-                  <w:lang w:val="en-US"/>
                 </w:rPr>
               </m:ctrlPr>
             </m:eqArrPr>
@@ -303,7 +528,6 @@
               <m:r>
                 <w:rPr>
                   <w:rFonts w:ascii="Cambria Math" w:eastAsiaTheme="minorEastAsia" w:hAnsi="Cambria Math"/>
-                  <w:lang w:val="en-US"/>
                 </w:rPr>
                 <m:t>f</m:t>
               </m:r>
@@ -312,7 +536,6 @@
                   <m:ctrlPr>
                     <w:rPr>
                       <w:rFonts w:ascii="Cambria Math" w:eastAsiaTheme="minorEastAsia" w:hAnsi="Cambria Math"/>
-                      <w:lang w:val="en-US"/>
                     </w:rPr>
                   </m:ctrlPr>
                 </m:dPr>
@@ -320,7 +543,6 @@
                   <m:r>
                     <w:rPr>
                       <w:rFonts w:ascii="Cambria Math" w:eastAsiaTheme="minorEastAsia" w:hAnsi="Cambria Math"/>
-                      <w:lang w:val="en-US"/>
                     </w:rPr>
                     <m:t>x</m:t>
                   </m:r>
@@ -329,7 +551,6 @@
               <m:r>
                 <w:rPr>
                   <w:rFonts w:ascii="Cambria Math" w:eastAsiaTheme="minorEastAsia" w:hAnsi="Cambria Math"/>
-                  <w:lang w:val="en-US"/>
                 </w:rPr>
                 <m:t>=</m:t>
               </m:r>
@@ -338,7 +559,6 @@
                   <m:ctrlPr>
                     <w:rPr>
                       <w:rFonts w:ascii="Cambria Math" w:eastAsiaTheme="minorEastAsia" w:hAnsi="Cambria Math"/>
-                      <w:lang w:val="en-US"/>
                     </w:rPr>
                   </m:ctrlPr>
                 </m:sSubPr>
@@ -346,7 +566,6 @@
                   <m:r>
                     <w:rPr>
                       <w:rFonts w:ascii="Cambria Math" w:eastAsiaTheme="minorEastAsia" w:hAnsi="Cambria Math"/>
-                      <w:lang w:val="en-US"/>
                     </w:rPr>
                     <m:t>a</m:t>
                   </m:r>
@@ -355,7 +574,6 @@
                   <m:r>
                     <w:rPr>
                       <w:rFonts w:ascii="Cambria Math" w:eastAsiaTheme="minorEastAsia" w:hAnsi="Cambria Math"/>
-                      <w:lang w:val="en-US"/>
                     </w:rPr>
                     <m:t>0</m:t>
                   </m:r>
@@ -364,7 +582,6 @@
               <m:r>
                 <w:rPr>
                   <w:rFonts w:ascii="Cambria Math" w:eastAsiaTheme="minorEastAsia" w:hAnsi="Cambria Math"/>
-                  <w:lang w:val="en-US"/>
                 </w:rPr>
                 <m:t>+</m:t>
               </m:r>
@@ -375,7 +592,6 @@
                   <m:ctrlPr>
                     <w:rPr>
                       <w:rFonts w:ascii="Cambria Math" w:eastAsiaTheme="minorEastAsia" w:hAnsi="Cambria Math"/>
-                      <w:lang w:val="en-US"/>
                     </w:rPr>
                   </m:ctrlPr>
                 </m:naryPr>
@@ -383,7 +599,6 @@
                   <m:r>
                     <w:rPr>
                       <w:rFonts w:ascii="Cambria Math" w:eastAsiaTheme="minorEastAsia" w:hAnsi="Cambria Math"/>
-                      <w:lang w:val="en-US"/>
                     </w:rPr>
                     <m:t>n=1</m:t>
                   </m:r>
@@ -392,7 +607,6 @@
                   <m:r>
                     <w:rPr>
                       <w:rFonts w:ascii="Cambria Math" w:eastAsiaTheme="minorEastAsia" w:hAnsi="Cambria Math"/>
-                      <w:lang w:val="en-US"/>
                     </w:rPr>
                     <m:t>∞</m:t>
                   </m:r>
@@ -403,7 +617,6 @@
                       <m:ctrlPr>
                         <w:rPr>
                           <w:rFonts w:ascii="Cambria Math" w:eastAsiaTheme="minorEastAsia" w:hAnsi="Cambria Math"/>
-                          <w:lang w:val="en-US"/>
                         </w:rPr>
                       </m:ctrlPr>
                     </m:dPr>
@@ -413,7 +626,6 @@
                           <m:ctrlPr>
                             <w:rPr>
                               <w:rFonts w:ascii="Cambria Math" w:eastAsiaTheme="minorEastAsia" w:hAnsi="Cambria Math"/>
-                              <w:lang w:val="en-US"/>
                             </w:rPr>
                           </m:ctrlPr>
                         </m:sSubPr>
@@ -421,7 +633,6 @@
                           <m:r>
                             <w:rPr>
                               <w:rFonts w:ascii="Cambria Math" w:eastAsia="Cambria Math" w:hAnsi="Cambria Math" w:cs="Cambria Math"/>
-                              <w:lang w:val="en-US"/>
                             </w:rPr>
                             <m:t>a</m:t>
                           </m:r>
@@ -430,7 +641,6 @@
                           <m:r>
                             <w:rPr>
                               <w:rFonts w:ascii="Cambria Math" w:eastAsia="Cambria Math" w:hAnsi="Cambria Math" w:cs="Cambria Math"/>
-                              <w:lang w:val="en-US"/>
                             </w:rPr>
                             <m:t>n</m:t>
                           </m:r>
@@ -441,7 +651,6 @@
                           <m:ctrlPr>
                             <w:rPr>
                               <w:rFonts w:ascii="Cambria Math" w:eastAsiaTheme="minorEastAsia" w:hAnsi="Cambria Math"/>
-                              <w:lang w:val="en-US"/>
                             </w:rPr>
                           </m:ctrlPr>
                         </m:funcPr>
@@ -452,7 +661,6 @@
                             </m:rPr>
                             <w:rPr>
                               <w:rFonts w:ascii="Cambria Math" w:eastAsia="Cambria Math" w:hAnsi="Cambria Math" w:cs="Cambria Math"/>
-                              <w:lang w:val="en-US"/>
                             </w:rPr>
                             <m:t>cos</m:t>
                           </m:r>
@@ -463,7 +671,6 @@
                               <m:ctrlPr>
                                 <w:rPr>
                                   <w:rFonts w:ascii="Cambria Math" w:eastAsiaTheme="minorEastAsia" w:hAnsi="Cambria Math"/>
-                                  <w:lang w:val="en-US"/>
                                 </w:rPr>
                               </m:ctrlPr>
                             </m:fPr>
@@ -471,7 +678,6 @@
                               <m:r>
                                 <w:rPr>
                                   <w:rFonts w:ascii="Cambria Math" w:eastAsia="Cambria Math" w:hAnsi="Cambria Math" w:cs="Cambria Math"/>
-                                  <w:lang w:val="en-US"/>
                                 </w:rPr>
                                 <m:t>nπx</m:t>
                               </m:r>
@@ -480,7 +686,6 @@
                               <m:r>
                                 <w:rPr>
                                   <w:rFonts w:ascii="Cambria Math" w:eastAsia="Cambria Math" w:hAnsi="Cambria Math" w:cs="Cambria Math"/>
-                                  <w:lang w:val="en-US"/>
                                 </w:rPr>
                                 <m:t>L</m:t>
                               </m:r>
@@ -491,7 +696,6 @@
                       <m:r>
                         <w:rPr>
                           <w:rFonts w:ascii="Cambria Math" w:eastAsia="Cambria Math" w:hAnsi="Cambria Math" w:cs="Cambria Math"/>
-                          <w:lang w:val="en-US"/>
                         </w:rPr>
                         <m:t>+</m:t>
                       </m:r>
@@ -500,7 +704,6 @@
                           <m:ctrlPr>
                             <w:rPr>
                               <w:rFonts w:ascii="Cambria Math" w:eastAsiaTheme="minorEastAsia" w:hAnsi="Cambria Math"/>
-                              <w:lang w:val="en-US"/>
                             </w:rPr>
                           </m:ctrlPr>
                         </m:sSubPr>
@@ -508,7 +711,6 @@
                           <m:r>
                             <w:rPr>
                               <w:rFonts w:ascii="Cambria Math" w:eastAsia="Cambria Math" w:hAnsi="Cambria Math" w:cs="Cambria Math"/>
-                              <w:lang w:val="en-US"/>
                             </w:rPr>
                             <m:t>b</m:t>
                           </m:r>
@@ -517,7 +719,6 @@
                           <m:r>
                             <w:rPr>
                               <w:rFonts w:ascii="Cambria Math" w:eastAsia="Cambria Math" w:hAnsi="Cambria Math" w:cs="Cambria Math"/>
-                              <w:lang w:val="en-US"/>
                             </w:rPr>
                             <m:t>n</m:t>
                           </m:r>
@@ -528,7 +729,6 @@
                           <m:ctrlPr>
                             <w:rPr>
                               <w:rFonts w:ascii="Cambria Math" w:eastAsiaTheme="minorEastAsia" w:hAnsi="Cambria Math"/>
-                              <w:lang w:val="en-US"/>
                             </w:rPr>
                           </m:ctrlPr>
                         </m:funcPr>
@@ -539,7 +739,6 @@
                             </m:rPr>
                             <w:rPr>
                               <w:rFonts w:ascii="Cambria Math" w:eastAsia="Cambria Math" w:hAnsi="Cambria Math" w:cs="Cambria Math"/>
-                              <w:lang w:val="en-US"/>
                             </w:rPr>
                             <m:t>sin</m:t>
                           </m:r>
@@ -550,7 +749,6 @@
                               <m:ctrlPr>
                                 <w:rPr>
                                   <w:rFonts w:ascii="Cambria Math" w:eastAsiaTheme="minorEastAsia" w:hAnsi="Cambria Math"/>
-                                  <w:lang w:val="en-US"/>
                                 </w:rPr>
                               </m:ctrlPr>
                             </m:fPr>
@@ -558,7 +756,6 @@
                               <m:r>
                                 <w:rPr>
                                   <w:rFonts w:ascii="Cambria Math" w:eastAsia="Cambria Math" w:hAnsi="Cambria Math" w:cs="Cambria Math"/>
-                                  <w:lang w:val="en-US"/>
                                 </w:rPr>
                                 <m:t>nπx</m:t>
                               </m:r>
@@ -567,7 +764,6 @@
                               <m:r>
                                 <w:rPr>
                                   <w:rFonts w:ascii="Cambria Math" w:eastAsia="Cambria Math" w:hAnsi="Cambria Math" w:cs="Cambria Math"/>
-                                  <w:lang w:val="en-US"/>
                                 </w:rPr>
                                 <m:t>L</m:t>
                               </m:r>
@@ -588,21 +784,18 @@
       <w:pPr>
         <w:rPr>
           <w:rFonts w:eastAsiaTheme="minorEastAsia"/>
-          <w:lang w:val="en-US"/>
-        </w:rPr>
-      </w:pPr>
-    </w:p>
-    <w:p>
-      <w:pPr>
-        <w:rPr>
-          <w:rFonts w:eastAsiaTheme="minorEastAsia"/>
-          <w:lang w:val="en-US"/>
+        </w:rPr>
+      </w:pPr>
+    </w:p>
+    <w:p>
+      <w:pPr>
+        <w:rPr>
+          <w:rFonts w:eastAsiaTheme="minorEastAsia"/>
         </w:rPr>
       </w:pPr>
       <w:r>
         <w:rPr>
           <w:rFonts w:eastAsiaTheme="minorEastAsia"/>
-          <w:lang w:val="en-US"/>
         </w:rPr>
         <w:t xml:space="preserve">This is text. This is text. This is text. This is text. This is text. This is text. This is text. This is text. This is text. This is text. This is text. This is text. This is text. This is text. This is text. This is text. This is text. This is text. This is text. This is text. This is text. This is text. This is text. This is text. This is text. This is text. This is text. This is text. This is text. This is text. This is text. </w:t>
       </w:r>
@@ -611,50 +804,37 @@
       <w:pPr>
         <w:rPr>
           <w:rFonts w:eastAsiaTheme="minorEastAsia"/>
-          <w:lang w:val="en-US"/>
-        </w:rPr>
-      </w:pPr>
-    </w:p>
-    <w:p>
-      <w:pPr>
-        <w:rPr>
-          <w:rFonts w:eastAsiaTheme="minorEastAsia"/>
-          <w:lang w:val="en-US"/>
-        </w:rPr>
-      </w:pPr>
-    </w:p>
-    <w:p>
-      <w:pPr>
-        <w:rPr>
-          <w:rFonts w:eastAsiaTheme="minorEastAsia"/>
-          <w:lang w:val="en-US"/>
+        </w:rPr>
+      </w:pPr>
+    </w:p>
+    <w:p>
+      <w:pPr>
+        <w:rPr>
+          <w:rFonts w:eastAsiaTheme="minorEastAsia"/>
+        </w:rPr>
+      </w:pPr>
+    </w:p>
+    <w:p>
+      <w:pPr>
+        <w:rPr>
+          <w:rFonts w:eastAsiaTheme="minorEastAsia"/>
         </w:rPr>
       </w:pPr>
       <w:r>
-        <w:rPr>
-          <w:lang w:val="en-US"/>
-        </w:rPr>
         <w:t xml:space="preserve">This is a word </w:t>
       </w:r>
       <w:proofErr w:type="gramStart"/>
       <w:r>
-        <w:rPr>
-          <w:lang w:val="en-US"/>
-        </w:rPr>
         <w:t>document</w:t>
       </w:r>
       <w:proofErr w:type="gramEnd"/>
       <w:r>
-        <w:rPr>
-          <w:lang w:val="en-US"/>
-        </w:rPr>
         <w:t xml:space="preserve"> and this is an inline equation: </w:t>
       </w:r>
       <m:oMath>
         <m:r>
           <w:rPr>
             <w:rFonts w:ascii="Cambria Math" w:hAnsi="Cambria Math"/>
-            <w:lang w:val="en-US"/>
           </w:rPr>
           <m:t>A=π</m:t>
         </m:r>
@@ -663,7 +843,6 @@
             <m:ctrlPr>
               <w:rPr>
                 <w:rFonts w:ascii="Cambria Math" w:hAnsi="Cambria Math"/>
-                <w:lang w:val="en-US"/>
               </w:rPr>
             </m:ctrlPr>
           </m:sSupPr>
@@ -671,7 +850,6 @@
             <m:r>
               <w:rPr>
                 <w:rFonts w:ascii="Cambria Math" w:hAnsi="Cambria Math"/>
-                <w:lang w:val="en-US"/>
               </w:rPr>
               <m:t>r</m:t>
             </m:r>
@@ -680,7 +858,6 @@
             <m:r>
               <w:rPr>
                 <w:rFonts w:ascii="Cambria Math" w:hAnsi="Cambria Math"/>
-                <w:lang w:val="en-US"/>
               </w:rPr>
               <m:t>2</m:t>
             </m:r>
@@ -689,7 +866,6 @@
         <m:r>
           <w:rPr>
             <w:rFonts w:ascii="Cambria Math" w:hAnsi="Cambria Math"/>
-            <w:lang w:val="en-US"/>
           </w:rPr>
           <m:t xml:space="preserve"> </m:t>
         </m:r>
@@ -697,7 +873,6 @@
       <w:r>
         <w:rPr>
           <w:rFonts w:eastAsiaTheme="minorEastAsia"/>
-          <w:lang w:val="en-US"/>
         </w:rPr>
         <w:t>. If instead, I want an equation by line, I can do this:</w:t>
       </w:r>
@@ -706,15 +881,13 @@
       <w:pPr>
         <w:rPr>
           <w:rFonts w:eastAsiaTheme="minorEastAsia"/>
-          <w:lang w:val="en-US"/>
-        </w:rPr>
-      </w:pPr>
-    </w:p>
-    <w:p>
-      <w:pPr>
-        <w:rPr>
-          <w:rFonts w:eastAsiaTheme="minorEastAsia"/>
-          <w:lang w:val="en-US"/>
+        </w:rPr>
+      </w:pPr>
+    </w:p>
+    <w:p>
+      <w:pPr>
+        <w:rPr>
+          <w:rFonts w:eastAsiaTheme="minorEastAsia"/>
         </w:rPr>
       </w:pPr>
       <m:oMathPara>
@@ -724,7 +897,6 @@
               <m:ctrlPr>
                 <w:rPr>
                   <w:rFonts w:ascii="Cambria Math" w:eastAsiaTheme="minorEastAsia" w:hAnsi="Cambria Math"/>
-                  <w:lang w:val="en-US"/>
                 </w:rPr>
               </m:ctrlPr>
             </m:sSupPr>
@@ -734,7 +906,6 @@
                   <m:ctrlPr>
                     <w:rPr>
                       <w:rFonts w:ascii="Cambria Math" w:eastAsiaTheme="minorEastAsia" w:hAnsi="Cambria Math"/>
-                      <w:lang w:val="en-US"/>
                     </w:rPr>
                   </m:ctrlPr>
                 </m:dPr>
@@ -742,7 +913,6 @@
                   <m:r>
                     <w:rPr>
                       <w:rFonts w:ascii="Cambria Math" w:eastAsiaTheme="minorEastAsia" w:hAnsi="Cambria Math"/>
-                      <w:lang w:val="en-US"/>
                     </w:rPr>
                     <m:t>x+a</m:t>
                   </m:r>
@@ -753,7 +923,6 @@
               <m:r>
                 <w:rPr>
                   <w:rFonts w:ascii="Cambria Math" w:eastAsiaTheme="minorEastAsia" w:hAnsi="Cambria Math"/>
-                  <w:lang w:val="en-US"/>
                 </w:rPr>
                 <m:t>n</m:t>
               </m:r>
@@ -762,7 +931,6 @@
           <m:r>
             <w:rPr>
               <w:rFonts w:ascii="Cambria Math" w:eastAsia="Cambria Math" w:hAnsi="Cambria Math" w:cs="Cambria Math"/>
-              <w:lang w:val="en-US"/>
             </w:rPr>
             <m:t>=</m:t>
           </m:r>
@@ -773,7 +941,6 @@
               <m:ctrlPr>
                 <w:rPr>
                   <w:rFonts w:ascii="Cambria Math" w:eastAsiaTheme="minorEastAsia" w:hAnsi="Cambria Math"/>
-                  <w:lang w:val="en-US"/>
                 </w:rPr>
               </m:ctrlPr>
             </m:naryPr>
@@ -781,7 +948,6 @@
               <m:r>
                 <w:rPr>
                   <w:rFonts w:ascii="Cambria Math" w:eastAsia="Cambria Math" w:hAnsi="Cambria Math" w:cs="Cambria Math"/>
-                  <w:lang w:val="en-US"/>
                 </w:rPr>
                 <m:t>k=0</m:t>
               </m:r>
@@ -790,7 +956,6 @@
               <m:r>
                 <w:rPr>
                   <w:rFonts w:ascii="Cambria Math" w:eastAsia="Cambria Math" w:hAnsi="Cambria Math" w:cs="Cambria Math"/>
-                  <w:lang w:val="en-US"/>
                 </w:rPr>
                 <m:t>n</m:t>
               </m:r>
@@ -801,7 +966,6 @@
                   <m:ctrlPr>
                     <w:rPr>
                       <w:rFonts w:ascii="Cambria Math" w:eastAsiaTheme="minorEastAsia" w:hAnsi="Cambria Math"/>
-                      <w:lang w:val="en-US"/>
                     </w:rPr>
                   </m:ctrlPr>
                 </m:dPr>
@@ -812,7 +976,6 @@
                       <m:ctrlPr>
                         <w:rPr>
                           <w:rFonts w:ascii="Cambria Math" w:eastAsiaTheme="minorEastAsia" w:hAnsi="Cambria Math"/>
-                          <w:lang w:val="en-US"/>
                         </w:rPr>
                       </m:ctrlPr>
                     </m:fPr>
@@ -820,7 +983,6 @@
                       <m:r>
                         <w:rPr>
                           <w:rFonts w:ascii="Cambria Math" w:eastAsia="Cambria Math" w:hAnsi="Cambria Math" w:cs="Cambria Math"/>
-                          <w:lang w:val="en-US"/>
                         </w:rPr>
                         <m:t>n</m:t>
                       </m:r>
@@ -829,7 +991,6 @@
                       <m:r>
                         <w:rPr>
                           <w:rFonts w:ascii="Cambria Math" w:eastAsia="Cambria Math" w:hAnsi="Cambria Math" w:cs="Cambria Math"/>
-                          <w:lang w:val="en-US"/>
                         </w:rPr>
                         <m:t>k</m:t>
                       </m:r>
@@ -842,7 +1003,6 @@
                   <m:ctrlPr>
                     <w:rPr>
                       <w:rFonts w:ascii="Cambria Math" w:eastAsiaTheme="minorEastAsia" w:hAnsi="Cambria Math"/>
-                      <w:lang w:val="en-US"/>
                     </w:rPr>
                   </m:ctrlPr>
                 </m:sSupPr>
@@ -850,7 +1010,6 @@
                   <m:r>
                     <w:rPr>
                       <w:rFonts w:ascii="Cambria Math" w:eastAsia="Cambria Math" w:hAnsi="Cambria Math" w:cs="Cambria Math"/>
-                      <w:lang w:val="en-US"/>
                     </w:rPr>
                     <m:t>x</m:t>
                   </m:r>
@@ -859,7 +1018,6 @@
                   <m:r>
                     <w:rPr>
                       <w:rFonts w:ascii="Cambria Math" w:eastAsia="Cambria Math" w:hAnsi="Cambria Math" w:cs="Cambria Math"/>
-                      <w:lang w:val="en-US"/>
                     </w:rPr>
                     <m:t>k</m:t>
                   </m:r>
@@ -870,7 +1028,6 @@
                   <m:ctrlPr>
                     <w:rPr>
                       <w:rFonts w:ascii="Cambria Math" w:eastAsiaTheme="minorEastAsia" w:hAnsi="Cambria Math"/>
-                      <w:lang w:val="en-US"/>
                     </w:rPr>
                   </m:ctrlPr>
                 </m:sSupPr>
@@ -878,7 +1035,6 @@
                   <m:r>
                     <w:rPr>
                       <w:rFonts w:ascii="Cambria Math" w:eastAsia="Cambria Math" w:hAnsi="Cambria Math" w:cs="Cambria Math"/>
-                      <w:lang w:val="en-US"/>
                     </w:rPr>
                     <m:t>a</m:t>
                   </m:r>
@@ -887,7 +1043,6 @@
                   <m:r>
                     <w:rPr>
                       <w:rFonts w:ascii="Cambria Math" w:eastAsia="Cambria Math" w:hAnsi="Cambria Math" w:cs="Cambria Math"/>
-                      <w:lang w:val="en-US"/>
                     </w:rPr>
                     <m:t>n-k</m:t>
                   </m:r>
@@ -902,21 +1057,18 @@
       <w:pPr>
         <w:rPr>
           <w:rFonts w:eastAsiaTheme="minorEastAsia"/>
-          <w:lang w:val="en-US"/>
-        </w:rPr>
-      </w:pPr>
-    </w:p>
-    <w:p>
-      <w:pPr>
-        <w:rPr>
-          <w:rFonts w:eastAsiaTheme="minorEastAsia"/>
-          <w:lang w:val="en-US"/>
+        </w:rPr>
+      </w:pPr>
+    </w:p>
+    <w:p>
+      <w:pPr>
+        <w:rPr>
+          <w:rFonts w:eastAsiaTheme="minorEastAsia"/>
         </w:rPr>
       </w:pPr>
       <w:r>
         <w:rPr>
           <w:rFonts w:eastAsiaTheme="minorEastAsia"/>
-          <w:lang w:val="en-US"/>
         </w:rPr>
         <w:t>And that is an equation by itself. Cheers!</w:t>
       </w:r>
@@ -925,21 +1077,18 @@
       <w:pPr>
         <w:rPr>
           <w:rFonts w:eastAsiaTheme="minorEastAsia"/>
-          <w:lang w:val="en-US"/>
-        </w:rPr>
-      </w:pPr>
-    </w:p>
-    <w:p>
-      <w:pPr>
-        <w:rPr>
-          <w:rFonts w:eastAsiaTheme="minorEastAsia"/>
-          <w:lang w:val="en-US"/>
+        </w:rPr>
+      </w:pPr>
+    </w:p>
+    <w:p>
+      <w:pPr>
+        <w:rPr>
+          <w:rFonts w:eastAsiaTheme="minorEastAsia"/>
         </w:rPr>
       </w:pPr>
       <w:r>
         <w:rPr>
           <w:rFonts w:eastAsiaTheme="minorEastAsia"/>
-          <w:lang w:val="en-US"/>
         </w:rPr>
         <w:t>This is another equation:</w:t>
       </w:r>
@@ -948,15 +1097,13 @@
       <w:pPr>
         <w:rPr>
           <w:rFonts w:eastAsiaTheme="minorEastAsia"/>
-          <w:lang w:val="en-US"/>
-        </w:rPr>
-      </w:pPr>
-    </w:p>
-    <w:p>
-      <w:pPr>
-        <w:rPr>
-          <w:rFonts w:eastAsiaTheme="minorEastAsia"/>
-          <w:lang w:val="en-US"/>
+        </w:rPr>
+      </w:pPr>
+    </w:p>
+    <w:p>
+      <w:pPr>
+        <w:rPr>
+          <w:rFonts w:eastAsiaTheme="minorEastAsia"/>
         </w:rPr>
       </w:pPr>
       <m:oMathPara>
@@ -966,7 +1113,6 @@
               <m:ctrlPr>
                 <w:rPr>
                   <w:rFonts w:ascii="Cambria Math" w:eastAsiaTheme="minorEastAsia" w:hAnsi="Cambria Math"/>
-                  <w:lang w:val="en-US"/>
                 </w:rPr>
               </m:ctrlPr>
             </m:sSupPr>
@@ -976,7 +1122,6 @@
                   <m:ctrlPr>
                     <w:rPr>
                       <w:rFonts w:ascii="Cambria Math" w:eastAsiaTheme="minorEastAsia" w:hAnsi="Cambria Math"/>
-                      <w:lang w:val="en-US"/>
                     </w:rPr>
                   </m:ctrlPr>
                 </m:dPr>
@@ -984,7 +1129,6 @@
                   <m:r>
                     <w:rPr>
                       <w:rFonts w:ascii="Cambria Math" w:eastAsiaTheme="minorEastAsia" w:hAnsi="Cambria Math"/>
-                      <w:lang w:val="en-US"/>
                     </w:rPr>
                     <m:t>1+x</m:t>
                   </m:r>
@@ -995,7 +1139,6 @@
               <m:r>
                 <w:rPr>
                   <w:rFonts w:ascii="Cambria Math" w:eastAsiaTheme="minorEastAsia" w:hAnsi="Cambria Math"/>
-                  <w:lang w:val="en-US"/>
                 </w:rPr>
                 <m:t>n</m:t>
               </m:r>
@@ -1004,7 +1147,6 @@
           <m:r>
             <w:rPr>
               <w:rFonts w:ascii="Cambria Math" w:eastAsiaTheme="minorEastAsia" w:hAnsi="Cambria Math"/>
-              <w:lang w:val="en-US"/>
             </w:rPr>
             <m:t>=1+</m:t>
           </m:r>
@@ -1013,7 +1155,6 @@
               <m:ctrlPr>
                 <w:rPr>
                   <w:rFonts w:ascii="Cambria Math" w:eastAsiaTheme="minorEastAsia" w:hAnsi="Cambria Math"/>
-                  <w:lang w:val="en-US"/>
                 </w:rPr>
               </m:ctrlPr>
             </m:fPr>
@@ -1021,7 +1162,6 @@
               <m:r>
                 <w:rPr>
                   <w:rFonts w:ascii="Cambria Math" w:eastAsiaTheme="minorEastAsia" w:hAnsi="Cambria Math"/>
-                  <w:lang w:val="en-US"/>
                 </w:rPr>
                 <m:t>nx</m:t>
               </m:r>
@@ -1030,7 +1170,6 @@
               <m:r>
                 <w:rPr>
                   <w:rFonts w:ascii="Cambria Math" w:eastAsiaTheme="minorEastAsia" w:hAnsi="Cambria Math"/>
-                  <w:lang w:val="en-US"/>
                 </w:rPr>
                 <m:t>1!</m:t>
               </m:r>
@@ -1039,7 +1178,6 @@
           <m:r>
             <w:rPr>
               <w:rFonts w:ascii="Cambria Math" w:eastAsiaTheme="minorEastAsia" w:hAnsi="Cambria Math"/>
-              <w:lang w:val="en-US"/>
             </w:rPr>
             <m:t>+</m:t>
           </m:r>
@@ -1048,7 +1186,6 @@
               <m:ctrlPr>
                 <w:rPr>
                   <w:rFonts w:ascii="Cambria Math" w:eastAsiaTheme="minorEastAsia" w:hAnsi="Cambria Math"/>
-                  <w:lang w:val="en-US"/>
                 </w:rPr>
               </m:ctrlPr>
             </m:fPr>
@@ -1056,7 +1193,6 @@
               <m:r>
                 <w:rPr>
                   <w:rFonts w:ascii="Cambria Math" w:eastAsiaTheme="minorEastAsia" w:hAnsi="Cambria Math"/>
-                  <w:lang w:val="en-US"/>
                 </w:rPr>
                 <m:t>n</m:t>
               </m:r>
@@ -1065,7 +1201,6 @@
                   <m:ctrlPr>
                     <w:rPr>
                       <w:rFonts w:ascii="Cambria Math" w:eastAsiaTheme="minorEastAsia" w:hAnsi="Cambria Math"/>
-                      <w:lang w:val="en-US"/>
                     </w:rPr>
                   </m:ctrlPr>
                 </m:dPr>
@@ -1073,7 +1208,6 @@
                   <m:r>
                     <w:rPr>
                       <w:rFonts w:ascii="Cambria Math" w:eastAsiaTheme="minorEastAsia" w:hAnsi="Cambria Math"/>
-                      <w:lang w:val="en-US"/>
                     </w:rPr>
                     <m:t>n-1</m:t>
                   </m:r>
@@ -1084,7 +1218,6 @@
                   <m:ctrlPr>
                     <w:rPr>
                       <w:rFonts w:ascii="Cambria Math" w:eastAsiaTheme="minorEastAsia" w:hAnsi="Cambria Math"/>
-                      <w:lang w:val="en-US"/>
                     </w:rPr>
                   </m:ctrlPr>
                 </m:sSupPr>
@@ -1092,7 +1225,6 @@
                   <m:r>
                     <w:rPr>
                       <w:rFonts w:ascii="Cambria Math" w:eastAsiaTheme="minorEastAsia" w:hAnsi="Cambria Math"/>
-                      <w:lang w:val="en-US"/>
                     </w:rPr>
                     <m:t>x</m:t>
                   </m:r>
@@ -1101,7 +1233,6 @@
                   <m:r>
                     <w:rPr>
                       <w:rFonts w:ascii="Cambria Math" w:eastAsiaTheme="minorEastAsia" w:hAnsi="Cambria Math"/>
-                      <w:lang w:val="en-US"/>
                     </w:rPr>
                     <m:t>2</m:t>
                   </m:r>
@@ -1112,7 +1243,6 @@
               <m:r>
                 <w:rPr>
                   <w:rFonts w:ascii="Cambria Math" w:eastAsiaTheme="minorEastAsia" w:hAnsi="Cambria Math"/>
-                  <w:lang w:val="en-US"/>
                 </w:rPr>
                 <m:t>2!</m:t>
               </m:r>
@@ -1121,7 +1251,6 @@
           <m:r>
             <w:rPr>
               <w:rFonts w:ascii="Cambria Math" w:eastAsiaTheme="minorEastAsia" w:hAnsi="Cambria Math"/>
-              <w:lang w:val="en-US"/>
             </w:rPr>
             <m:t>+…</m:t>
           </m:r>
@@ -1132,21 +1261,18 @@
       <w:pPr>
         <w:rPr>
           <w:rFonts w:eastAsiaTheme="minorEastAsia"/>
-          <w:lang w:val="en-US"/>
-        </w:rPr>
-      </w:pPr>
-    </w:p>
-    <w:p>
-      <w:pPr>
-        <w:rPr>
-          <w:rFonts w:eastAsiaTheme="minorEastAsia"/>
-          <w:lang w:val="en-US"/>
+        </w:rPr>
+      </w:pPr>
+    </w:p>
+    <w:p>
+      <w:pPr>
+        <w:rPr>
+          <w:rFonts w:eastAsiaTheme="minorEastAsia"/>
         </w:rPr>
       </w:pPr>
       <w:r>
         <w:rPr>
           <w:rFonts w:eastAsiaTheme="minorEastAsia"/>
-          <w:lang w:val="en-US"/>
         </w:rPr>
         <w:t xml:space="preserve">This is text. This is text. This is text. This is text. This is text. This is text. This is text. This is text. This is text. This is text. This is text. This is text. This is text. This is text. This is text. This is text. This is text. This is text. This is text. This is text. This is text. This is text. This is text. This is text. This is text. This is text. This is text. This is text. This is text. This is text. This is text. </w:t>
       </w:r>
@@ -1155,50 +1281,37 @@
       <w:pPr>
         <w:rPr>
           <w:rFonts w:eastAsiaTheme="minorEastAsia"/>
-          <w:lang w:val="en-US"/>
-        </w:rPr>
-      </w:pPr>
-    </w:p>
-    <w:p>
-      <w:pPr>
-        <w:rPr>
-          <w:rFonts w:eastAsiaTheme="minorEastAsia"/>
-          <w:lang w:val="en-US"/>
-        </w:rPr>
-      </w:pPr>
-    </w:p>
-    <w:p>
-      <w:pPr>
-        <w:rPr>
-          <w:rFonts w:eastAsiaTheme="minorEastAsia"/>
-          <w:lang w:val="en-US"/>
+        </w:rPr>
+      </w:pPr>
+    </w:p>
+    <w:p>
+      <w:pPr>
+        <w:rPr>
+          <w:rFonts w:eastAsiaTheme="minorEastAsia"/>
+        </w:rPr>
+      </w:pPr>
+    </w:p>
+    <w:p>
+      <w:pPr>
+        <w:rPr>
+          <w:rFonts w:eastAsiaTheme="minorEastAsia"/>
         </w:rPr>
       </w:pPr>
       <w:r>
-        <w:rPr>
-          <w:lang w:val="en-US"/>
-        </w:rPr>
         <w:t xml:space="preserve">This is a word </w:t>
       </w:r>
       <w:proofErr w:type="gramStart"/>
       <w:r>
-        <w:rPr>
-          <w:lang w:val="en-US"/>
-        </w:rPr>
         <w:t>document</w:t>
       </w:r>
       <w:proofErr w:type="gramEnd"/>
       <w:r>
-        <w:rPr>
-          <w:lang w:val="en-US"/>
-        </w:rPr>
         <w:t xml:space="preserve"> and this is an inline equation: </w:t>
       </w:r>
       <m:oMath>
         <m:r>
           <w:rPr>
             <w:rFonts w:ascii="Cambria Math" w:hAnsi="Cambria Math"/>
-            <w:lang w:val="en-US"/>
           </w:rPr>
           <m:t>A=π</m:t>
         </m:r>
@@ -1207,7 +1320,6 @@
             <m:ctrlPr>
               <w:rPr>
                 <w:rFonts w:ascii="Cambria Math" w:hAnsi="Cambria Math"/>
-                <w:lang w:val="en-US"/>
               </w:rPr>
             </m:ctrlPr>
           </m:sSupPr>
@@ -1215,7 +1327,6 @@
             <m:r>
               <w:rPr>
                 <w:rFonts w:ascii="Cambria Math" w:hAnsi="Cambria Math"/>
-                <w:lang w:val="en-US"/>
               </w:rPr>
               <m:t>r</m:t>
             </m:r>
@@ -1224,7 +1335,6 @@
             <m:r>
               <w:rPr>
                 <w:rFonts w:ascii="Cambria Math" w:hAnsi="Cambria Math"/>
-                <w:lang w:val="en-US"/>
               </w:rPr>
               <m:t>2</m:t>
             </m:r>
@@ -1233,7 +1343,6 @@
         <m:r>
           <w:rPr>
             <w:rFonts w:ascii="Cambria Math" w:hAnsi="Cambria Math"/>
-            <w:lang w:val="en-US"/>
           </w:rPr>
           <m:t xml:space="preserve"> </m:t>
         </m:r>
@@ -1241,7 +1350,6 @@
       <w:r>
         <w:rPr>
           <w:rFonts w:eastAsiaTheme="minorEastAsia"/>
-          <w:lang w:val="en-US"/>
         </w:rPr>
         <w:t>. If instead, I want an equation by line, I can do this:</w:t>
       </w:r>
@@ -1250,15 +1358,13 @@
       <w:pPr>
         <w:rPr>
           <w:rFonts w:eastAsiaTheme="minorEastAsia"/>
-          <w:lang w:val="en-US"/>
-        </w:rPr>
-      </w:pPr>
-    </w:p>
-    <w:p>
-      <w:pPr>
-        <w:rPr>
-          <w:rFonts w:eastAsiaTheme="minorEastAsia"/>
-          <w:lang w:val="en-US"/>
+        </w:rPr>
+      </w:pPr>
+    </w:p>
+    <w:p>
+      <w:pPr>
+        <w:rPr>
+          <w:rFonts w:eastAsiaTheme="minorEastAsia"/>
         </w:rPr>
       </w:pPr>
       <m:oMathPara>
@@ -1268,7 +1374,6 @@
               <m:ctrlPr>
                 <w:rPr>
                   <w:rFonts w:ascii="Cambria Math" w:eastAsiaTheme="minorEastAsia" w:hAnsi="Cambria Math"/>
-                  <w:lang w:val="en-US"/>
                 </w:rPr>
               </m:ctrlPr>
             </m:sSupPr>
@@ -1276,7 +1381,6 @@
               <m:r>
                 <w:rPr>
                   <w:rFonts w:ascii="Cambria Math" w:eastAsiaTheme="minorEastAsia" w:hAnsi="Cambria Math"/>
-                  <w:lang w:val="en-US"/>
                 </w:rPr>
                 <m:t>e</m:t>
               </m:r>
@@ -1285,7 +1389,6 @@
               <m:r>
                 <w:rPr>
                   <w:rFonts w:ascii="Cambria Math" w:eastAsiaTheme="minorEastAsia" w:hAnsi="Cambria Math"/>
-                  <w:lang w:val="en-US"/>
                 </w:rPr>
                 <m:t>x</m:t>
               </m:r>
@@ -1294,7 +1397,6 @@
           <m:r>
             <w:rPr>
               <w:rFonts w:ascii="Cambria Math" w:eastAsiaTheme="minorEastAsia" w:hAnsi="Cambria Math"/>
-              <w:lang w:val="en-US"/>
             </w:rPr>
             <m:t>=1+</m:t>
           </m:r>
@@ -1303,7 +1405,6 @@
               <m:ctrlPr>
                 <w:rPr>
                   <w:rFonts w:ascii="Cambria Math" w:eastAsiaTheme="minorEastAsia" w:hAnsi="Cambria Math"/>
-                  <w:lang w:val="en-US"/>
                 </w:rPr>
               </m:ctrlPr>
             </m:fPr>
@@ -1311,7 +1412,6 @@
               <m:r>
                 <w:rPr>
                   <w:rFonts w:ascii="Cambria Math" w:eastAsiaTheme="minorEastAsia" w:hAnsi="Cambria Math"/>
-                  <w:lang w:val="en-US"/>
                 </w:rPr>
                 <m:t>x</m:t>
               </m:r>
@@ -1320,7 +1420,6 @@
               <m:r>
                 <w:rPr>
                   <w:rFonts w:ascii="Cambria Math" w:eastAsiaTheme="minorEastAsia" w:hAnsi="Cambria Math"/>
-                  <w:lang w:val="en-US"/>
                 </w:rPr>
                 <m:t>1!</m:t>
               </m:r>
@@ -1329,7 +1428,6 @@
           <m:r>
             <w:rPr>
               <w:rFonts w:ascii="Cambria Math" w:eastAsiaTheme="minorEastAsia" w:hAnsi="Cambria Math"/>
-              <w:lang w:val="en-US"/>
             </w:rPr>
             <m:t>+</m:t>
           </m:r>
@@ -1338,7 +1436,6 @@
               <m:ctrlPr>
                 <w:rPr>
                   <w:rFonts w:ascii="Cambria Math" w:eastAsiaTheme="minorEastAsia" w:hAnsi="Cambria Math"/>
-                  <w:lang w:val="en-US"/>
                 </w:rPr>
               </m:ctrlPr>
             </m:fPr>
@@ -1348,7 +1445,6 @@
                   <m:ctrlPr>
                     <w:rPr>
                       <w:rFonts w:ascii="Cambria Math" w:eastAsiaTheme="minorEastAsia" w:hAnsi="Cambria Math"/>
-                      <w:lang w:val="en-US"/>
                     </w:rPr>
                   </m:ctrlPr>
                 </m:sSupPr>
@@ -1356,7 +1452,6 @@
                   <m:r>
                     <w:rPr>
                       <w:rFonts w:ascii="Cambria Math" w:eastAsiaTheme="minorEastAsia" w:hAnsi="Cambria Math"/>
-                      <w:lang w:val="en-US"/>
                     </w:rPr>
                     <m:t>x</m:t>
                   </m:r>
@@ -1365,7 +1460,6 @@
                   <m:r>
                     <w:rPr>
                       <w:rFonts w:ascii="Cambria Math" w:eastAsiaTheme="minorEastAsia" w:hAnsi="Cambria Math"/>
-                      <w:lang w:val="en-US"/>
                     </w:rPr>
                     <m:t>2</m:t>
                   </m:r>
@@ -1376,7 +1470,6 @@
               <m:r>
                 <w:rPr>
                   <w:rFonts w:ascii="Cambria Math" w:eastAsiaTheme="minorEastAsia" w:hAnsi="Cambria Math"/>
-                  <w:lang w:val="en-US"/>
                 </w:rPr>
                 <m:t>2!</m:t>
               </m:r>
@@ -1385,7 +1478,6 @@
           <m:r>
             <w:rPr>
               <w:rFonts w:ascii="Cambria Math" w:eastAsiaTheme="minorEastAsia" w:hAnsi="Cambria Math"/>
-              <w:lang w:val="en-US"/>
             </w:rPr>
             <m:t>+</m:t>
           </m:r>
@@ -1394,7 +1486,6 @@
               <m:ctrlPr>
                 <w:rPr>
                   <w:rFonts w:ascii="Cambria Math" w:eastAsiaTheme="minorEastAsia" w:hAnsi="Cambria Math"/>
-                  <w:lang w:val="en-US"/>
                 </w:rPr>
               </m:ctrlPr>
             </m:fPr>
@@ -1404,7 +1495,6 @@
                   <m:ctrlPr>
                     <w:rPr>
                       <w:rFonts w:ascii="Cambria Math" w:eastAsiaTheme="minorEastAsia" w:hAnsi="Cambria Math"/>
-                      <w:lang w:val="en-US"/>
                     </w:rPr>
                   </m:ctrlPr>
                 </m:sSupPr>
@@ -1412,7 +1502,6 @@
                   <m:r>
                     <w:rPr>
                       <w:rFonts w:ascii="Cambria Math" w:eastAsiaTheme="minorEastAsia" w:hAnsi="Cambria Math"/>
-                      <w:lang w:val="en-US"/>
                     </w:rPr>
                     <m:t>x</m:t>
                   </m:r>
@@ -1421,7 +1510,6 @@
                   <m:r>
                     <w:rPr>
                       <w:rFonts w:ascii="Cambria Math" w:eastAsiaTheme="minorEastAsia" w:hAnsi="Cambria Math"/>
-                      <w:lang w:val="en-US"/>
                     </w:rPr>
                     <m:t>3</m:t>
                   </m:r>
@@ -1432,7 +1520,6 @@
               <m:r>
                 <w:rPr>
                   <w:rFonts w:ascii="Cambria Math" w:eastAsiaTheme="minorEastAsia" w:hAnsi="Cambria Math"/>
-                  <w:lang w:val="en-US"/>
                 </w:rPr>
                 <m:t>3!</m:t>
               </m:r>
@@ -1441,7 +1528,6 @@
           <m:r>
             <w:rPr>
               <w:rFonts w:ascii="Cambria Math" w:eastAsiaTheme="minorEastAsia" w:hAnsi="Cambria Math"/>
-              <w:lang w:val="en-US"/>
             </w:rPr>
             <m:t>+…,</m:t>
           </m:r>
@@ -1451,14 +1537,12 @@
             </m:rPr>
             <w:rPr>
               <w:rFonts w:ascii="Cambria Math" w:eastAsiaTheme="minorEastAsia" w:hAnsi="Cambria Math"/>
-              <w:lang w:val="en-US"/>
             </w:rPr>
             <m:t xml:space="preserve">  </m:t>
           </m:r>
           <m:r>
             <w:rPr>
               <w:rFonts w:ascii="Cambria Math" w:eastAsiaTheme="minorEastAsia" w:hAnsi="Cambria Math"/>
-              <w:lang w:val="en-US"/>
             </w:rPr>
             <m:t>-∞&lt;x&lt;∞</m:t>
           </m:r>
@@ -1469,22 +1553,20 @@
       <w:pPr>
         <w:rPr>
           <w:rFonts w:eastAsiaTheme="minorEastAsia"/>
-          <w:lang w:val="en-US"/>
-        </w:rPr>
-      </w:pPr>
-    </w:p>
-    <w:p>
-      <w:pPr>
-        <w:rPr>
-          <w:rFonts w:eastAsiaTheme="minorEastAsia"/>
-          <w:lang w:val="en-US"/>
+        </w:rPr>
+      </w:pPr>
+    </w:p>
+    <w:p>
+      <w:pPr>
+        <w:rPr>
+          <w:rFonts w:eastAsiaTheme="minorEastAsia"/>
         </w:rPr>
       </w:pPr>
       <w:r>
         <w:rPr>
           <w:rFonts w:eastAsiaTheme="minorEastAsia"/>
-          <w:lang w:val="en-US"/>
-        </w:rPr>
+        </w:rPr>
+        <w:lastRenderedPageBreak/>
         <w:t xml:space="preserve">And that is an equation by itself. Cheers! </w:t>
       </w:r>
     </w:p>
@@ -1492,13 +1574,11 @@
       <w:pPr>
         <w:rPr>
           <w:rFonts w:eastAsiaTheme="minorEastAsia"/>
-          <w:lang w:val="en-US"/>
         </w:rPr>
       </w:pPr>
       <w:r>
         <w:rPr>
           <w:rFonts w:eastAsiaTheme="minorEastAsia"/>
-          <w:lang w:val="en-US"/>
         </w:rPr>
         <w:br w:type="page"/>
       </w:r>
@@ -1507,13 +1587,11 @@
       <w:pPr>
         <w:rPr>
           <w:rFonts w:eastAsiaTheme="minorEastAsia"/>
-          <w:lang w:val="en-US"/>
         </w:rPr>
       </w:pPr>
       <w:r>
         <w:rPr>
           <w:rFonts w:eastAsiaTheme="minorEastAsia"/>
-          <w:lang w:val="en-US"/>
         </w:rPr>
         <w:lastRenderedPageBreak/>
         <w:t xml:space="preserve">Large operators and integrals are represented with </w:t>
@@ -1521,7 +1599,6 @@
       <w:r>
         <w:rPr>
           <w:rFonts w:eastAsiaTheme="minorEastAsia"/>
-          <w:lang w:val="en-US"/>
         </w:rPr>
         <w:t>n-</w:t>
       </w:r>
@@ -1529,7 +1606,6 @@
       <w:r>
         <w:rPr>
           <w:rFonts w:eastAsiaTheme="minorEastAsia"/>
-          <w:lang w:val="en-US"/>
         </w:rPr>
         <w:t>ary</w:t>
       </w:r>
@@ -1537,28 +1613,24 @@
       <w:r>
         <w:rPr>
           <w:rFonts w:eastAsiaTheme="minorEastAsia"/>
-          <w:lang w:val="en-US"/>
         </w:rPr>
         <w:t xml:space="preserve"> object</w:t>
       </w:r>
       <w:r>
         <w:rPr>
           <w:rFonts w:eastAsiaTheme="minorEastAsia"/>
-          <w:lang w:val="en-US"/>
         </w:rPr>
         <w:t xml:space="preserve">s in </w:t>
       </w:r>
       <w:r>
         <w:rPr>
           <w:rFonts w:eastAsiaTheme="minorEastAsia"/>
-          <w:lang w:val="en-US"/>
         </w:rPr>
         <w:t>OMML XML</w:t>
       </w:r>
       <w:r>
         <w:rPr>
           <w:rFonts w:eastAsiaTheme="minorEastAsia"/>
-          <w:lang w:val="en-US"/>
         </w:rPr>
         <w:t>:</w:t>
       </w:r>
@@ -1567,7 +1639,6 @@
       <w:pPr>
         <w:rPr>
           <w:rFonts w:eastAsiaTheme="minorEastAsia"/>
-          <w:lang w:val="en-US"/>
         </w:rPr>
       </w:pPr>
     </w:p>
@@ -1732,7 +1803,6 @@
       <w:pPr>
         <w:rPr>
           <w:rFonts w:eastAsiaTheme="minorEastAsia"/>
-          <w:lang w:val="en-US"/>
         </w:rPr>
       </w:pPr>
       <m:oMathPara>
@@ -1799,7 +1869,6 @@
       <w:pPr>
         <w:rPr>
           <w:rFonts w:eastAsiaTheme="minorEastAsia"/>
-          <w:lang w:val="en-US"/>
         </w:rPr>
       </w:pPr>
       <m:oMathPara>
@@ -1814,7 +1883,6 @@
                 <w:rPr>
                   <w:rFonts w:ascii="Cambria Math" w:eastAsiaTheme="minorEastAsia" w:hAnsi="Cambria Math"/>
                   <w:i/>
-                  <w:lang w:val="en-US"/>
                 </w:rPr>
               </m:ctrlPr>
             </m:naryPr>
@@ -1824,7 +1892,6 @@
               <m:r>
                 <w:rPr>
                   <w:rFonts w:ascii="Cambria Math" w:eastAsiaTheme="minorEastAsia" w:hAnsi="Cambria Math"/>
-                  <w:lang w:val="en-US"/>
                 </w:rPr>
                 <m:t>x</m:t>
               </m:r>
@@ -2178,7 +2245,6 @@
       <w:pPr>
         <w:rPr>
           <w:rFonts w:eastAsiaTheme="minorEastAsia"/>
-          <w:lang w:val="en-US"/>
         </w:rPr>
       </w:pPr>
     </w:p>
@@ -2190,6 +2256,127 @@
     </w:sectPr>
   </w:body>
 </w:document>
+</file>
+
+<file path=word/numbering.xml><?xml version="1.0" encoding="utf-8"?>
+<w:numbering xmlns:wpc="http://schemas.microsoft.com/office/word/2010/wordprocessingCanvas" xmlns:cx="http://schemas.microsoft.com/office/drawing/2014/chartex" xmlns:cx1="http://schemas.microsoft.com/office/drawing/2015/9/8/chartex" xmlns:cx2="http://schemas.microsoft.com/office/drawing/2015/10/21/chartex" xmlns:cx3="http://schemas.microsoft.com/office/drawing/2016/5/9/chartex" xmlns:cx4="http://schemas.microsoft.com/office/drawing/2016/5/10/chartex" xmlns:cx5="http://schemas.microsoft.com/office/drawing/2016/5/11/chartex" xmlns:cx6="http://schemas.microsoft.com/office/drawing/2016/5/12/chartex" xmlns:cx7="http://schemas.microsoft.com/office/drawing/2016/5/13/chartex" xmlns:cx8="http://schemas.microsoft.com/office/drawing/2016/5/14/chartex" xmlns:mc="http://schemas.openxmlformats.org/markup-compatibility/2006" xmlns:aink="http://schemas.microsoft.com/office/drawing/2016/ink" xmlns:am3d="http://schemas.microsoft.com/office/drawing/2017/model3d" xmlns:o="urn:schemas-microsoft-com:office:office" xmlns:oel="http://schemas.microsoft.com/office/2019/extlst" xmlns:r="http://schemas.openxmlformats.org/officeDocument/2006/relationships" xmlns:m="http://schemas.openxmlformats.org/officeDocument/2006/math" xmlns:v="urn:schemas-microsoft-com:vml" xmlns:wp14="http://schemas.microsoft.com/office/word/2010/wordprocessingDrawing" xmlns:wp="http://schemas.openxmlformats.org/drawingml/2006/wordprocessingDrawing" xmlns:w10="urn:schemas-microsoft-com:office:word" xmlns:w="http://schemas.openxmlformats.org/wordprocessingml/2006/main" xmlns:w14="http://schemas.microsoft.com/office/word/2010/wordml" xmlns:w15="http://schemas.microsoft.com/office/word/2012/wordml" xmlns:w16cex="http://schemas.microsoft.com/office/word/2018/wordml/cex" xmlns:w16cid="http://schemas.microsoft.com/office/word/2016/wordml/cid" xmlns:w16="http://schemas.microsoft.com/office/word/2018/wordml" xmlns:w16du="http://schemas.microsoft.com/office/word/2023/wordml/word16du" xmlns:w16sdtdh="http://schemas.microsoft.com/office/word/2020/wordml/sdtdatahash" xmlns:w16sdtfl="http://schemas.microsoft.com/office/word/2024/wordml/sdtformatlock" xmlns:w16se="http://schemas.microsoft.com/office/word/2015/wordml/symex" xmlns:wpg="http://schemas.microsoft.com/office/word/2010/wordprocessingGroup" xmlns:wpi="http://schemas.microsoft.com/office/word/2010/wordprocessingInk" xmlns:wne="http://schemas.microsoft.com/office/word/2006/wordml" xmlns:wps="http://schemas.microsoft.com/office/word/2010/wordprocessingShape" mc:Ignorable="w14 w15 w16se w16cid w16 w16cex w16sdtdh w16sdtfl w16du wp14">
+  <w:abstractNum w:abstractNumId="0" w15:restartNumberingAfterBreak="0">
+    <w:nsid w:val="1D9F0E65"/>
+    <w:multiLevelType w:val="hybridMultilevel"/>
+    <w:tmpl w:val="BD981A46"/>
+    <w:lvl w:ilvl="0" w:tplc="04090001">
+      <w:start w:val="1"/>
+      <w:numFmt w:val="bullet"/>
+      <w:lvlText w:val=""/>
+      <w:lvlJc w:val="left"/>
+      <w:pPr>
+        <w:ind w:left="720" w:hanging="360"/>
+      </w:pPr>
+      <w:rPr>
+        <w:rFonts w:ascii="Symbol" w:hAnsi="Symbol" w:hint="default"/>
+      </w:rPr>
+    </w:lvl>
+    <w:lvl w:ilvl="1" w:tplc="04090003" w:tentative="1">
+      <w:start w:val="1"/>
+      <w:numFmt w:val="bullet"/>
+      <w:lvlText w:val="o"/>
+      <w:lvlJc w:val="left"/>
+      <w:pPr>
+        <w:ind w:left="1440" w:hanging="360"/>
+      </w:pPr>
+      <w:rPr>
+        <w:rFonts w:ascii="Courier New" w:hAnsi="Courier New" w:cs="Courier New" w:hint="default"/>
+      </w:rPr>
+    </w:lvl>
+    <w:lvl w:ilvl="2" w:tplc="04090005" w:tentative="1">
+      <w:start w:val="1"/>
+      <w:numFmt w:val="bullet"/>
+      <w:lvlText w:val=""/>
+      <w:lvlJc w:val="left"/>
+      <w:pPr>
+        <w:ind w:left="2160" w:hanging="360"/>
+      </w:pPr>
+      <w:rPr>
+        <w:rFonts w:ascii="Wingdings" w:hAnsi="Wingdings" w:hint="default"/>
+      </w:rPr>
+    </w:lvl>
+    <w:lvl w:ilvl="3" w:tplc="04090001" w:tentative="1">
+      <w:start w:val="1"/>
+      <w:numFmt w:val="bullet"/>
+      <w:lvlText w:val=""/>
+      <w:lvlJc w:val="left"/>
+      <w:pPr>
+        <w:ind w:left="2880" w:hanging="360"/>
+      </w:pPr>
+      <w:rPr>
+        <w:rFonts w:ascii="Symbol" w:hAnsi="Symbol" w:hint="default"/>
+      </w:rPr>
+    </w:lvl>
+    <w:lvl w:ilvl="4" w:tplc="04090003" w:tentative="1">
+      <w:start w:val="1"/>
+      <w:numFmt w:val="bullet"/>
+      <w:lvlText w:val="o"/>
+      <w:lvlJc w:val="left"/>
+      <w:pPr>
+        <w:ind w:left="3600" w:hanging="360"/>
+      </w:pPr>
+      <w:rPr>
+        <w:rFonts w:ascii="Courier New" w:hAnsi="Courier New" w:cs="Courier New" w:hint="default"/>
+      </w:rPr>
+    </w:lvl>
+    <w:lvl w:ilvl="5" w:tplc="04090005" w:tentative="1">
+      <w:start w:val="1"/>
+      <w:numFmt w:val="bullet"/>
+      <w:lvlText w:val=""/>
+      <w:lvlJc w:val="left"/>
+      <w:pPr>
+        <w:ind w:left="4320" w:hanging="360"/>
+      </w:pPr>
+      <w:rPr>
+        <w:rFonts w:ascii="Wingdings" w:hAnsi="Wingdings" w:hint="default"/>
+      </w:rPr>
+    </w:lvl>
+    <w:lvl w:ilvl="6" w:tplc="04090001" w:tentative="1">
+      <w:start w:val="1"/>
+      <w:numFmt w:val="bullet"/>
+      <w:lvlText w:val=""/>
+      <w:lvlJc w:val="left"/>
+      <w:pPr>
+        <w:ind w:left="5040" w:hanging="360"/>
+      </w:pPr>
+      <w:rPr>
+        <w:rFonts w:ascii="Symbol" w:hAnsi="Symbol" w:hint="default"/>
+      </w:rPr>
+    </w:lvl>
+    <w:lvl w:ilvl="7" w:tplc="04090003" w:tentative="1">
+      <w:start w:val="1"/>
+      <w:numFmt w:val="bullet"/>
+      <w:lvlText w:val="o"/>
+      <w:lvlJc w:val="left"/>
+      <w:pPr>
+        <w:ind w:left="5760" w:hanging="360"/>
+      </w:pPr>
+      <w:rPr>
+        <w:rFonts w:ascii="Courier New" w:hAnsi="Courier New" w:cs="Courier New" w:hint="default"/>
+      </w:rPr>
+    </w:lvl>
+    <w:lvl w:ilvl="8" w:tplc="04090005" w:tentative="1">
+      <w:start w:val="1"/>
+      <w:numFmt w:val="bullet"/>
+      <w:lvlText w:val=""/>
+      <w:lvlJc w:val="left"/>
+      <w:pPr>
+        <w:ind w:left="6480" w:hanging="360"/>
+      </w:pPr>
+      <w:rPr>
+        <w:rFonts w:ascii="Wingdings" w:hAnsi="Wingdings" w:hint="default"/>
+      </w:rPr>
+    </w:lvl>
+  </w:abstractNum>
+  <w:num w:numId="1" w16cid:durableId="1028991065">
+    <w:abstractNumId w:val="0"/>
+  </w:num>
+</w:numbering>
 </file>
 
 <file path=word/styles.xml><?xml version="1.0" encoding="utf-8"?>
@@ -2201,7 +2388,7 @@
         <w:kern w:val="2"/>
         <w:sz w:val="24"/>
         <w:szCs w:val="24"/>
-        <w:lang w:eastAsia="en-US" w:bidi="ar-SA"/>
+        <w:lang w:val="en-US" w:eastAsia="en-US" w:bidi="ar-SA"/>
         <w14:ligatures w14:val="standardContextual"/>
       </w:rPr>
     </w:rPrDefault>

</xml_diff>

<commit_message>
fix(docx): handle unsupported limit functions gracefully in OMML conversion
Replace RuntimeError with graceful fallback for unknown limit functions in do_limlow().
Add argmax and argmin to LIM_FUNC dictionary for proper LaTeX rendering.
Fixes conversion failures when Word documents contain mathematical operators
not previously supported in the limit function dictionary.

Signed-off-by: Cesar Berrospi Ramis <ceb@zurich.ibm.com>
</commit_message>
<xml_diff>
--- a/tests/data/docx/equations.docx
+++ b/tests/data/docx/equations.docx
@@ -144,19 +144,7 @@
           <w:rPr>
             <w:rFonts w:ascii="Cambria Math" w:eastAsiaTheme="minorEastAsia" w:hAnsi="Cambria Math"/>
           </w:rPr>
-          <m:t>E</m:t>
-        </m:r>
-        <m:r>
-          <w:rPr>
-            <w:rFonts w:ascii="Cambria Math" w:eastAsiaTheme="minorEastAsia" w:hAnsi="Cambria Math"/>
-          </w:rPr>
-          <m:t>=</m:t>
-        </m:r>
-        <m:r>
-          <w:rPr>
-            <w:rFonts w:ascii="Cambria Math" w:eastAsiaTheme="minorEastAsia" w:hAnsi="Cambria Math"/>
-          </w:rPr>
-          <m:t>m</m:t>
+          <m:t>E=m</m:t>
         </m:r>
         <m:sSup>
           <m:sSupPr>
@@ -2247,6 +2235,426 @@
           <w:rFonts w:eastAsiaTheme="minorEastAsia"/>
         </w:rPr>
       </w:pPr>
+    </w:p>
+    <w:p>
+      <w:pPr>
+        <w:rPr>
+          <w:rFonts w:eastAsiaTheme="minorEastAsia"/>
+        </w:rPr>
+      </w:pPr>
+    </w:p>
+    <w:p>
+      <w:pPr>
+        <w:rPr>
+          <w:rFonts w:eastAsiaTheme="minorEastAsia"/>
+        </w:rPr>
+      </w:pPr>
+      <w:r>
+        <w:rPr>
+          <w:rFonts w:eastAsiaTheme="minorEastAsia"/>
+        </w:rPr>
+        <w:t>Operators used with limits:</w:t>
+      </w:r>
+    </w:p>
+    <w:p>
+      <w:pPr>
+        <w:rPr>
+          <w:rFonts w:eastAsiaTheme="minorEastAsia"/>
+        </w:rPr>
+      </w:pPr>
+    </w:p>
+    <w:p>
+      <w:pPr>
+        <w:rPr>
+          <w:rFonts w:eastAsiaTheme="minorEastAsia"/>
+        </w:rPr>
+      </w:pPr>
+      <m:oMathPara>
+        <m:oMath>
+          <m:func>
+            <m:funcPr>
+              <m:ctrlPr>
+                <w:rPr>
+                  <w:rFonts w:ascii="Cambria Math" w:hAnsi="Cambria Math"/>
+                  <w:i/>
+                </w:rPr>
+              </m:ctrlPr>
+            </m:funcPr>
+            <m:fName>
+              <m:limLow>
+                <m:limLowPr>
+                  <m:ctrlPr>
+                    <w:rPr>
+                      <w:rFonts w:ascii="Cambria Math" w:hAnsi="Cambria Math"/>
+                      <w:i/>
+                    </w:rPr>
+                  </m:ctrlPr>
+                </m:limLowPr>
+                <m:e>
+                  <m:r>
+                    <m:rPr>
+                      <m:sty m:val="p"/>
+                    </m:rPr>
+                    <w:rPr>
+                      <w:rFonts w:ascii="Cambria Math" w:hAnsi="Cambria Math"/>
+                    </w:rPr>
+                    <m:t>argmax</m:t>
+                  </m:r>
+                </m:e>
+                <m:lim>
+                  <m:r>
+                    <w:rPr>
+                      <w:rFonts w:ascii="Cambria Math" w:hAnsi="Cambria Math"/>
+                    </w:rPr>
+                    <m:t>ϵ</m:t>
+                  </m:r>
+                </m:lim>
+              </m:limLow>
+            </m:fName>
+            <m:e>
+              <m:r>
+                <w:rPr>
+                  <w:rFonts w:ascii="Cambria Math" w:hAnsi="Cambria Math"/>
+                </w:rPr>
+                <m:t xml:space="preserve">f(x),     </m:t>
+              </m:r>
+              <m:func>
+                <m:funcPr>
+                  <m:ctrlPr>
+                    <w:rPr>
+                      <w:rFonts w:ascii="Cambria Math" w:hAnsi="Cambria Math"/>
+                      <w:i/>
+                    </w:rPr>
+                  </m:ctrlPr>
+                </m:funcPr>
+                <m:fName>
+                  <m:limLow>
+                    <m:limLowPr>
+                      <m:ctrlPr>
+                        <w:rPr>
+                          <w:rFonts w:ascii="Cambria Math" w:hAnsi="Cambria Math"/>
+                          <w:i/>
+                        </w:rPr>
+                      </m:ctrlPr>
+                    </m:limLowPr>
+                    <m:e>
+                      <m:r>
+                        <m:rPr>
+                          <m:sty m:val="p"/>
+                        </m:rPr>
+                        <w:rPr>
+                          <w:rFonts w:ascii="Cambria Math" w:hAnsi="Cambria Math"/>
+                        </w:rPr>
+                        <m:t>lim</m:t>
+                      </m:r>
+                    </m:e>
+                    <m:lim>
+                      <m:r>
+                        <w:rPr>
+                          <w:rFonts w:ascii="Cambria Math" w:hAnsi="Cambria Math"/>
+                        </w:rPr>
+                        <m:t>n</m:t>
+                      </m:r>
+                    </m:lim>
+                  </m:limLow>
+                </m:fName>
+                <m:e>
+                  <m:sSup>
+                    <m:sSupPr>
+                      <m:ctrlPr>
+                        <w:rPr>
+                          <w:rFonts w:ascii="Cambria Math" w:hAnsi="Cambria Math"/>
+                          <w:i/>
+                        </w:rPr>
+                      </m:ctrlPr>
+                    </m:sSupPr>
+                    <m:e>
+                      <m:d>
+                        <m:dPr>
+                          <m:ctrlPr>
+                            <w:rPr>
+                              <w:rFonts w:ascii="Cambria Math" w:hAnsi="Cambria Math"/>
+                              <w:i/>
+                            </w:rPr>
+                          </m:ctrlPr>
+                        </m:dPr>
+                        <m:e>
+                          <m:r>
+                            <w:rPr>
+                              <w:rFonts w:ascii="Cambria Math" w:hAnsi="Cambria Math"/>
+                            </w:rPr>
+                            <m:t>1+</m:t>
+                          </m:r>
+                          <m:f>
+                            <m:fPr>
+                              <m:ctrlPr>
+                                <w:rPr>
+                                  <w:rFonts w:ascii="Cambria Math" w:hAnsi="Cambria Math"/>
+                                  <w:i/>
+                                </w:rPr>
+                              </m:ctrlPr>
+                            </m:fPr>
+                            <m:num>
+                              <m:r>
+                                <w:rPr>
+                                  <w:rFonts w:ascii="Cambria Math" w:hAnsi="Cambria Math"/>
+                                </w:rPr>
+                                <m:t>1</m:t>
+                              </m:r>
+                            </m:num>
+                            <m:den>
+                              <m:r>
+                                <w:rPr>
+                                  <w:rFonts w:ascii="Cambria Math" w:hAnsi="Cambria Math"/>
+                                </w:rPr>
+                                <m:t>n</m:t>
+                              </m:r>
+                            </m:den>
+                          </m:f>
+                        </m:e>
+                      </m:d>
+                    </m:e>
+                    <m:sup>
+                      <m:r>
+                        <w:rPr>
+                          <w:rFonts w:ascii="Cambria Math" w:hAnsi="Cambria Math"/>
+                        </w:rPr>
+                        <m:t>n</m:t>
+                      </m:r>
+                    </m:sup>
+                  </m:sSup>
+                </m:e>
+              </m:func>
+              <m:r>
+                <w:rPr>
+                  <w:rFonts w:ascii="Cambria Math" w:hAnsi="Cambria Math"/>
+                </w:rPr>
+                <m:t xml:space="preserve"> </m:t>
+              </m:r>
+            </m:e>
+          </m:func>
+          <m:r>
+            <w:rPr>
+              <w:rFonts w:ascii="Cambria Math" w:hAnsi="Cambria Math"/>
+            </w:rPr>
+            <m:t xml:space="preserve">,    </m:t>
+          </m:r>
+          <m:func>
+            <m:funcPr>
+              <m:ctrlPr>
+                <w:rPr>
+                  <w:rFonts w:ascii="Cambria Math" w:hAnsi="Cambria Math"/>
+                  <w:i/>
+                </w:rPr>
+              </m:ctrlPr>
+            </m:funcPr>
+            <m:fName>
+              <m:limLow>
+                <m:limLowPr>
+                  <m:ctrlPr>
+                    <w:rPr>
+                      <w:rFonts w:ascii="Cambria Math" w:hAnsi="Cambria Math"/>
+                      <w:i/>
+                    </w:rPr>
+                  </m:ctrlPr>
+                </m:limLowPr>
+                <m:e>
+                  <m:r>
+                    <m:rPr>
+                      <m:sty m:val="p"/>
+                    </m:rPr>
+                    <w:rPr>
+                      <w:rFonts w:ascii="Cambria Math" w:hAnsi="Cambria Math"/>
+                    </w:rPr>
+                    <m:t>max</m:t>
+                  </m:r>
+                </m:e>
+                <m:lim>
+                  <m:r>
+                    <w:rPr>
+                      <w:rFonts w:ascii="Cambria Math" w:hAnsi="Cambria Math"/>
+                    </w:rPr>
+                    <m:t>0≤x≤1</m:t>
+                  </m:r>
+                </m:lim>
+              </m:limLow>
+            </m:fName>
+            <m:e>
+              <m:r>
+                <w:rPr>
+                  <w:rFonts w:ascii="Cambria Math" w:hAnsi="Cambria Math"/>
+                </w:rPr>
+                <m:t>x</m:t>
+              </m:r>
+              <m:sSup>
+                <m:sSupPr>
+                  <m:ctrlPr>
+                    <w:rPr>
+                      <w:rFonts w:ascii="Cambria Math" w:hAnsi="Cambria Math"/>
+                      <w:i/>
+                    </w:rPr>
+                  </m:ctrlPr>
+                </m:sSupPr>
+                <m:e>
+                  <m:r>
+                    <w:rPr>
+                      <w:rFonts w:ascii="Cambria Math" w:hAnsi="Cambria Math"/>
+                    </w:rPr>
+                    <m:t>e</m:t>
+                  </m:r>
+                </m:e>
+                <m:sup>
+                  <m:r>
+                    <w:rPr>
+                      <w:rFonts w:ascii="Cambria Math" w:hAnsi="Cambria Math"/>
+                    </w:rPr>
+                    <m:t>-</m:t>
+                  </m:r>
+                  <m:sSup>
+                    <m:sSupPr>
+                      <m:ctrlPr>
+                        <w:rPr>
+                          <w:rFonts w:ascii="Cambria Math" w:hAnsi="Cambria Math"/>
+                          <w:i/>
+                        </w:rPr>
+                      </m:ctrlPr>
+                    </m:sSupPr>
+                    <m:e>
+                      <m:r>
+                        <w:rPr>
+                          <w:rFonts w:ascii="Cambria Math" w:hAnsi="Cambria Math"/>
+                        </w:rPr>
+                        <m:t>x</m:t>
+                      </m:r>
+                    </m:e>
+                    <m:sup>
+                      <m:r>
+                        <w:rPr>
+                          <w:rFonts w:ascii="Cambria Math" w:hAnsi="Cambria Math"/>
+                        </w:rPr>
+                        <m:t>2</m:t>
+                      </m:r>
+                    </m:sup>
+                  </m:sSup>
+                </m:sup>
+              </m:sSup>
+            </m:e>
+          </m:func>
+          <m:r>
+            <w:rPr>
+              <w:rFonts w:ascii="Cambria Math" w:hAnsi="Cambria Math"/>
+            </w:rPr>
+            <m:t xml:space="preserve">,    </m:t>
+          </m:r>
+          <m:func>
+            <m:funcPr>
+              <m:ctrlPr>
+                <w:rPr>
+                  <w:rFonts w:ascii="Cambria Math" w:hAnsi="Cambria Math"/>
+                  <w:i/>
+                </w:rPr>
+              </m:ctrlPr>
+            </m:funcPr>
+            <m:fName>
+              <m:limLow>
+                <m:limLowPr>
+                  <m:ctrlPr>
+                    <w:rPr>
+                      <w:rFonts w:ascii="Cambria Math" w:hAnsi="Cambria Math"/>
+                      <w:i/>
+                    </w:rPr>
+                  </m:ctrlPr>
+                </m:limLowPr>
+                <m:e>
+                  <m:r>
+                    <m:rPr>
+                      <m:sty m:val="p"/>
+                    </m:rPr>
+                    <w:rPr>
+                      <w:rFonts w:ascii="Cambria Math" w:hAnsi="Cambria Math"/>
+                    </w:rPr>
+                    <m:t>unsupported</m:t>
+                  </m:r>
+                </m:e>
+                <m:lim>
+                  <m:r>
+                    <w:rPr>
+                      <w:rFonts w:ascii="Cambria Math" w:hAnsi="Cambria Math"/>
+                    </w:rPr>
+                    <m:t>n</m:t>
+                  </m:r>
+                </m:lim>
+              </m:limLow>
+            </m:fName>
+            <m:e>
+              <m:sSup>
+                <m:sSupPr>
+                  <m:ctrlPr>
+                    <w:rPr>
+                      <w:rFonts w:ascii="Cambria Math" w:hAnsi="Cambria Math"/>
+                      <w:i/>
+                    </w:rPr>
+                  </m:ctrlPr>
+                </m:sSupPr>
+                <m:e>
+                  <m:d>
+                    <m:dPr>
+                      <m:ctrlPr>
+                        <w:rPr>
+                          <w:rFonts w:ascii="Cambria Math" w:hAnsi="Cambria Math"/>
+                          <w:i/>
+                        </w:rPr>
+                      </m:ctrlPr>
+                    </m:dPr>
+                    <m:e>
+                      <m:r>
+                        <w:rPr>
+                          <w:rFonts w:ascii="Cambria Math" w:hAnsi="Cambria Math"/>
+                        </w:rPr>
+                        <m:t>1+</m:t>
+                      </m:r>
+                      <m:f>
+                        <m:fPr>
+                          <m:ctrlPr>
+                            <w:rPr>
+                              <w:rFonts w:ascii="Cambria Math" w:hAnsi="Cambria Math"/>
+                              <w:i/>
+                            </w:rPr>
+                          </m:ctrlPr>
+                        </m:fPr>
+                        <m:num>
+                          <m:r>
+                            <w:rPr>
+                              <w:rFonts w:ascii="Cambria Math" w:hAnsi="Cambria Math"/>
+                            </w:rPr>
+                            <m:t>1</m:t>
+                          </m:r>
+                        </m:num>
+                        <m:den>
+                          <m:r>
+                            <w:rPr>
+                              <w:rFonts w:ascii="Cambria Math" w:hAnsi="Cambria Math"/>
+                            </w:rPr>
+                            <m:t>n</m:t>
+                          </m:r>
+                        </m:den>
+                      </m:f>
+                    </m:e>
+                  </m:d>
+                </m:e>
+                <m:sup>
+                  <m:r>
+                    <w:rPr>
+                      <w:rFonts w:ascii="Cambria Math" w:hAnsi="Cambria Math"/>
+                    </w:rPr>
+                    <m:t>n</m:t>
+                  </m:r>
+                </m:sup>
+              </m:sSup>
+            </m:e>
+          </m:func>
+        </m:oMath>
+      </m:oMathPara>
     </w:p>
     <w:sectPr>
       <w:pgSz w:w="11906" w:h="16838"/>

</xml_diff>

<commit_message>
fix(docx): OMML conversion failures for unsupported limit functions (#3359)
* fix(docx): handle unsupported limit functions gracefully in OMML conversion

Replace RuntimeError with graceful fallback for unknown limit functions in do_limlow().
Add argmax and argmin to LIM_FUNC dictionary for proper LaTeX rendering.
Fixes conversion failures when Word documents contain mathematical operators
not previously supported in the limit function dictionary.

Signed-off-by: Cesar Berrospi Ramis <ceb@zurich.ibm.com>

* test(docx): regenerate ground truth files

Signed-off-by: Cesar Berrospi Ramis <ceb@zurich.ibm.com>

---------

Signed-off-by: Cesar Berrospi Ramis <ceb@zurich.ibm.com>
Signed-off-by: OrbisAI Security <mediratta01.pally@gmail.com>
</commit_message>
<xml_diff>
--- a/tests/data/docx/equations.docx
+++ b/tests/data/docx/equations.docx
@@ -144,19 +144,7 @@
           <w:rPr>
             <w:rFonts w:ascii="Cambria Math" w:eastAsiaTheme="minorEastAsia" w:hAnsi="Cambria Math"/>
           </w:rPr>
-          <m:t>E</m:t>
-        </m:r>
-        <m:r>
-          <w:rPr>
-            <w:rFonts w:ascii="Cambria Math" w:eastAsiaTheme="minorEastAsia" w:hAnsi="Cambria Math"/>
-          </w:rPr>
-          <m:t>=</m:t>
-        </m:r>
-        <m:r>
-          <w:rPr>
-            <w:rFonts w:ascii="Cambria Math" w:eastAsiaTheme="minorEastAsia" w:hAnsi="Cambria Math"/>
-          </w:rPr>
-          <m:t>m</m:t>
+          <m:t>E=m</m:t>
         </m:r>
         <m:sSup>
           <m:sSupPr>
@@ -2247,6 +2235,426 @@
           <w:rFonts w:eastAsiaTheme="minorEastAsia"/>
         </w:rPr>
       </w:pPr>
+    </w:p>
+    <w:p>
+      <w:pPr>
+        <w:rPr>
+          <w:rFonts w:eastAsiaTheme="minorEastAsia"/>
+        </w:rPr>
+      </w:pPr>
+    </w:p>
+    <w:p>
+      <w:pPr>
+        <w:rPr>
+          <w:rFonts w:eastAsiaTheme="minorEastAsia"/>
+        </w:rPr>
+      </w:pPr>
+      <w:r>
+        <w:rPr>
+          <w:rFonts w:eastAsiaTheme="minorEastAsia"/>
+        </w:rPr>
+        <w:t>Operators used with limits:</w:t>
+      </w:r>
+    </w:p>
+    <w:p>
+      <w:pPr>
+        <w:rPr>
+          <w:rFonts w:eastAsiaTheme="minorEastAsia"/>
+        </w:rPr>
+      </w:pPr>
+    </w:p>
+    <w:p>
+      <w:pPr>
+        <w:rPr>
+          <w:rFonts w:eastAsiaTheme="minorEastAsia"/>
+        </w:rPr>
+      </w:pPr>
+      <m:oMathPara>
+        <m:oMath>
+          <m:func>
+            <m:funcPr>
+              <m:ctrlPr>
+                <w:rPr>
+                  <w:rFonts w:ascii="Cambria Math" w:hAnsi="Cambria Math"/>
+                  <w:i/>
+                </w:rPr>
+              </m:ctrlPr>
+            </m:funcPr>
+            <m:fName>
+              <m:limLow>
+                <m:limLowPr>
+                  <m:ctrlPr>
+                    <w:rPr>
+                      <w:rFonts w:ascii="Cambria Math" w:hAnsi="Cambria Math"/>
+                      <w:i/>
+                    </w:rPr>
+                  </m:ctrlPr>
+                </m:limLowPr>
+                <m:e>
+                  <m:r>
+                    <m:rPr>
+                      <m:sty m:val="p"/>
+                    </m:rPr>
+                    <w:rPr>
+                      <w:rFonts w:ascii="Cambria Math" w:hAnsi="Cambria Math"/>
+                    </w:rPr>
+                    <m:t>argmax</m:t>
+                  </m:r>
+                </m:e>
+                <m:lim>
+                  <m:r>
+                    <w:rPr>
+                      <w:rFonts w:ascii="Cambria Math" w:hAnsi="Cambria Math"/>
+                    </w:rPr>
+                    <m:t>ϵ</m:t>
+                  </m:r>
+                </m:lim>
+              </m:limLow>
+            </m:fName>
+            <m:e>
+              <m:r>
+                <w:rPr>
+                  <w:rFonts w:ascii="Cambria Math" w:hAnsi="Cambria Math"/>
+                </w:rPr>
+                <m:t xml:space="preserve">f(x),     </m:t>
+              </m:r>
+              <m:func>
+                <m:funcPr>
+                  <m:ctrlPr>
+                    <w:rPr>
+                      <w:rFonts w:ascii="Cambria Math" w:hAnsi="Cambria Math"/>
+                      <w:i/>
+                    </w:rPr>
+                  </m:ctrlPr>
+                </m:funcPr>
+                <m:fName>
+                  <m:limLow>
+                    <m:limLowPr>
+                      <m:ctrlPr>
+                        <w:rPr>
+                          <w:rFonts w:ascii="Cambria Math" w:hAnsi="Cambria Math"/>
+                          <w:i/>
+                        </w:rPr>
+                      </m:ctrlPr>
+                    </m:limLowPr>
+                    <m:e>
+                      <m:r>
+                        <m:rPr>
+                          <m:sty m:val="p"/>
+                        </m:rPr>
+                        <w:rPr>
+                          <w:rFonts w:ascii="Cambria Math" w:hAnsi="Cambria Math"/>
+                        </w:rPr>
+                        <m:t>lim</m:t>
+                      </m:r>
+                    </m:e>
+                    <m:lim>
+                      <m:r>
+                        <w:rPr>
+                          <w:rFonts w:ascii="Cambria Math" w:hAnsi="Cambria Math"/>
+                        </w:rPr>
+                        <m:t>n</m:t>
+                      </m:r>
+                    </m:lim>
+                  </m:limLow>
+                </m:fName>
+                <m:e>
+                  <m:sSup>
+                    <m:sSupPr>
+                      <m:ctrlPr>
+                        <w:rPr>
+                          <w:rFonts w:ascii="Cambria Math" w:hAnsi="Cambria Math"/>
+                          <w:i/>
+                        </w:rPr>
+                      </m:ctrlPr>
+                    </m:sSupPr>
+                    <m:e>
+                      <m:d>
+                        <m:dPr>
+                          <m:ctrlPr>
+                            <w:rPr>
+                              <w:rFonts w:ascii="Cambria Math" w:hAnsi="Cambria Math"/>
+                              <w:i/>
+                            </w:rPr>
+                          </m:ctrlPr>
+                        </m:dPr>
+                        <m:e>
+                          <m:r>
+                            <w:rPr>
+                              <w:rFonts w:ascii="Cambria Math" w:hAnsi="Cambria Math"/>
+                            </w:rPr>
+                            <m:t>1+</m:t>
+                          </m:r>
+                          <m:f>
+                            <m:fPr>
+                              <m:ctrlPr>
+                                <w:rPr>
+                                  <w:rFonts w:ascii="Cambria Math" w:hAnsi="Cambria Math"/>
+                                  <w:i/>
+                                </w:rPr>
+                              </m:ctrlPr>
+                            </m:fPr>
+                            <m:num>
+                              <m:r>
+                                <w:rPr>
+                                  <w:rFonts w:ascii="Cambria Math" w:hAnsi="Cambria Math"/>
+                                </w:rPr>
+                                <m:t>1</m:t>
+                              </m:r>
+                            </m:num>
+                            <m:den>
+                              <m:r>
+                                <w:rPr>
+                                  <w:rFonts w:ascii="Cambria Math" w:hAnsi="Cambria Math"/>
+                                </w:rPr>
+                                <m:t>n</m:t>
+                              </m:r>
+                            </m:den>
+                          </m:f>
+                        </m:e>
+                      </m:d>
+                    </m:e>
+                    <m:sup>
+                      <m:r>
+                        <w:rPr>
+                          <w:rFonts w:ascii="Cambria Math" w:hAnsi="Cambria Math"/>
+                        </w:rPr>
+                        <m:t>n</m:t>
+                      </m:r>
+                    </m:sup>
+                  </m:sSup>
+                </m:e>
+              </m:func>
+              <m:r>
+                <w:rPr>
+                  <w:rFonts w:ascii="Cambria Math" w:hAnsi="Cambria Math"/>
+                </w:rPr>
+                <m:t xml:space="preserve"> </m:t>
+              </m:r>
+            </m:e>
+          </m:func>
+          <m:r>
+            <w:rPr>
+              <w:rFonts w:ascii="Cambria Math" w:hAnsi="Cambria Math"/>
+            </w:rPr>
+            <m:t xml:space="preserve">,    </m:t>
+          </m:r>
+          <m:func>
+            <m:funcPr>
+              <m:ctrlPr>
+                <w:rPr>
+                  <w:rFonts w:ascii="Cambria Math" w:hAnsi="Cambria Math"/>
+                  <w:i/>
+                </w:rPr>
+              </m:ctrlPr>
+            </m:funcPr>
+            <m:fName>
+              <m:limLow>
+                <m:limLowPr>
+                  <m:ctrlPr>
+                    <w:rPr>
+                      <w:rFonts w:ascii="Cambria Math" w:hAnsi="Cambria Math"/>
+                      <w:i/>
+                    </w:rPr>
+                  </m:ctrlPr>
+                </m:limLowPr>
+                <m:e>
+                  <m:r>
+                    <m:rPr>
+                      <m:sty m:val="p"/>
+                    </m:rPr>
+                    <w:rPr>
+                      <w:rFonts w:ascii="Cambria Math" w:hAnsi="Cambria Math"/>
+                    </w:rPr>
+                    <m:t>max</m:t>
+                  </m:r>
+                </m:e>
+                <m:lim>
+                  <m:r>
+                    <w:rPr>
+                      <w:rFonts w:ascii="Cambria Math" w:hAnsi="Cambria Math"/>
+                    </w:rPr>
+                    <m:t>0≤x≤1</m:t>
+                  </m:r>
+                </m:lim>
+              </m:limLow>
+            </m:fName>
+            <m:e>
+              <m:r>
+                <w:rPr>
+                  <w:rFonts w:ascii="Cambria Math" w:hAnsi="Cambria Math"/>
+                </w:rPr>
+                <m:t>x</m:t>
+              </m:r>
+              <m:sSup>
+                <m:sSupPr>
+                  <m:ctrlPr>
+                    <w:rPr>
+                      <w:rFonts w:ascii="Cambria Math" w:hAnsi="Cambria Math"/>
+                      <w:i/>
+                    </w:rPr>
+                  </m:ctrlPr>
+                </m:sSupPr>
+                <m:e>
+                  <m:r>
+                    <w:rPr>
+                      <w:rFonts w:ascii="Cambria Math" w:hAnsi="Cambria Math"/>
+                    </w:rPr>
+                    <m:t>e</m:t>
+                  </m:r>
+                </m:e>
+                <m:sup>
+                  <m:r>
+                    <w:rPr>
+                      <w:rFonts w:ascii="Cambria Math" w:hAnsi="Cambria Math"/>
+                    </w:rPr>
+                    <m:t>-</m:t>
+                  </m:r>
+                  <m:sSup>
+                    <m:sSupPr>
+                      <m:ctrlPr>
+                        <w:rPr>
+                          <w:rFonts w:ascii="Cambria Math" w:hAnsi="Cambria Math"/>
+                          <w:i/>
+                        </w:rPr>
+                      </m:ctrlPr>
+                    </m:sSupPr>
+                    <m:e>
+                      <m:r>
+                        <w:rPr>
+                          <w:rFonts w:ascii="Cambria Math" w:hAnsi="Cambria Math"/>
+                        </w:rPr>
+                        <m:t>x</m:t>
+                      </m:r>
+                    </m:e>
+                    <m:sup>
+                      <m:r>
+                        <w:rPr>
+                          <w:rFonts w:ascii="Cambria Math" w:hAnsi="Cambria Math"/>
+                        </w:rPr>
+                        <m:t>2</m:t>
+                      </m:r>
+                    </m:sup>
+                  </m:sSup>
+                </m:sup>
+              </m:sSup>
+            </m:e>
+          </m:func>
+          <m:r>
+            <w:rPr>
+              <w:rFonts w:ascii="Cambria Math" w:hAnsi="Cambria Math"/>
+            </w:rPr>
+            <m:t xml:space="preserve">,    </m:t>
+          </m:r>
+          <m:func>
+            <m:funcPr>
+              <m:ctrlPr>
+                <w:rPr>
+                  <w:rFonts w:ascii="Cambria Math" w:hAnsi="Cambria Math"/>
+                  <w:i/>
+                </w:rPr>
+              </m:ctrlPr>
+            </m:funcPr>
+            <m:fName>
+              <m:limLow>
+                <m:limLowPr>
+                  <m:ctrlPr>
+                    <w:rPr>
+                      <w:rFonts w:ascii="Cambria Math" w:hAnsi="Cambria Math"/>
+                      <w:i/>
+                    </w:rPr>
+                  </m:ctrlPr>
+                </m:limLowPr>
+                <m:e>
+                  <m:r>
+                    <m:rPr>
+                      <m:sty m:val="p"/>
+                    </m:rPr>
+                    <w:rPr>
+                      <w:rFonts w:ascii="Cambria Math" w:hAnsi="Cambria Math"/>
+                    </w:rPr>
+                    <m:t>unsupported</m:t>
+                  </m:r>
+                </m:e>
+                <m:lim>
+                  <m:r>
+                    <w:rPr>
+                      <w:rFonts w:ascii="Cambria Math" w:hAnsi="Cambria Math"/>
+                    </w:rPr>
+                    <m:t>n</m:t>
+                  </m:r>
+                </m:lim>
+              </m:limLow>
+            </m:fName>
+            <m:e>
+              <m:sSup>
+                <m:sSupPr>
+                  <m:ctrlPr>
+                    <w:rPr>
+                      <w:rFonts w:ascii="Cambria Math" w:hAnsi="Cambria Math"/>
+                      <w:i/>
+                    </w:rPr>
+                  </m:ctrlPr>
+                </m:sSupPr>
+                <m:e>
+                  <m:d>
+                    <m:dPr>
+                      <m:ctrlPr>
+                        <w:rPr>
+                          <w:rFonts w:ascii="Cambria Math" w:hAnsi="Cambria Math"/>
+                          <w:i/>
+                        </w:rPr>
+                      </m:ctrlPr>
+                    </m:dPr>
+                    <m:e>
+                      <m:r>
+                        <w:rPr>
+                          <w:rFonts w:ascii="Cambria Math" w:hAnsi="Cambria Math"/>
+                        </w:rPr>
+                        <m:t>1+</m:t>
+                      </m:r>
+                      <m:f>
+                        <m:fPr>
+                          <m:ctrlPr>
+                            <w:rPr>
+                              <w:rFonts w:ascii="Cambria Math" w:hAnsi="Cambria Math"/>
+                              <w:i/>
+                            </w:rPr>
+                          </m:ctrlPr>
+                        </m:fPr>
+                        <m:num>
+                          <m:r>
+                            <w:rPr>
+                              <w:rFonts w:ascii="Cambria Math" w:hAnsi="Cambria Math"/>
+                            </w:rPr>
+                            <m:t>1</m:t>
+                          </m:r>
+                        </m:num>
+                        <m:den>
+                          <m:r>
+                            <w:rPr>
+                              <w:rFonts w:ascii="Cambria Math" w:hAnsi="Cambria Math"/>
+                            </w:rPr>
+                            <m:t>n</m:t>
+                          </m:r>
+                        </m:den>
+                      </m:f>
+                    </m:e>
+                  </m:d>
+                </m:e>
+                <m:sup>
+                  <m:r>
+                    <w:rPr>
+                      <w:rFonts w:ascii="Cambria Math" w:hAnsi="Cambria Math"/>
+                    </w:rPr>
+                    <m:t>n</m:t>
+                  </m:r>
+                </m:sup>
+              </m:sSup>
+            </m:e>
+          </m:func>
+        </m:oMath>
+      </m:oMathPara>
     </w:p>
     <w:sectPr>
       <w:pgSz w:w="11906" w:h="16838"/>

</xml_diff>

<commit_message>
fix(docx): handle missing chr attribute in groupChr OMML elements
Signed-off-by: Cesar Berrospi Ramis <ceb@zurich.ibm.com>
</commit_message>
<xml_diff>
--- a/tests/data/docx/equations.docx
+++ b/tests/data/docx/equations.docx
@@ -2655,6 +2655,612 @@
           </m:func>
         </m:oMath>
       </m:oMathPara>
+    </w:p>
+    <w:p>
+      <w:pPr>
+        <w:rPr>
+          <w:rFonts w:eastAsiaTheme="minorEastAsia"/>
+        </w:rPr>
+      </w:pPr>
+    </w:p>
+    <w:p>
+      <w:pPr>
+        <w:rPr>
+          <w:rFonts w:eastAsiaTheme="minorEastAsia"/>
+        </w:rPr>
+      </w:pPr>
+    </w:p>
+    <w:p>
+      <w:r>
+        <w:rPr>
+          <w:rFonts w:eastAsiaTheme="minorEastAsia"/>
+        </w:rPr>
+        <w:t>Equations with the OMML g</w:t>
+      </w:r>
+      <w:r>
+        <w:t>roup character object:</w:t>
+      </w:r>
+    </w:p>
+    <w:p/>
+    <w:p>
+      <w:pPr>
+        <w:spacing w:after="100"/>
+        <w:jc w:val="both"/>
+        <w:rPr>
+          <w:rFonts w:ascii="Times New Roman" w:eastAsia="Arial" w:hAnsi="Times New Roman" w:cs="Times New Roman"/>
+        </w:rPr>
+      </w:pPr>
+      <m:oMathPara>
+        <m:oMathParaPr>
+          <m:jc m:val="center"/>
+        </m:oMathParaPr>
+        <m:oMath>
+          <m:sSub>
+            <m:sSubPr>
+              <m:ctrlPr>
+                <w:rPr>
+                  <w:rFonts w:ascii="Cambria Math" w:eastAsia="Arial" w:hAnsi="Cambria Math" w:cs="Times New Roman"/>
+                  <w:i/>
+                  <w:sz w:val="22"/>
+                  <w:szCs w:val="22"/>
+                </w:rPr>
+              </m:ctrlPr>
+            </m:sSubPr>
+            <m:e>
+              <m:r>
+                <w:rPr>
+                  <w:rFonts w:ascii="Cambria Math" w:eastAsia="Arial" w:hAnsi="Cambria Math" w:cs="Times New Roman"/>
+                  <w:sz w:val="22"/>
+                  <w:szCs w:val="22"/>
+                </w:rPr>
+                <m:t>P</m:t>
+              </m:r>
+            </m:e>
+            <m:sub>
+              <m:r>
+                <m:rPr>
+                  <m:nor/>
+                </m:rPr>
+                <w:rPr>
+                  <w:rFonts w:ascii="Cambria Math" w:eastAsia="Arial" w:hAnsi="Times New Roman" w:cs="Times New Roman"/>
+                  <w:i/>
+                  <w:sz w:val="22"/>
+                  <w:szCs w:val="22"/>
+                </w:rPr>
+                <m:t xml:space="preserve"> </m:t>
+              </m:r>
+              <m:r>
+                <m:rPr>
+                  <m:nor/>
+                </m:rPr>
+                <w:rPr>
+                  <w:rFonts w:ascii="Times New Roman" w:eastAsia="Arial" w:hAnsi="Times New Roman" w:cs="Times New Roman"/>
+                  <w:i/>
+                  <w:sz w:val="22"/>
+                  <w:szCs w:val="22"/>
+                </w:rPr>
+                <m:t>x</m:t>
+              </m:r>
+            </m:sub>
+          </m:sSub>
+          <m:r>
+            <w:rPr>
+              <w:rFonts w:ascii="Cambria Math" w:eastAsia="Arial" w:hAnsi="Cambria Math" w:cs="Times New Roman"/>
+              <w:sz w:val="22"/>
+              <w:szCs w:val="22"/>
+            </w:rPr>
+            <m:t>=</m:t>
+          </m:r>
+          <m:limLow>
+            <m:limLowPr>
+              <m:ctrlPr>
+                <w:rPr>
+                  <w:rFonts w:ascii="Cambria Math" w:eastAsia="Arial" w:hAnsi="Cambria Math" w:cs="Times New Roman"/>
+                  <w:i/>
+                  <w:sz w:val="22"/>
+                  <w:szCs w:val="22"/>
+                </w:rPr>
+              </m:ctrlPr>
+            </m:limLowPr>
+            <m:e>
+              <m:groupChr>
+                <m:groupChrPr>
+                  <m:ctrlPr>
+                    <w:rPr>
+                      <w:rFonts w:ascii="Cambria Math" w:eastAsia="Arial" w:hAnsi="Cambria Math" w:cs="Times New Roman"/>
+                      <w:i/>
+                      <w:sz w:val="22"/>
+                      <w:szCs w:val="22"/>
+                    </w:rPr>
+                  </m:ctrlPr>
+                </m:groupChrPr>
+                <m:e>
+                  <m:r>
+                    <w:rPr>
+                      <w:rFonts w:ascii="Cambria Math" w:eastAsia="Arial" w:hAnsi="Cambria Math" w:cs="Times New Roman"/>
+                      <w:sz w:val="22"/>
+                      <w:szCs w:val="22"/>
+                    </w:rPr>
+                    <m:t>S</m:t>
+                  </m:r>
+                  <m:r>
+                    <w:rPr>
+                      <w:rFonts w:ascii="Cambria Math" w:eastAsia="Arial" w:hAnsi="Cambria Math" w:cs="Times New Roman"/>
+                      <w:sz w:val="22"/>
+                      <w:szCs w:val="22"/>
+                    </w:rPr>
+                    <m:t>⋅</m:t>
+                  </m:r>
+                  <m:r>
+                    <w:rPr>
+                      <w:rFonts w:ascii="Cambria Math" w:eastAsia="Arial" w:hAnsi="Cambria Math" w:cs="Times New Roman"/>
+                      <w:sz w:val="22"/>
+                      <w:szCs w:val="22"/>
+                      <w:lang w:val="fr-CH"/>
+                    </w:rPr>
+                    <m:t>T</m:t>
+                  </m:r>
+                  <m:r>
+                    <w:rPr>
+                      <w:rFonts w:ascii="Cambria Math" w:eastAsia="Arial" w:hAnsi="Cambria Math" w:cs="Times New Roman"/>
+                      <w:sz w:val="22"/>
+                      <w:szCs w:val="22"/>
+                    </w:rPr>
+                    <m:t>⋅</m:t>
+                  </m:r>
+                  <m:r>
+                    <w:rPr>
+                      <w:rFonts w:ascii="Cambria Math" w:eastAsia="Arial" w:hAnsi="Cambria Math" w:cs="Times New Roman"/>
+                      <w:sz w:val="22"/>
+                      <w:szCs w:val="22"/>
+                      <w:lang w:val="fr-CH"/>
+                    </w:rPr>
+                    <m:t>G</m:t>
+                  </m:r>
+                  <m:r>
+                    <w:rPr>
+                      <w:rFonts w:ascii="Cambria Math" w:eastAsia="Arial" w:hAnsi="Cambria Math" w:cs="Times New Roman"/>
+                      <w:sz w:val="22"/>
+                      <w:szCs w:val="22"/>
+                    </w:rPr>
+                    <m:t>⋅</m:t>
+                  </m:r>
+                  <m:r>
+                    <w:rPr>
+                      <w:rFonts w:ascii="Cambria Math" w:eastAsia="Arial" w:hAnsi="Cambria Math" w:cs="Times New Roman"/>
+                      <w:sz w:val="22"/>
+                      <w:szCs w:val="22"/>
+                    </w:rPr>
+                    <m:t>(</m:t>
+                  </m:r>
+                  <m:r>
+                    <w:rPr>
+                      <w:rFonts w:ascii="Cambria Math" w:eastAsia="Arial" w:hAnsi="Cambria Math" w:cs="Times New Roman"/>
+                      <w:sz w:val="22"/>
+                      <w:szCs w:val="22"/>
+                    </w:rPr>
+                    <m:t>x</m:t>
+                  </m:r>
+                  <m:r>
+                    <w:rPr>
+                      <w:rFonts w:ascii="Cambria Math" w:eastAsia="Arial" w:hAnsi="Cambria Math" w:cs="Times New Roman"/>
+                      <w:sz w:val="22"/>
+                      <w:szCs w:val="22"/>
+                    </w:rPr>
+                    <m:t>+</m:t>
+                  </m:r>
+                  <m:r>
+                    <w:rPr>
+                      <w:rFonts w:ascii="Cambria Math" w:eastAsia="Arial" w:hAnsi="Cambria Math" w:cs="Times New Roman"/>
+                      <w:sz w:val="22"/>
+                      <w:szCs w:val="22"/>
+                    </w:rPr>
+                    <m:t>y</m:t>
+                  </m:r>
+                  <m:r>
+                    <w:rPr>
+                      <w:rFonts w:ascii="Cambria Math" w:eastAsia="Arial" w:hAnsi="Cambria Math" w:cs="Times New Roman"/>
+                      <w:sz w:val="22"/>
+                      <w:szCs w:val="22"/>
+                    </w:rPr>
+                    <m:t>+</m:t>
+                  </m:r>
+                  <m:r>
+                    <w:rPr>
+                      <w:rFonts w:ascii="Cambria Math" w:eastAsia="Arial" w:hAnsi="Cambria Math" w:cs="Times New Roman"/>
+                      <w:sz w:val="22"/>
+                      <w:szCs w:val="22"/>
+                    </w:rPr>
+                    <m:t>z</m:t>
+                  </m:r>
+                  <m:r>
+                    <w:rPr>
+                      <w:rFonts w:ascii="Cambria Math" w:eastAsia="Arial" w:hAnsi="Cambria Math" w:cs="Times New Roman"/>
+                      <w:sz w:val="22"/>
+                      <w:szCs w:val="22"/>
+                    </w:rPr>
+                    <m:t>)</m:t>
+                  </m:r>
+                </m:e>
+              </m:groupChr>
+            </m:e>
+            <m:lim>
+              <m:r>
+                <w:rPr>
+                  <w:rFonts w:ascii="Cambria Math" w:eastAsia="Arial" w:hAnsi="Cambria Math" w:cs="Times New Roman"/>
+                  <w:sz w:val="22"/>
+                  <w:szCs w:val="22"/>
+                </w:rPr>
+                <m:t>group</m:t>
+              </m:r>
+              <m:r>
+                <w:rPr>
+                  <w:rFonts w:ascii="Cambria Math" w:eastAsia="Arial" w:hAnsi="Cambria Math" w:cs="Times New Roman"/>
+                  <w:sz w:val="22"/>
+                  <w:szCs w:val="22"/>
+                </w:rPr>
+                <m:t xml:space="preserve"> </m:t>
+              </m:r>
+              <m:r>
+                <w:rPr>
+                  <w:rFonts w:ascii="Cambria Math" w:eastAsia="Arial" w:hAnsi="Cambria Math" w:cs="Times New Roman"/>
+                  <w:sz w:val="22"/>
+                  <w:szCs w:val="22"/>
+                  <w:lang w:val="fr-CH"/>
+                </w:rPr>
+                <m:t>wit</m:t>
+              </m:r>
+              <m:r>
+                <w:rPr>
+                  <w:rFonts w:ascii="Cambria Math" w:eastAsia="Arial" w:hAnsi="Cambria Math" w:cs="Times New Roman"/>
+                  <w:sz w:val="22"/>
+                  <w:szCs w:val="22"/>
+                </w:rPr>
+                <m:t xml:space="preserve">h </m:t>
+              </m:r>
+              <m:r>
+                <w:rPr>
+                  <w:rFonts w:ascii="Cambria Math" w:eastAsia="Arial" w:hAnsi="Cambria Math" w:cs="Times New Roman"/>
+                  <w:sz w:val="22"/>
+                  <w:szCs w:val="22"/>
+                  <w:lang w:val="fr-CH"/>
+                </w:rPr>
+                <m:t>underbraces</m:t>
+              </m:r>
+            </m:lim>
+          </m:limLow>
+          <m:r>
+            <w:rPr>
+              <w:rFonts w:ascii="Cambria Math" w:eastAsia="Arial" w:hAnsi="Cambria Math" w:cs="Times New Roman"/>
+              <w:sz w:val="22"/>
+              <w:szCs w:val="22"/>
+            </w:rPr>
+            <m:t>+</m:t>
+          </m:r>
+          <m:sSup>
+            <m:sSupPr>
+              <m:ctrlPr>
+                <w:rPr>
+                  <w:rFonts w:ascii="Cambria Math" w:eastAsiaTheme="minorEastAsia" w:hAnsi="Cambria Math"/>
+                </w:rPr>
+              </m:ctrlPr>
+            </m:sSupPr>
+            <m:e>
+              <m:r>
+                <w:rPr>
+                  <w:rFonts w:ascii="Cambria Math" w:eastAsiaTheme="minorEastAsia" w:hAnsi="Cambria Math"/>
+                </w:rPr>
+                <m:t>e</m:t>
+              </m:r>
+            </m:e>
+            <m:sup>
+              <m:r>
+                <w:rPr>
+                  <w:rFonts w:ascii="Cambria Math" w:eastAsiaTheme="minorEastAsia" w:hAnsi="Cambria Math"/>
+                </w:rPr>
+                <m:t>x</m:t>
+              </m:r>
+            </m:sup>
+          </m:sSup>
+        </m:oMath>
+      </m:oMathPara>
+    </w:p>
+    <w:p>
+      <w:pPr>
+        <w:spacing w:after="100"/>
+        <w:jc w:val="both"/>
+        <w:rPr>
+          <w:rFonts w:ascii="Times New Roman" w:eastAsia="Arial" w:hAnsi="Times New Roman" w:cs="Times New Roman"/>
+          <w:lang w:val="fr-CH"/>
+        </w:rPr>
+      </w:pPr>
+      <m:oMathPara>
+        <m:oMathParaPr>
+          <m:jc m:val="center"/>
+        </m:oMathParaPr>
+        <m:oMath>
+          <m:sSub>
+            <m:sSubPr>
+              <m:ctrlPr>
+                <w:rPr>
+                  <w:rFonts w:ascii="Cambria Math" w:eastAsia="Arial" w:hAnsi="Cambria Math" w:cs="Times New Roman"/>
+                  <w:i/>
+                  <w:sz w:val="22"/>
+                  <w:szCs w:val="22"/>
+                </w:rPr>
+              </m:ctrlPr>
+            </m:sSubPr>
+            <m:e>
+              <m:r>
+                <w:rPr>
+                  <w:rFonts w:ascii="Cambria Math" w:eastAsia="Arial" w:hAnsi="Cambria Math" w:cs="Times New Roman"/>
+                  <w:sz w:val="22"/>
+                  <w:szCs w:val="22"/>
+                </w:rPr>
+                <m:t>Q</m:t>
+              </m:r>
+            </m:e>
+            <m:sub>
+              <m:r>
+                <m:rPr>
+                  <m:nor/>
+                </m:rPr>
+                <w:rPr>
+                  <w:rFonts w:ascii="Cambria Math" w:eastAsia="Arial" w:hAnsi="Times New Roman" w:cs="Times New Roman"/>
+                  <w:i/>
+                  <w:sz w:val="22"/>
+                  <w:szCs w:val="22"/>
+                  <w:lang w:val="fr-CH"/>
+                </w:rPr>
+                <m:t xml:space="preserve"> </m:t>
+              </m:r>
+              <m:r>
+                <m:rPr>
+                  <m:nor/>
+                </m:rPr>
+                <w:rPr>
+                  <w:rFonts w:ascii="Cambria Math" w:eastAsia="Arial" w:hAnsi="Times New Roman" w:cs="Times New Roman"/>
+                  <w:i/>
+                  <w:sz w:val="22"/>
+                  <w:szCs w:val="22"/>
+                  <w:lang w:val="fr-CH"/>
+                </w:rPr>
+                <m:t>y</m:t>
+              </m:r>
+            </m:sub>
+          </m:sSub>
+          <m:r>
+            <w:rPr>
+              <w:rFonts w:ascii="Cambria Math" w:eastAsia="Arial" w:hAnsi="Cambria Math" w:cs="Times New Roman"/>
+              <w:sz w:val="22"/>
+              <w:szCs w:val="22"/>
+              <w:lang w:val="fr-CH"/>
+            </w:rPr>
+            <m:t>=</m:t>
+          </m:r>
+          <m:limUpp>
+            <m:limUppPr>
+              <m:ctrlPr>
+                <w:rPr>
+                  <w:rFonts w:ascii="Cambria Math" w:eastAsia="Arial" w:hAnsi="Cambria Math" w:cs="Times New Roman"/>
+                  <w:i/>
+                  <w:sz w:val="22"/>
+                  <w:szCs w:val="22"/>
+                </w:rPr>
+              </m:ctrlPr>
+            </m:limUppPr>
+            <m:e>
+              <m:groupChr>
+                <m:groupChrPr>
+                  <m:chr m:val="⏞"/>
+                  <m:pos m:val="top"/>
+                  <m:vertJc m:val="bot"/>
+                  <m:ctrlPr>
+                    <w:rPr>
+                      <w:rFonts w:ascii="Cambria Math" w:eastAsia="Arial" w:hAnsi="Cambria Math" w:cs="Times New Roman"/>
+                      <w:i/>
+                      <w:sz w:val="22"/>
+                      <w:szCs w:val="22"/>
+                    </w:rPr>
+                  </m:ctrlPr>
+                </m:groupChrPr>
+                <m:e>
+                  <m:r>
+                    <w:rPr>
+                      <w:rFonts w:ascii="Cambria Math" w:eastAsia="Arial" w:hAnsi="Cambria Math" w:cs="Times New Roman"/>
+                      <w:sz w:val="22"/>
+                      <w:szCs w:val="22"/>
+                    </w:rPr>
+                    <m:t>G</m:t>
+                  </m:r>
+                  <m:r>
+                    <w:rPr>
+                      <w:rFonts w:ascii="Cambria Math" w:eastAsia="Arial" w:hAnsi="Cambria Math" w:cs="Times New Roman"/>
+                      <w:sz w:val="22"/>
+                      <w:szCs w:val="22"/>
+                      <w:lang w:val="fr-CH"/>
+                    </w:rPr>
+                    <m:t>⋅</m:t>
+                  </m:r>
+                  <m:r>
+                    <w:rPr>
+                      <w:rFonts w:ascii="Cambria Math" w:eastAsia="Arial" w:hAnsi="Cambria Math" w:cs="Times New Roman"/>
+                      <w:sz w:val="22"/>
+                      <w:szCs w:val="22"/>
+                      <w:lang w:val="fr-CH"/>
+                    </w:rPr>
+                    <m:t>T</m:t>
+                  </m:r>
+                  <m:r>
+                    <w:rPr>
+                      <w:rFonts w:ascii="Cambria Math" w:eastAsia="Arial" w:hAnsi="Cambria Math" w:cs="Times New Roman"/>
+                      <w:sz w:val="22"/>
+                      <w:szCs w:val="22"/>
+                      <w:lang w:val="fr-CH"/>
+                    </w:rPr>
+                    <m:t>⋅</m:t>
+                  </m:r>
+                  <m:r>
+                    <w:rPr>
+                      <w:rFonts w:ascii="Cambria Math" w:eastAsia="Arial" w:hAnsi="Cambria Math" w:cs="Times New Roman"/>
+                      <w:sz w:val="22"/>
+                      <w:szCs w:val="22"/>
+                      <w:lang w:val="fr-CH"/>
+                    </w:rPr>
+                    <m:t>S</m:t>
+                  </m:r>
+                  <m:r>
+                    <w:rPr>
+                      <w:rFonts w:ascii="Cambria Math" w:eastAsia="Arial" w:hAnsi="Cambria Math" w:cs="Times New Roman"/>
+                      <w:sz w:val="22"/>
+                      <w:szCs w:val="22"/>
+                      <w:lang w:val="fr-CH"/>
+                    </w:rPr>
+                    <m:t>⋅(</m:t>
+                  </m:r>
+                  <m:r>
+                    <w:rPr>
+                      <w:rFonts w:ascii="Cambria Math" w:eastAsia="Arial" w:hAnsi="Cambria Math" w:cs="Times New Roman"/>
+                      <w:sz w:val="22"/>
+                      <w:szCs w:val="22"/>
+                    </w:rPr>
+                    <m:t>x</m:t>
+                  </m:r>
+                  <m:r>
+                    <w:rPr>
+                      <w:rFonts w:ascii="Cambria Math" w:eastAsia="Arial" w:hAnsi="Cambria Math" w:cs="Times New Roman"/>
+                      <w:sz w:val="22"/>
+                      <w:szCs w:val="22"/>
+                      <w:lang w:val="fr-CH"/>
+                    </w:rPr>
+                    <m:t>+</m:t>
+                  </m:r>
+                  <m:r>
+                    <w:rPr>
+                      <w:rFonts w:ascii="Cambria Math" w:eastAsia="Arial" w:hAnsi="Cambria Math" w:cs="Times New Roman"/>
+                      <w:sz w:val="22"/>
+                      <w:szCs w:val="22"/>
+                    </w:rPr>
+                    <m:t>y</m:t>
+                  </m:r>
+                  <m:r>
+                    <w:rPr>
+                      <w:rFonts w:ascii="Cambria Math" w:eastAsia="Arial" w:hAnsi="Cambria Math" w:cs="Times New Roman"/>
+                      <w:sz w:val="22"/>
+                      <w:szCs w:val="22"/>
+                      <w:lang w:val="fr-CH"/>
+                    </w:rPr>
+                    <m:t>+</m:t>
+                  </m:r>
+                  <m:r>
+                    <w:rPr>
+                      <w:rFonts w:ascii="Cambria Math" w:eastAsia="Arial" w:hAnsi="Cambria Math" w:cs="Times New Roman"/>
+                      <w:sz w:val="22"/>
+                      <w:szCs w:val="22"/>
+                    </w:rPr>
+                    <m:t>z</m:t>
+                  </m:r>
+                  <m:r>
+                    <w:rPr>
+                      <w:rFonts w:ascii="Cambria Math" w:eastAsia="Arial" w:hAnsi="Cambria Math" w:cs="Times New Roman"/>
+                      <w:sz w:val="22"/>
+                      <w:szCs w:val="22"/>
+                      <w:lang w:val="fr-CH"/>
+                    </w:rPr>
+                    <m:t>)</m:t>
+                  </m:r>
+                </m:e>
+              </m:groupChr>
+            </m:e>
+            <m:lim>
+              <m:r>
+                <w:rPr>
+                  <w:rFonts w:ascii="Cambria Math" w:eastAsia="Arial" w:hAnsi="Cambria Math" w:cs="Times New Roman"/>
+                  <w:sz w:val="22"/>
+                  <w:szCs w:val="22"/>
+                </w:rPr>
+                <m:t>group</m:t>
+              </m:r>
+              <m:r>
+                <w:rPr>
+                  <w:rFonts w:ascii="Cambria Math" w:eastAsia="Arial" w:hAnsi="Cambria Math" w:cs="Times New Roman"/>
+                  <w:sz w:val="22"/>
+                  <w:szCs w:val="22"/>
+                  <w:lang w:val="fr-CH"/>
+                </w:rPr>
+                <m:t xml:space="preserve"> </m:t>
+              </m:r>
+              <m:r>
+                <w:rPr>
+                  <w:rFonts w:ascii="Cambria Math" w:eastAsia="Arial" w:hAnsi="Cambria Math" w:cs="Times New Roman"/>
+                  <w:sz w:val="22"/>
+                  <w:szCs w:val="22"/>
+                </w:rPr>
+                <m:t>wit</m:t>
+              </m:r>
+              <m:r>
+                <w:rPr>
+                  <w:rFonts w:ascii="Cambria Math" w:eastAsia="Arial" w:hAnsi="Cambria Math" w:cs="Times New Roman"/>
+                  <w:sz w:val="22"/>
+                  <w:szCs w:val="22"/>
+                  <w:lang w:val="fr-CH"/>
+                </w:rPr>
+                <m:t xml:space="preserve">h </m:t>
+              </m:r>
+              <m:r>
+                <w:rPr>
+                  <w:rFonts w:ascii="Cambria Math" w:eastAsia="Arial" w:hAnsi="Cambria Math" w:cs="Times New Roman"/>
+                  <w:sz w:val="22"/>
+                  <w:szCs w:val="22"/>
+                </w:rPr>
+                <m:t>overbraces</m:t>
+              </m:r>
+            </m:lim>
+          </m:limUpp>
+          <m:r>
+            <w:rPr>
+              <w:rFonts w:ascii="Cambria Math" w:eastAsia="Arial" w:hAnsi="Cambria Math" w:cs="Times New Roman"/>
+              <w:sz w:val="22"/>
+              <w:szCs w:val="22"/>
+              <w:lang w:val="fr-CH"/>
+            </w:rPr>
+            <m:t>+</m:t>
+          </m:r>
+          <m:sSup>
+            <m:sSupPr>
+              <m:ctrlPr>
+                <w:rPr>
+                  <w:rFonts w:ascii="Cambria Math" w:eastAsiaTheme="minorEastAsia" w:hAnsi="Cambria Math"/>
+                </w:rPr>
+              </m:ctrlPr>
+            </m:sSupPr>
+            <m:e>
+              <m:r>
+                <w:rPr>
+                  <w:rFonts w:ascii="Cambria Math" w:eastAsiaTheme="minorEastAsia" w:hAnsi="Cambria Math"/>
+                </w:rPr>
+                <m:t>e</m:t>
+              </m:r>
+            </m:e>
+            <m:sup>
+              <m:r>
+                <w:rPr>
+                  <w:rFonts w:ascii="Cambria Math" w:eastAsiaTheme="minorEastAsia" w:hAnsi="Cambria Math"/>
+                </w:rPr>
+                <m:t>y</m:t>
+              </m:r>
+            </m:sup>
+          </m:sSup>
+        </m:oMath>
+      </m:oMathPara>
+    </w:p>
+    <w:p>
+      <w:pPr>
+        <w:rPr>
+          <w:rFonts w:eastAsiaTheme="minorEastAsia"/>
+          <w:lang w:val="fr-CH"/>
+        </w:rPr>
+      </w:pPr>
     </w:p>
     <w:sectPr>
       <w:pgSz w:w="11906" w:h="16838"/>

</xml_diff>

<commit_message>
fix(docx): fix inline equation reconstruction to prevent tag corruption
Signed-off-by: Cesar Berrospi Ramis <ceb@zurich.ibm.com>
</commit_message>
<xml_diff>
--- a/tests/data/docx/equations.docx
+++ b/tests/data/docx/equations.docx
@@ -1294,52 +1294,152 @@
       </w:r>
       <w:proofErr w:type="gramEnd"/>
       <w:r>
-        <w:t xml:space="preserve"> and this is an inline equation: </w:t>
+        <w:t xml:space="preserve"> and </w:t>
+      </w:r>
+      <w:r>
+        <w:t>these are</w:t>
+      </w:r>
+      <w:r>
+        <w:t xml:space="preserve"> inline equation</w:t>
+      </w:r>
+      <w:r>
+        <w:t>s</w:t>
+      </w:r>
+      <w:r>
+        <w:t>:</w:t>
+      </w:r>
+      <w:r>
+        <w:t xml:space="preserve"> </w:t>
       </w:r>
       <m:oMath>
-        <m:r>
-          <w:rPr>
-            <w:rFonts w:ascii="Cambria Math" w:hAnsi="Cambria Math"/>
-          </w:rPr>
-          <m:t>A=π</m:t>
-        </m:r>
-        <m:sSup>
-          <m:sSupPr>
+        <m:sSubSup>
+          <m:sSubSupPr>
             <m:ctrlPr>
               <w:rPr>
-                <w:rFonts w:ascii="Cambria Math" w:hAnsi="Cambria Math"/>
+                <w:rFonts w:ascii="Cambria Math" w:eastAsia="Arial" w:hAnsi="Cambria Math" w:cs="Times New Roman"/>
+                <w:i/>
+                <w:sz w:val="22"/>
+                <w:szCs w:val="22"/>
               </w:rPr>
             </m:ctrlPr>
-          </m:sSupPr>
+          </m:sSubSupPr>
           <m:e>
             <m:r>
               <w:rPr>
-                <w:rFonts w:ascii="Cambria Math" w:hAnsi="Cambria Math"/>
+                <w:rFonts w:ascii="Cambria Math" w:eastAsia="Arial" w:hAnsi="Cambria Math" w:cs="Times New Roman"/>
+                <w:sz w:val="22"/>
+                <w:szCs w:val="22"/>
               </w:rPr>
-              <m:t>r</m:t>
+              <m:t>N</m:t>
             </m:r>
           </m:e>
+          <m:sub>
+            <m:r>
+              <m:rPr>
+                <m:nor/>
+              </m:rPr>
+              <w:rPr>
+                <w:rFonts w:ascii="Times New Roman" w:eastAsia="Arial" w:hAnsi="Times New Roman" w:cs="Times New Roman"/>
+                <w:i/>
+                <w:sz w:val="22"/>
+                <w:szCs w:val="22"/>
+              </w:rPr>
+              <m:t>s</m:t>
+            </m:r>
+          </m:sub>
+          <m:sup>
+            <m:r>
+              <m:rPr>
+                <m:nor/>
+              </m:rPr>
+              <w:rPr>
+                <w:rFonts w:ascii="Times New Roman" w:eastAsia="Arial" w:hAnsi="Times New Roman" w:cs="Times New Roman"/>
+                <w:i/>
+                <w:sz w:val="22"/>
+                <w:szCs w:val="22"/>
+              </w:rPr>
+              <m:t>H</m:t>
+            </m:r>
+          </m:sup>
+        </m:sSubSup>
+      </m:oMath>
+      <w:r>
+        <w:rPr>
+          <w:rFonts w:ascii="Times New Roman" w:eastAsia="Arial" w:hAnsi="Times New Roman" w:cs="Times New Roman"/>
+          <w:sz w:val="22"/>
+          <w:szCs w:val="22"/>
+        </w:rPr>
+        <w:t>/</w:t>
+      </w:r>
+      <m:oMath>
+        <m:sSubSup>
+          <m:sSubSupPr>
+            <m:ctrlPr>
+              <w:rPr>
+                <w:rFonts w:ascii="Cambria Math" w:eastAsia="Arial" w:hAnsi="Cambria Math" w:cs="Times New Roman"/>
+                <w:i/>
+                <w:sz w:val="22"/>
+                <w:szCs w:val="22"/>
+              </w:rPr>
+            </m:ctrlPr>
+          </m:sSubSupPr>
+          <m:e>
+            <m:r>
+              <w:rPr>
+                <w:rFonts w:ascii="Cambria Math" w:eastAsia="Arial" w:hAnsi="Cambria Math" w:cs="Times New Roman"/>
+                <w:sz w:val="22"/>
+                <w:szCs w:val="22"/>
+              </w:rPr>
+              <m:t>N</m:t>
+            </m:r>
+          </m:e>
+          <m:sub>
+            <m:r>
+              <w:rPr>
+                <w:rFonts w:ascii="Cambria Math" w:eastAsia="Arial" w:hAnsi="Cambria Math" w:cs="Times New Roman"/>
+                <w:sz w:val="22"/>
+                <w:szCs w:val="22"/>
+              </w:rPr>
+              <m:t>s</m:t>
+            </m:r>
+          </m:sub>
           <m:sup>
             <m:r>
               <w:rPr>
-                <w:rFonts w:ascii="Cambria Math" w:hAnsi="Cambria Math"/>
+                <w:rFonts w:ascii="Cambria Math" w:eastAsia="Arial" w:hAnsi="Cambria Math" w:cs="Times New Roman"/>
+                <w:sz w:val="22"/>
+                <w:szCs w:val="22"/>
               </w:rPr>
-              <m:t>2</m:t>
+              <m:t>P</m:t>
             </m:r>
           </m:sup>
-        </m:sSup>
-        <m:r>
-          <w:rPr>
-            <w:rFonts w:ascii="Cambria Math" w:hAnsi="Cambria Math"/>
-          </w:rPr>
-          <m:t xml:space="preserve"> </m:t>
-        </m:r>
+        </m:sSubSup>
       </m:oMath>
       <w:r>
         <w:rPr>
-          <w:rFonts w:eastAsiaTheme="minorEastAsia"/>
-        </w:rPr>
-        <w:t>. If instead, I want an equation by line, I can do this:</w:t>
+          <w:rFonts w:ascii="Times New Roman" w:eastAsia="Arial" w:hAnsi="Times New Roman" w:cs="Times New Roman"/>
+          <w:sz w:val="22"/>
+          <w:szCs w:val="22"/>
+        </w:rPr>
+        <w:t>​</w:t>
+      </w:r>
+      <w:r>
+        <w:rPr>
+          <w:rFonts w:eastAsiaTheme="minorEastAsia"/>
+        </w:rPr>
+        <w:t>.</w:t>
+      </w:r>
+      <w:r>
+        <w:rPr>
+          <w:rFonts w:eastAsiaTheme="minorEastAsia"/>
+        </w:rPr>
+        <w:t xml:space="preserve"> </w:t>
+      </w:r>
+      <w:r>
+        <w:rPr>
+          <w:rFonts w:eastAsiaTheme="minorEastAsia"/>
+        </w:rPr>
+        <w:t>If instead, I want an equation by line, I can do this:</w:t>
       </w:r>
     </w:p>
     <w:p>
@@ -2781,15 +2881,7 @@
                       <w:sz w:val="22"/>
                       <w:szCs w:val="22"/>
                     </w:rPr>
-                    <m:t>S</m:t>
-                  </m:r>
-                  <m:r>
-                    <w:rPr>
-                      <w:rFonts w:ascii="Cambria Math" w:eastAsia="Arial" w:hAnsi="Cambria Math" w:cs="Times New Roman"/>
-                      <w:sz w:val="22"/>
-                      <w:szCs w:val="22"/>
-                    </w:rPr>
-                    <m:t>⋅</m:t>
+                    <m:t>S⋅</m:t>
                   </m:r>
                   <m:r>
                     <w:rPr>
@@ -2823,63 +2915,7 @@
                       <w:sz w:val="22"/>
                       <w:szCs w:val="22"/>
                     </w:rPr>
-                    <m:t>⋅</m:t>
-                  </m:r>
-                  <m:r>
-                    <w:rPr>
-                      <w:rFonts w:ascii="Cambria Math" w:eastAsia="Arial" w:hAnsi="Cambria Math" w:cs="Times New Roman"/>
-                      <w:sz w:val="22"/>
-                      <w:szCs w:val="22"/>
-                    </w:rPr>
-                    <m:t>(</m:t>
-                  </m:r>
-                  <m:r>
-                    <w:rPr>
-                      <w:rFonts w:ascii="Cambria Math" w:eastAsia="Arial" w:hAnsi="Cambria Math" w:cs="Times New Roman"/>
-                      <w:sz w:val="22"/>
-                      <w:szCs w:val="22"/>
-                    </w:rPr>
-                    <m:t>x</m:t>
-                  </m:r>
-                  <m:r>
-                    <w:rPr>
-                      <w:rFonts w:ascii="Cambria Math" w:eastAsia="Arial" w:hAnsi="Cambria Math" w:cs="Times New Roman"/>
-                      <w:sz w:val="22"/>
-                      <w:szCs w:val="22"/>
-                    </w:rPr>
-                    <m:t>+</m:t>
-                  </m:r>
-                  <m:r>
-                    <w:rPr>
-                      <w:rFonts w:ascii="Cambria Math" w:eastAsia="Arial" w:hAnsi="Cambria Math" w:cs="Times New Roman"/>
-                      <w:sz w:val="22"/>
-                      <w:szCs w:val="22"/>
-                    </w:rPr>
-                    <m:t>y</m:t>
-                  </m:r>
-                  <m:r>
-                    <w:rPr>
-                      <w:rFonts w:ascii="Cambria Math" w:eastAsia="Arial" w:hAnsi="Cambria Math" w:cs="Times New Roman"/>
-                      <w:sz w:val="22"/>
-                      <w:szCs w:val="22"/>
-                    </w:rPr>
-                    <m:t>+</m:t>
-                  </m:r>
-                  <m:r>
-                    <w:rPr>
-                      <w:rFonts w:ascii="Cambria Math" w:eastAsia="Arial" w:hAnsi="Cambria Math" w:cs="Times New Roman"/>
-                      <w:sz w:val="22"/>
-                      <w:szCs w:val="22"/>
-                    </w:rPr>
-                    <m:t>z</m:t>
-                  </m:r>
-                  <m:r>
-                    <w:rPr>
-                      <w:rFonts w:ascii="Cambria Math" w:eastAsia="Arial" w:hAnsi="Cambria Math" w:cs="Times New Roman"/>
-                      <w:sz w:val="22"/>
-                      <w:szCs w:val="22"/>
-                    </w:rPr>
-                    <m:t>)</m:t>
+                    <m:t>⋅(x+y+z)</m:t>
                   </m:r>
                 </m:e>
               </m:groupChr>
@@ -2891,15 +2927,7 @@
                   <w:sz w:val="22"/>
                   <w:szCs w:val="22"/>
                 </w:rPr>
-                <m:t>group</m:t>
-              </m:r>
-              <m:r>
-                <w:rPr>
-                  <w:rFonts w:ascii="Cambria Math" w:eastAsia="Arial" w:hAnsi="Cambria Math" w:cs="Times New Roman"/>
-                  <w:sz w:val="22"/>
-                  <w:szCs w:val="22"/>
-                </w:rPr>
-                <m:t xml:space="preserve"> </m:t>
+                <m:t xml:space="preserve">group </m:t>
               </m:r>
               <m:r>
                 <w:rPr>
@@ -3012,20 +3040,7 @@
                   <w:szCs w:val="22"/>
                   <w:lang w:val="fr-CH"/>
                 </w:rPr>
-                <m:t xml:space="preserve"> </m:t>
-              </m:r>
-              <m:r>
-                <m:rPr>
-                  <m:nor/>
-                </m:rPr>
-                <w:rPr>
-                  <w:rFonts w:ascii="Cambria Math" w:eastAsia="Arial" w:hAnsi="Times New Roman" w:cs="Times New Roman"/>
-                  <w:i/>
-                  <w:sz w:val="22"/>
-                  <w:szCs w:val="22"/>
-                  <w:lang w:val="fr-CH"/>
-                </w:rPr>
-                <m:t>y</m:t>
+                <m:t xml:space="preserve"> y</m:t>
               </m:r>
             </m:sub>
           </m:sSub>
@@ -3080,43 +3095,7 @@
                       <w:szCs w:val="22"/>
                       <w:lang w:val="fr-CH"/>
                     </w:rPr>
-                    <m:t>⋅</m:t>
-                  </m:r>
-                  <m:r>
-                    <w:rPr>
-                      <w:rFonts w:ascii="Cambria Math" w:eastAsia="Arial" w:hAnsi="Cambria Math" w:cs="Times New Roman"/>
-                      <w:sz w:val="22"/>
-                      <w:szCs w:val="22"/>
-                      <w:lang w:val="fr-CH"/>
-                    </w:rPr>
-                    <m:t>T</m:t>
-                  </m:r>
-                  <m:r>
-                    <w:rPr>
-                      <w:rFonts w:ascii="Cambria Math" w:eastAsia="Arial" w:hAnsi="Cambria Math" w:cs="Times New Roman"/>
-                      <w:sz w:val="22"/>
-                      <w:szCs w:val="22"/>
-                      <w:lang w:val="fr-CH"/>
-                    </w:rPr>
-                    <m:t>⋅</m:t>
-                  </m:r>
-                  <m:r>
-                    <w:rPr>
-                      <w:rFonts w:ascii="Cambria Math" w:eastAsia="Arial" w:hAnsi="Cambria Math" w:cs="Times New Roman"/>
-                      <w:sz w:val="22"/>
-                      <w:szCs w:val="22"/>
-                      <w:lang w:val="fr-CH"/>
-                    </w:rPr>
-                    <m:t>S</m:t>
-                  </m:r>
-                  <m:r>
-                    <w:rPr>
-                      <w:rFonts w:ascii="Cambria Math" w:eastAsia="Arial" w:hAnsi="Cambria Math" w:cs="Times New Roman"/>
-                      <w:sz w:val="22"/>
-                      <w:szCs w:val="22"/>
-                      <w:lang w:val="fr-CH"/>
-                    </w:rPr>
-                    <m:t>⋅(</m:t>
+                    <m:t>⋅T⋅S⋅(</m:t>
                   </m:r>
                   <m:r>
                     <w:rPr>

</xml_diff>